<commit_message>
Start incorporating edits from the trial statistician
</commit_message>
<xml_diff>
--- a/statistical-analysis-plan/comments/statistical-analysis-plan-v0.6.0-2026-03-04 KH   2026-04-15_AO.docx
+++ b/statistical-analysis-plan/comments/statistical-analysis-plan-v0.6.0-2026-03-04 KH   2026-04-15_AO.docx
@@ -41,7 +41,6 @@
           <w:docPartUnique/>
         </w:docPartObj>
       </w:sdtPr>
-      <w:sdtEndPr/>
       <w:sdtContent>
         <w:p>
           <w:pPr>
@@ -5133,6 +5132,7 @@
         <w:t xml:space="preserve">For example, in Batch 1, five clusters were randomised to one of five </w:t>
       </w:r>
       <w:commentRangeStart w:id="43"/>
+      <w:commentRangeStart w:id="44"/>
       <w:r>
         <w:t>sequences</w:t>
       </w:r>
@@ -5145,38 +5145,6 @@
         </w:rPr>
         <w:commentReference w:id="43"/>
       </w:r>
-      <w:r>
-        <w:t xml:space="preserve"> using CCR. A statistician (JM) implemented a computer algorithm in R to evaluate all possible allocations (n = 120) and calculate a balance metric reflecting how evenly cluster size would be distributed between intervention and control conditions. For each allocation, the squared difference in anticipated cluster size between conditions was calculated; because only one covariate was used, this squared difference constituted the balance statistic. The 10% of allocations demonstrating the greatest imbalance were excluded, and the remaining allocations formed the candidate set. The final allocation was then selected at random from this set. Owing to limitations in the algorithm, the balance score was calculated assuming a complete design, although the trial design includes transition periods. This CCR procedure is repeated independently for each batch.</w:t>
-      </w:r>
-    </w:p>
-    <w:p>
-      <w:pPr>
-        <w:pStyle w:val="BodyText"/>
-      </w:pPr>
-      <w:r>
-        <w:lastRenderedPageBreak/>
-        <w:t>The random allocation sequence is generated by JM and communicated to the trial team to allow logistical arrangements, including securing places on upcoming ATLS</w:t>
-      </w:r>
-      <w:r>
-        <w:rPr>
-          <w:vertAlign w:val="superscript"/>
-        </w:rPr>
-        <w:t>®</w:t>
-      </w:r>
-      <w:r>
-        <w:t xml:space="preserve"> training courses, to be initiated. Allocation order will be concealed from participating sites for as long as logistically feasible, </w:t>
-      </w:r>
-      <w:r>
-        <w:t>recognizing</w:t>
-      </w:r>
-      <w:r>
-        <w:t xml:space="preserve"> that advance planning is required to release physicians for </w:t>
-      </w:r>
-      <w:commentRangeStart w:id="44"/>
-      <w:commentRangeStart w:id="45"/>
-      <w:r>
-        <w:t>training</w:t>
-      </w:r>
       <w:commentRangeEnd w:id="44"/>
       <w:r>
         <w:rPr>
@@ -5186,6 +5154,38 @@
         </w:rPr>
         <w:commentReference w:id="44"/>
       </w:r>
+      <w:r>
+        <w:t xml:space="preserve"> using CCR. A statistician (JM) implemented a computer algorithm in R to evaluate all possible allocations (n = 120) and calculate a balance metric reflecting how evenly cluster size would be distributed between intervention and control conditions. For each allocation, the squared difference in anticipated cluster size between conditions was calculated; because only one covariate was used, this squared difference constituted the balance statistic. The 10% of allocations demonstrating the greatest imbalance were excluded, and the remaining allocations formed the candidate set. The final allocation was then selected at random from this set. Owing to limitations in the algorithm, the balance score was calculated assuming a complete design, although the trial design includes transition periods. This CCR procedure is repeated independently for each batch.</w:t>
+      </w:r>
+    </w:p>
+    <w:p>
+      <w:pPr>
+        <w:pStyle w:val="BodyText"/>
+      </w:pPr>
+      <w:r>
+        <w:lastRenderedPageBreak/>
+        <w:t>The random allocation sequence is generated by JM and communicated to the trial team to allow logistical arrangements, including securing places on upcoming ATLS</w:t>
+      </w:r>
+      <w:r>
+        <w:rPr>
+          <w:vertAlign w:val="superscript"/>
+        </w:rPr>
+        <w:t>®</w:t>
+      </w:r>
+      <w:r>
+        <w:t xml:space="preserve"> training courses, to be initiated. Allocation order will be concealed from participating sites for as long as logistically feasible, </w:t>
+      </w:r>
+      <w:r>
+        <w:t>recognizing</w:t>
+      </w:r>
+      <w:r>
+        <w:t xml:space="preserve"> that advance planning is required to release physicians for </w:t>
+      </w:r>
+      <w:commentRangeStart w:id="45"/>
+      <w:commentRangeStart w:id="46"/>
+      <w:r>
+        <w:t>training</w:t>
+      </w:r>
       <w:commentRangeEnd w:id="45"/>
       <w:r>
         <w:rPr>
@@ -5195,6 +5195,15 @@
         </w:rPr>
         <w:commentReference w:id="45"/>
       </w:r>
+      <w:commentRangeEnd w:id="46"/>
+      <w:r>
+        <w:rPr>
+          <w:rStyle w:val="CommentReference"/>
+          <w:sz w:val="24"/>
+          <w:szCs w:val="24"/>
+        </w:rPr>
+        <w:commentReference w:id="46"/>
+      </w:r>
       <w:r>
         <w:t>.</w:t>
       </w:r>
@@ -5203,24 +5212,24 @@
       <w:pPr>
         <w:pStyle w:val="Heading2"/>
       </w:pPr>
-      <w:bookmarkStart w:id="46" w:name="_Toc223944482"/>
-      <w:bookmarkStart w:id="47" w:name="outcomes"/>
+      <w:bookmarkStart w:id="47" w:name="_Toc223944482"/>
+      <w:bookmarkStart w:id="48" w:name="outcomes"/>
       <w:bookmarkEnd w:id="42"/>
       <w:r>
         <w:t>5.3 Outcomes</w:t>
       </w:r>
-      <w:bookmarkEnd w:id="46"/>
+      <w:bookmarkEnd w:id="47"/>
     </w:p>
     <w:p>
       <w:pPr>
         <w:pStyle w:val="Heading3"/>
       </w:pPr>
-      <w:bookmarkStart w:id="48" w:name="_Toc223944483"/>
-      <w:bookmarkStart w:id="49" w:name="primary-outcome"/>
+      <w:bookmarkStart w:id="49" w:name="_Toc223944483"/>
+      <w:bookmarkStart w:id="50" w:name="primary-outcome"/>
       <w:r>
         <w:t>5.3.1 Primary outcome</w:t>
       </w:r>
-      <w:bookmarkEnd w:id="48"/>
+      <w:bookmarkEnd w:id="49"/>
     </w:p>
     <w:p>
       <w:pPr>
@@ -5234,24 +5243,24 @@
       <w:pPr>
         <w:pStyle w:val="Heading3"/>
       </w:pPr>
-      <w:bookmarkStart w:id="50" w:name="_Toc223944484"/>
-      <w:bookmarkStart w:id="51" w:name="secondary-outcomes"/>
-      <w:bookmarkEnd w:id="49"/>
+      <w:bookmarkStart w:id="51" w:name="_Toc223944484"/>
+      <w:bookmarkStart w:id="52" w:name="secondary-outcomes"/>
+      <w:bookmarkEnd w:id="50"/>
       <w:r>
         <w:t>5.3.2 Secondary outcomes</w:t>
       </w:r>
-      <w:bookmarkEnd w:id="50"/>
+      <w:bookmarkEnd w:id="51"/>
     </w:p>
     <w:p>
       <w:pPr>
         <w:pStyle w:val="Heading4"/>
       </w:pPr>
-      <w:bookmarkStart w:id="52" w:name="_Toc223944485"/>
-      <w:bookmarkStart w:id="53" w:name="Xdb0e69ac2f6fc09a45efb162c3cc667f9413bd2"/>
+      <w:bookmarkStart w:id="53" w:name="_Toc223944485"/>
+      <w:bookmarkStart w:id="54" w:name="Xdb0e69ac2f6fc09a45efb162c3cc667f9413bd2"/>
       <w:r>
         <w:t>5.3.2.1 Collected using the main stepped-wedge design</w:t>
       </w:r>
-      <w:bookmarkEnd w:id="52"/>
+      <w:bookmarkEnd w:id="53"/>
     </w:p>
     <w:p>
       <w:pPr>
@@ -5303,38 +5312,48 @@
       <w:r>
         <w:t xml:space="preserve">Intensive care unit admission. Data on this outcome will be collected from patient hospital </w:t>
       </w:r>
-      <w:commentRangeStart w:id="54"/>
       <w:commentRangeStart w:id="55"/>
       <w:commentRangeStart w:id="56"/>
+      <w:commentRangeStart w:id="57"/>
+      <w:commentRangeStart w:id="58"/>
       <w:r>
         <w:t>records</w:t>
       </w:r>
-      <w:commentRangeEnd w:id="54"/>
+      <w:commentRangeEnd w:id="55"/>
       <w:r>
         <w:rPr>
           <w:rStyle w:val="CommentReference"/>
           <w:sz w:val="24"/>
           <w:szCs w:val="24"/>
         </w:rPr>
-        <w:commentReference w:id="54"/>
-      </w:r>
-      <w:commentRangeEnd w:id="55"/>
+        <w:commentReference w:id="55"/>
+      </w:r>
+      <w:commentRangeEnd w:id="56"/>
       <w:r>
         <w:rPr>
           <w:rStyle w:val="CommentReference"/>
           <w:sz w:val="24"/>
           <w:szCs w:val="24"/>
         </w:rPr>
-        <w:commentReference w:id="55"/>
-      </w:r>
-      <w:commentRangeEnd w:id="56"/>
+        <w:commentReference w:id="56"/>
+      </w:r>
+      <w:commentRangeEnd w:id="57"/>
       <w:r>
         <w:rPr>
           <w:rStyle w:val="CommentReference"/>
           <w:sz w:val="24"/>
           <w:szCs w:val="24"/>
         </w:rPr>
-        <w:commentReference w:id="56"/>
+        <w:commentReference w:id="57"/>
+      </w:r>
+      <w:commentRangeEnd w:id="58"/>
+      <w:r>
+        <w:rPr>
+          <w:rStyle w:val="CommentReference"/>
+          <w:sz w:val="24"/>
+          <w:szCs w:val="24"/>
+        </w:rPr>
+        <w:commentReference w:id="58"/>
       </w:r>
       <w:r>
         <w:t>.</w:t>
@@ -5368,13 +5387,13 @@
       <w:pPr>
         <w:pStyle w:val="Heading4"/>
       </w:pPr>
-      <w:bookmarkStart w:id="57" w:name="_Toc223944486"/>
-      <w:bookmarkStart w:id="58" w:name="Xac098b8b976789377f406b0c926b7e67113ef4f"/>
-      <w:bookmarkEnd w:id="53"/>
+      <w:bookmarkStart w:id="59" w:name="_Toc223944486"/>
+      <w:bookmarkStart w:id="60" w:name="Xac098b8b976789377f406b0c926b7e67113ef4f"/>
+      <w:bookmarkEnd w:id="54"/>
       <w:r>
         <w:t>5.3.2.2 Collected using the nested staircase design</w:t>
       </w:r>
-      <w:bookmarkEnd w:id="57"/>
+      <w:bookmarkEnd w:id="59"/>
     </w:p>
     <w:p>
       <w:pPr>
@@ -5423,28 +5442,38 @@
       <w:r>
         <w:t xml:space="preserve">. We will consider completion of </w:t>
       </w:r>
-      <w:commentRangeStart w:id="59"/>
-      <w:commentRangeStart w:id="60"/>
+      <w:commentRangeStart w:id="61"/>
+      <w:commentRangeStart w:id="62"/>
+      <w:commentRangeStart w:id="63"/>
       <w:r>
         <w:t>all 14 steps as 100% adherence</w:t>
       </w:r>
-      <w:commentRangeEnd w:id="59"/>
+      <w:commentRangeEnd w:id="61"/>
       <w:r>
         <w:rPr>
           <w:rStyle w:val="CommentReference"/>
           <w:sz w:val="24"/>
           <w:szCs w:val="24"/>
         </w:rPr>
-        <w:commentReference w:id="59"/>
-      </w:r>
-      <w:commentRangeEnd w:id="60"/>
+        <w:commentReference w:id="61"/>
+      </w:r>
+      <w:commentRangeEnd w:id="62"/>
       <w:r>
         <w:rPr>
           <w:rStyle w:val="CommentReference"/>
           <w:sz w:val="24"/>
           <w:szCs w:val="24"/>
         </w:rPr>
-        <w:commentReference w:id="60"/>
+        <w:commentReference w:id="62"/>
+      </w:r>
+      <w:commentRangeEnd w:id="63"/>
+      <w:r>
+        <w:rPr>
+          <w:rStyle w:val="CommentReference"/>
+          <w:sz w:val="24"/>
+          <w:szCs w:val="24"/>
+        </w:rPr>
+        <w:commentReference w:id="63"/>
       </w:r>
       <w:r>
         <w:t xml:space="preserve">. The clinical research coordinators collecting the data will be trained by the trial team to do this, prior to the start of the </w:t>
@@ -5482,15 +5511,15 @@
       <w:pPr>
         <w:pStyle w:val="Heading2"/>
       </w:pPr>
-      <w:bookmarkStart w:id="61" w:name="_Toc223944487"/>
-      <w:bookmarkStart w:id="62" w:name="statistical-hypotheses"/>
-      <w:bookmarkEnd w:id="47"/>
-      <w:bookmarkEnd w:id="51"/>
-      <w:bookmarkEnd w:id="58"/>
+      <w:bookmarkStart w:id="64" w:name="_Toc223944487"/>
+      <w:bookmarkStart w:id="65" w:name="statistical-hypotheses"/>
+      <w:bookmarkEnd w:id="48"/>
+      <w:bookmarkEnd w:id="52"/>
+      <w:bookmarkEnd w:id="60"/>
       <w:r>
         <w:t>5.4 Statistical hypotheses</w:t>
       </w:r>
-      <w:bookmarkEnd w:id="61"/>
+      <w:bookmarkEnd w:id="64"/>
     </w:p>
     <w:p>
       <w:pPr>
@@ -5518,28 +5547,38 @@
       <w:r>
         <w:t xml:space="preserve">: There is </w:t>
       </w:r>
-      <w:commentRangeStart w:id="63"/>
-      <w:commentRangeStart w:id="64"/>
+      <w:commentRangeStart w:id="66"/>
+      <w:commentRangeStart w:id="67"/>
+      <w:commentRangeStart w:id="68"/>
       <w:r>
         <w:t>no</w:t>
       </w:r>
-      <w:commentRangeEnd w:id="63"/>
+      <w:commentRangeEnd w:id="66"/>
       <w:r>
         <w:rPr>
           <w:rStyle w:val="CommentReference"/>
           <w:sz w:val="24"/>
           <w:szCs w:val="24"/>
         </w:rPr>
-        <w:commentReference w:id="63"/>
-      </w:r>
-      <w:commentRangeEnd w:id="64"/>
+        <w:commentReference w:id="66"/>
+      </w:r>
+      <w:commentRangeEnd w:id="67"/>
       <w:r>
         <w:rPr>
           <w:rStyle w:val="CommentReference"/>
           <w:sz w:val="24"/>
           <w:szCs w:val="24"/>
         </w:rPr>
-        <w:commentReference w:id="64"/>
+        <w:commentReference w:id="67"/>
+      </w:r>
+      <w:commentRangeEnd w:id="68"/>
+      <w:r>
+        <w:rPr>
+          <w:rStyle w:val="CommentReference"/>
+          <w:sz w:val="24"/>
+          <w:szCs w:val="24"/>
+        </w:rPr>
+        <w:commentReference w:id="68"/>
       </w:r>
       <w:r>
         <w:t xml:space="preserve"> difference in the primary outcome of 30-day in-hospital mortality between those randomised to ATLS</w:t>
@@ -5613,24 +5652,24 @@
       <w:pPr>
         <w:pStyle w:val="Heading2"/>
       </w:pPr>
-      <w:bookmarkStart w:id="65" w:name="_Toc223944488"/>
-      <w:bookmarkStart w:id="66" w:name="sample-size-calculations"/>
-      <w:bookmarkEnd w:id="62"/>
+      <w:bookmarkStart w:id="69" w:name="_Toc223944488"/>
+      <w:bookmarkStart w:id="70" w:name="sample-size-calculations"/>
+      <w:bookmarkEnd w:id="65"/>
       <w:r>
         <w:t>5.5 Sample size calculations</w:t>
       </w:r>
-      <w:bookmarkEnd w:id="65"/>
+      <w:bookmarkEnd w:id="69"/>
     </w:p>
     <w:p>
       <w:pPr>
         <w:pStyle w:val="Heading3"/>
       </w:pPr>
-      <w:bookmarkStart w:id="67" w:name="_Toc223944489"/>
-      <w:bookmarkStart w:id="68" w:name="Xba08c803f10f7c8cd9a777b53b902d2761b3046"/>
+      <w:bookmarkStart w:id="71" w:name="_Toc223944489"/>
+      <w:bookmarkStart w:id="72" w:name="Xba08c803f10f7c8cd9a777b53b902d2761b3046"/>
       <w:r>
         <w:t>5.5.1 Main stepped wedge design and primary outcome</w:t>
       </w:r>
-      <w:bookmarkEnd w:id="67"/>
+      <w:bookmarkEnd w:id="71"/>
     </w:p>
     <w:p>
       <w:pPr>
@@ -5690,28 +5729,38 @@
       <w:r>
         <w:t xml:space="preserve">. We included the CAC to allow for variation in clustering over time. We assume that each cluster will contribute approximately 12 observations per month to the analysis, but allowed for substantial variation in cluster sizes, based on our previous </w:t>
       </w:r>
-      <w:commentRangeStart w:id="69"/>
-      <w:commentRangeStart w:id="70"/>
+      <w:commentRangeStart w:id="73"/>
+      <w:commentRangeStart w:id="74"/>
+      <w:commentRangeStart w:id="75"/>
       <w:r>
         <w:t>work</w:t>
       </w:r>
-      <w:commentRangeEnd w:id="69"/>
+      <w:commentRangeEnd w:id="73"/>
       <w:r>
         <w:rPr>
           <w:rStyle w:val="CommentReference"/>
           <w:sz w:val="24"/>
           <w:szCs w:val="24"/>
         </w:rPr>
-        <w:commentReference w:id="69"/>
-      </w:r>
-      <w:commentRangeEnd w:id="70"/>
+        <w:commentReference w:id="73"/>
+      </w:r>
+      <w:commentRangeEnd w:id="74"/>
       <w:r>
         <w:rPr>
           <w:rStyle w:val="CommentReference"/>
           <w:sz w:val="24"/>
           <w:szCs w:val="24"/>
         </w:rPr>
-        <w:commentReference w:id="70"/>
+        <w:commentReference w:id="74"/>
+      </w:r>
+      <w:commentRangeEnd w:id="75"/>
+      <w:r>
+        <w:rPr>
+          <w:rStyle w:val="CommentReference"/>
+          <w:sz w:val="24"/>
+          <w:szCs w:val="24"/>
+        </w:rPr>
+        <w:commentReference w:id="75"/>
       </w:r>
       <w:r>
         <w:t>.</w:t>
@@ -5737,7 +5786,7 @@
               <w:pStyle w:val="Compact"/>
               <w:jc w:val="center"/>
             </w:pPr>
-            <w:bookmarkStart w:id="71" w:name="fig-power-curves"/>
+            <w:bookmarkStart w:id="76" w:name="fig-power-curves"/>
             <w:r>
               <w:rPr>
                 <w:noProof/>
@@ -5831,7 +5880,7 @@
             <w:r>
               <w:t xml:space="preserve"> training. Under this scenario, we would need to increase the sample size per month to around 30 observations to achieve 90% power</w:t>
             </w:r>
-            <w:del w:id="72" w:author="Anna Olofsson" w:date="2026-03-16T14:18:00Z" w16du:dateUtc="2026-03-16T13:18:00Z">
+            <w:del w:id="77" w:author="Anna Olofsson" w:date="2026-03-16T14:18:00Z" w16du:dateUtc="2026-03-16T13:18:00Z">
               <w:r>
                 <w:delText>e</w:delText>
               </w:r>
@@ -5841,20 +5890,20 @@
             </w:r>
           </w:p>
         </w:tc>
-        <w:bookmarkEnd w:id="71"/>
+        <w:bookmarkEnd w:id="76"/>
       </w:tr>
     </w:tbl>
     <w:p>
       <w:pPr>
         <w:pStyle w:val="Heading3"/>
       </w:pPr>
-      <w:bookmarkStart w:id="73" w:name="_Toc223944490"/>
-      <w:bookmarkStart w:id="74" w:name="X37fc7b5fe6b5980542d53d3e88dadde59566406"/>
-      <w:bookmarkEnd w:id="68"/>
+      <w:bookmarkStart w:id="78" w:name="_Toc223944490"/>
+      <w:bookmarkStart w:id="79" w:name="X37fc7b5fe6b5980542d53d3e88dadde59566406"/>
+      <w:bookmarkEnd w:id="72"/>
       <w:r>
         <w:t>5.5.2 Nested staircase design and secondary outcomes</w:t>
       </w:r>
-      <w:bookmarkEnd w:id="73"/>
+      <w:bookmarkEnd w:id="78"/>
     </w:p>
     <w:p>
       <w:pPr>
@@ -5863,90 +5912,101 @@
       <w:r>
         <w:t xml:space="preserve">The secondary outcomes that will be measured using the nested staircase </w:t>
       </w:r>
-      <w:commentRangeStart w:id="75"/>
-      <w:commentRangeStart w:id="76"/>
+      <w:commentRangeStart w:id="80"/>
+      <w:commentRangeStart w:id="81"/>
+      <w:commentRangeStart w:id="82"/>
       <w:r>
         <w:t>design</w:t>
       </w:r>
-      <w:commentRangeEnd w:id="75"/>
+      <w:commentRangeEnd w:id="80"/>
       <w:r>
         <w:rPr>
           <w:rStyle w:val="CommentReference"/>
           <w:sz w:val="24"/>
           <w:szCs w:val="24"/>
         </w:rPr>
-        <w:commentReference w:id="75"/>
-      </w:r>
-      <w:commentRangeEnd w:id="76"/>
+        <w:commentReference w:id="80"/>
+      </w:r>
+      <w:commentRangeEnd w:id="81"/>
       <w:r>
         <w:rPr>
           <w:rStyle w:val="CommentReference"/>
           <w:sz w:val="24"/>
           <w:szCs w:val="24"/>
         </w:rPr>
-        <w:commentReference w:id="76"/>
-      </w:r>
-      <w:r>
-        <w:t xml:space="preserve"> are adherence to ATLS</w:t>
-      </w:r>
-      <w:r>
-        <w:rPr>
-          <w:vertAlign w:val="superscript"/>
-        </w:rPr>
-        <w:t>®</w:t>
-      </w:r>
-      <w:r>
-        <w:t xml:space="preserve"> principles during initial patient resuscitation, quality of life, and disability. The expected effect of the intervention on each of these outcomes are an improvement in adherence from 50% during standard care to 70% after training</w:t>
-      </w:r>
-      <w:r>
-        <w:rPr>
-          <w:vertAlign w:val="superscript"/>
-        </w:rPr>
-        <w:t>11</w:t>
-      </w:r>
-      <w:r>
-        <w:t>, an increase in EQ5D5L health status from 70 during care to 75 after training</w:t>
-      </w:r>
-      <w:r>
-        <w:rPr>
-          <w:vertAlign w:val="superscript"/>
-        </w:rPr>
-        <w:t>12</w:t>
-      </w:r>
-      <w:r>
-        <w:t>, and finally a decrease in disability from a baseline value of 25 during standard care to 22.5 after training</w:t>
-      </w:r>
-      <w:r>
-        <w:rPr>
-          <w:vertAlign w:val="superscript"/>
-        </w:rPr>
-        <w:t>13</w:t>
-      </w:r>
-      <w:r>
-        <w:t xml:space="preserve">. For quality of life and disability, these effects correspond to standardised effect sizes, expressed as Cohen’s d, of 0.5. With 30 clusters in total, six per sequence, for a discrete time decay correlation structure, with ICCs of 0.01 to 0.15 and a CAC of 0.8, there is &gt;80% power to detect these effects by including four patients in each cluster in each period. Accounting for loss to follow-up, we will include at least six patients per cluster per month. These patients will be a random subset of patients included in the primary outcome data collection during the staircase months. The random subset will be selected using </w:t>
-      </w:r>
-      <w:commentRangeStart w:id="77"/>
-      <w:commentRangeStart w:id="78"/>
-      <w:r>
-        <w:t xml:space="preserve">simple random sampling on </w:t>
-      </w:r>
-      <w:commentRangeStart w:id="79"/>
-      <w:r>
-        <w:t>the shift level</w:t>
-      </w:r>
-      <w:commentRangeEnd w:id="79"/>
+        <w:commentReference w:id="81"/>
+      </w:r>
+      <w:commentRangeEnd w:id="82"/>
       <w:r>
         <w:rPr>
           <w:rStyle w:val="CommentReference"/>
           <w:sz w:val="24"/>
           <w:szCs w:val="24"/>
         </w:rPr>
-        <w:commentReference w:id="79"/>
+        <w:commentReference w:id="82"/>
+      </w:r>
+      <w:r>
+        <w:t xml:space="preserve"> are adherence to ATLS</w:t>
+      </w:r>
+      <w:r>
+        <w:rPr>
+          <w:vertAlign w:val="superscript"/>
+        </w:rPr>
+        <w:t>®</w:t>
+      </w:r>
+      <w:r>
+        <w:t xml:space="preserve"> principles during initial patient resuscitation, quality of life, and disability. The expected effect of the intervention on each of these outcomes are an improvement in adherence from 50% during standard care to 70% after training</w:t>
+      </w:r>
+      <w:r>
+        <w:rPr>
+          <w:vertAlign w:val="superscript"/>
+        </w:rPr>
+        <w:t>11</w:t>
+      </w:r>
+      <w:r>
+        <w:t>, an increase in EQ5D5L health status from 70 during care to 75 after training</w:t>
+      </w:r>
+      <w:r>
+        <w:rPr>
+          <w:vertAlign w:val="superscript"/>
+        </w:rPr>
+        <w:t>12</w:t>
+      </w:r>
+      <w:r>
+        <w:t>, and finally a decrease in disability from a baseline value of 25 during standard care to 22.5 after training</w:t>
+      </w:r>
+      <w:r>
+        <w:rPr>
+          <w:vertAlign w:val="superscript"/>
+        </w:rPr>
+        <w:t>13</w:t>
+      </w:r>
+      <w:r>
+        <w:t xml:space="preserve">. For quality of life and disability, these effects correspond to standardised effect sizes, expressed as Cohen’s d, of 0.5. With 30 clusters in total, six per sequence, for a discrete time decay correlation structure, with ICCs of 0.01 to 0.15 and a CAC of 0.8, there is &gt;80% power to detect these effects by including four patients in each cluster in each period. Accounting for loss to follow-up, we will include at least six patients per cluster per month. These patients will be a random subset of patients included in the primary outcome data collection during the staircase months. The random subset will be selected using </w:t>
+      </w:r>
+      <w:commentRangeStart w:id="83"/>
+      <w:commentRangeStart w:id="84"/>
+      <w:commentRangeStart w:id="85"/>
+      <w:r>
+        <w:t xml:space="preserve">simple random sampling on </w:t>
+      </w:r>
+      <w:commentRangeStart w:id="86"/>
+      <w:r>
+        <w:t>the shift level</w:t>
+      </w:r>
+      <w:commentRangeEnd w:id="86"/>
+      <w:r>
+        <w:rPr>
+          <w:rStyle w:val="CommentReference"/>
+          <w:sz w:val="24"/>
+          <w:szCs w:val="24"/>
+        </w:rPr>
+        <w:commentReference w:id="86"/>
       </w:r>
       <w:r>
         <w:t>, meaning that the timing of the clinical research coordinator’s</w:t>
       </w:r>
-      <w:ins w:id="80" w:author="Anna Olofsson" w:date="2026-03-16T14:25:00Z" w16du:dateUtc="2026-03-16T13:25:00Z">
+      <w:ins w:id="87" w:author="Anna Olofsson" w:date="2026-03-16T14:25:00Z" w16du:dateUtc="2026-03-16T13:25:00Z">
         <w:r>
           <w:t xml:space="preserve"> work</w:t>
         </w:r>
@@ -5954,23 +6014,32 @@
       <w:r>
         <w:t xml:space="preserve"> shift will be randomised to cover approximately eight hours during the morning, afternoon, or night shift. </w:t>
       </w:r>
-      <w:commentRangeEnd w:id="77"/>
+      <w:commentRangeEnd w:id="83"/>
       <w:r>
         <w:rPr>
           <w:rStyle w:val="CommentReference"/>
           <w:sz w:val="24"/>
           <w:szCs w:val="24"/>
         </w:rPr>
-        <w:commentReference w:id="77"/>
-      </w:r>
-      <w:commentRangeEnd w:id="78"/>
+        <w:commentReference w:id="83"/>
+      </w:r>
+      <w:commentRangeEnd w:id="84"/>
       <w:r>
         <w:rPr>
           <w:rStyle w:val="CommentReference"/>
           <w:sz w:val="24"/>
           <w:szCs w:val="24"/>
         </w:rPr>
-        <w:commentReference w:id="78"/>
+        <w:commentReference w:id="84"/>
+      </w:r>
+      <w:commentRangeEnd w:id="85"/>
+      <w:r>
+        <w:rPr>
+          <w:rStyle w:val="CommentReference"/>
+          <w:sz w:val="24"/>
+          <w:szCs w:val="24"/>
+        </w:rPr>
+        <w:commentReference w:id="85"/>
       </w:r>
       <w:r>
         <w:t>Adherence to ATLS</w:t>
@@ -5993,25 +6062,25 @@
       <w:pPr>
         <w:pStyle w:val="Heading2"/>
       </w:pPr>
-      <w:bookmarkStart w:id="81" w:name="_Toc223944491"/>
-      <w:bookmarkStart w:id="82" w:name="statistical-principles"/>
-      <w:bookmarkEnd w:id="66"/>
-      <w:bookmarkEnd w:id="74"/>
+      <w:bookmarkStart w:id="88" w:name="_Toc223944491"/>
+      <w:bookmarkStart w:id="89" w:name="statistical-principles"/>
+      <w:bookmarkEnd w:id="70"/>
+      <w:bookmarkEnd w:id="79"/>
       <w:r>
         <w:t>5.6 Statistical principles</w:t>
       </w:r>
-      <w:bookmarkEnd w:id="81"/>
+      <w:bookmarkEnd w:id="88"/>
     </w:p>
     <w:p>
       <w:pPr>
         <w:pStyle w:val="Heading3"/>
       </w:pPr>
-      <w:bookmarkStart w:id="83" w:name="_Toc223944492"/>
-      <w:bookmarkStart w:id="84" w:name="statistical-software"/>
+      <w:bookmarkStart w:id="90" w:name="_Toc223944492"/>
+      <w:bookmarkStart w:id="91" w:name="statistical-software"/>
       <w:r>
         <w:t>5.6.1 Statistical software</w:t>
       </w:r>
-      <w:bookmarkEnd w:id="83"/>
+      <w:bookmarkEnd w:id="90"/>
     </w:p>
     <w:p>
       <w:pPr>
@@ -6034,13 +6103,13 @@
       <w:pPr>
         <w:pStyle w:val="Heading3"/>
       </w:pPr>
-      <w:bookmarkStart w:id="85" w:name="_Toc223944493"/>
-      <w:bookmarkStart w:id="86" w:name="Xb3701c3e4f516f3436ab2f14fbfd68958c11744"/>
-      <w:bookmarkEnd w:id="84"/>
+      <w:bookmarkStart w:id="92" w:name="_Toc223944493"/>
+      <w:bookmarkStart w:id="93" w:name="Xb3701c3e4f516f3436ab2f14fbfd68958c11744"/>
+      <w:bookmarkEnd w:id="91"/>
       <w:r>
         <w:t>5.6.2 Levels of statistical significance and confidence</w:t>
       </w:r>
-      <w:bookmarkEnd w:id="85"/>
+      <w:bookmarkEnd w:id="92"/>
     </w:p>
     <w:p>
       <w:pPr>
@@ -6054,26 +6123,26 @@
       <w:pPr>
         <w:pStyle w:val="Heading2"/>
       </w:pPr>
-      <w:bookmarkStart w:id="87" w:name="_Toc223944494"/>
-      <w:bookmarkStart w:id="88" w:name="analysis-populations"/>
-      <w:bookmarkEnd w:id="82"/>
-      <w:bookmarkEnd w:id="86"/>
+      <w:bookmarkStart w:id="94" w:name="_Toc223944494"/>
+      <w:bookmarkStart w:id="95" w:name="analysis-populations"/>
+      <w:bookmarkEnd w:id="89"/>
+      <w:bookmarkEnd w:id="93"/>
       <w:r>
         <w:t>5.7 Analysis populations</w:t>
       </w:r>
-      <w:bookmarkEnd w:id="87"/>
+      <w:bookmarkEnd w:id="94"/>
     </w:p>
     <w:p>
       <w:pPr>
         <w:pStyle w:val="FirstParagraph"/>
         <w:rPr>
-          <w:ins w:id="89" w:author="Anna Olofsson" w:date="2026-04-10T12:03:00Z" w16du:dateUtc="2026-04-10T10:03:00Z"/>
-        </w:rPr>
-      </w:pPr>
-      <w:ins w:id="90" w:author="Anna Olofsson" w:date="2026-04-10T11:53:00Z">
+          <w:ins w:id="96" w:author="Anna Olofsson" w:date="2026-04-10T12:03:00Z" w16du:dateUtc="2026-04-10T10:03:00Z"/>
+        </w:rPr>
+      </w:pPr>
+      <w:ins w:id="97" w:author="Anna Olofsson" w:date="2026-04-10T11:53:00Z">
         <w:r>
           <w:rPr>
-            <w:rPrChange w:id="91" w:author="Anna Olofsson" w:date="2026-04-10T11:53:00Z" w16du:dateUtc="2026-04-10T09:53:00Z">
+            <w:rPrChange w:id="98" w:author="Anna Olofsson" w:date="2026-04-10T11:53:00Z" w16du:dateUtc="2026-04-10T09:53:00Z">
               <w:rPr>
                 <w:lang w:val="sv-SE"/>
               </w:rPr>
@@ -6082,10 +6151,10 @@
           <w:t>The trial has a hierarchical structure in which hospitals represent the clusters, clinical teams within hospitals deliver care, and individual patients constitute the unit of observation and analysis. Randomisation is performed at the hospital level, with all trained teams within the same hospital treated as part of the same cluster.</w:t>
         </w:r>
       </w:ins>
-      <w:ins w:id="92" w:author="Anna Olofsson" w:date="2026-04-10T11:53:00Z" w16du:dateUtc="2026-04-10T09:53:00Z">
+      <w:ins w:id="99" w:author="Anna Olofsson" w:date="2026-04-10T11:53:00Z" w16du:dateUtc="2026-04-10T09:53:00Z">
         <w:r>
           <w:rPr>
-            <w:rPrChange w:id="93" w:author="Anna Olofsson" w:date="2026-04-10T11:53:00Z" w16du:dateUtc="2026-04-10T09:53:00Z">
+            <w:rPrChange w:id="100" w:author="Anna Olofsson" w:date="2026-04-10T11:53:00Z" w16du:dateUtc="2026-04-10T09:53:00Z">
               <w:rPr>
                 <w:lang w:val="sv-SE"/>
               </w:rPr>
@@ -6094,35 +6163,35 @@
           <w:t xml:space="preserve"> </w:t>
         </w:r>
       </w:ins>
-      <w:del w:id="94" w:author="Anna Olofsson" w:date="2026-04-10T11:54:00Z" w16du:dateUtc="2026-04-10T09:54:00Z">
+      <w:del w:id="101" w:author="Anna Olofsson" w:date="2026-04-10T11:54:00Z" w16du:dateUtc="2026-04-10T09:54:00Z">
         <w:r>
           <w:delText xml:space="preserve">The unit of randomisation is the hospital, because all units trained in the same hospital will be treated as one </w:delText>
         </w:r>
-        <w:commentRangeStart w:id="95"/>
-        <w:commentRangeStart w:id="96"/>
+        <w:commentRangeStart w:id="102"/>
+        <w:commentRangeStart w:id="103"/>
         <w:r>
           <w:delText>cluster</w:delText>
         </w:r>
-        <w:commentRangeEnd w:id="95"/>
+        <w:commentRangeEnd w:id="102"/>
         <w:r>
           <w:rPr>
             <w:rStyle w:val="CommentReference"/>
             <w:sz w:val="24"/>
             <w:szCs w:val="24"/>
           </w:rPr>
-          <w:commentReference w:id="95"/>
+          <w:commentReference w:id="102"/>
         </w:r>
       </w:del>
-      <w:commentRangeEnd w:id="96"/>
+      <w:commentRangeEnd w:id="103"/>
       <w:r>
         <w:rPr>
           <w:rStyle w:val="CommentReference"/>
           <w:sz w:val="24"/>
           <w:szCs w:val="24"/>
         </w:rPr>
-        <w:commentReference w:id="96"/>
-      </w:r>
-      <w:del w:id="97" w:author="Anna Olofsson" w:date="2026-04-10T11:54:00Z" w16du:dateUtc="2026-04-10T09:54:00Z">
+        <w:commentReference w:id="103"/>
+      </w:r>
+      <w:del w:id="104" w:author="Anna Olofsson" w:date="2026-04-10T11:54:00Z" w16du:dateUtc="2026-04-10T09:54:00Z">
         <w:r>
           <w:delText>, but the unit of analysis is the individual patient.</w:delText>
         </w:r>
@@ -6135,13 +6204,13 @@
       <w:pPr>
         <w:pStyle w:val="FirstParagraph"/>
         <w:rPr>
-          <w:ins w:id="98" w:author="Anna Olofsson" w:date="2026-04-10T12:04:00Z" w16du:dateUtc="2026-04-10T10:04:00Z"/>
-        </w:rPr>
-      </w:pPr>
-      <w:ins w:id="99" w:author="Anna Olofsson" w:date="2026-04-10T11:54:00Z">
+          <w:ins w:id="105" w:author="Anna Olofsson" w:date="2026-04-10T12:04:00Z" w16du:dateUtc="2026-04-10T10:04:00Z"/>
+        </w:rPr>
+      </w:pPr>
+      <w:ins w:id="106" w:author="Anna Olofsson" w:date="2026-04-10T11:54:00Z">
         <w:r>
           <w:rPr>
-            <w:rPrChange w:id="100" w:author="Anna Olofsson" w:date="2026-04-10T11:54:00Z" w16du:dateUtc="2026-04-10T09:54:00Z">
+            <w:rPrChange w:id="107" w:author="Anna Olofsson" w:date="2026-04-10T11:54:00Z" w16du:dateUtc="2026-04-10T09:54:00Z">
               <w:rPr>
                 <w:lang w:val="sv-SE"/>
               </w:rPr>
@@ -6150,12 +6219,12 @@
           <w:t>Patients will be assigned to a treatment group according to the period in which they were admitted to the hospital, and patients will be considered exposed to the intervention if they were admitted to the hospital at any time point following the transition period.</w:t>
         </w:r>
       </w:ins>
-      <w:ins w:id="101" w:author="Anna Olofsson" w:date="2026-04-10T11:54:00Z" w16du:dateUtc="2026-04-10T09:54:00Z">
+      <w:ins w:id="108" w:author="Anna Olofsson" w:date="2026-04-10T11:54:00Z" w16du:dateUtc="2026-04-10T09:54:00Z">
         <w:r>
           <w:t xml:space="preserve"> </w:t>
         </w:r>
       </w:ins>
-      <w:del w:id="102" w:author="Anna Olofsson" w:date="2026-04-15T10:17:00Z" w16du:dateUtc="2026-04-15T08:17:00Z">
+      <w:del w:id="109" w:author="Anna Olofsson" w:date="2026-04-15T10:17:00Z" w16du:dateUtc="2026-04-15T08:17:00Z">
         <w:r>
           <w:delText xml:space="preserve">The group allocation for a patient depends on the period in which the patient was admitted to the hospital, and patients will be considered exposed to the intervention if they were admitted to the hospital at any time point following the transition period. </w:delText>
         </w:r>
@@ -6163,12 +6232,12 @@
       <w:r>
         <w:t xml:space="preserve">We will use an intention-to-treat approach for all analyses, </w:t>
       </w:r>
-      <w:ins w:id="103" w:author="Karla Hemming (Applied Health Sciences)" w:date="2026-03-09T10:42:00Z" w16du:dateUtc="2026-03-09T10:42:00Z">
+      <w:ins w:id="110" w:author="Karla Hemming (Applied Health Sciences)" w:date="2026-03-09T10:42:00Z" w16du:dateUtc="2026-03-09T10:42:00Z">
         <w:r>
           <w:t xml:space="preserve">regarding clusters as exposed based on their </w:t>
         </w:r>
       </w:ins>
-      <w:del w:id="104" w:author="Karla Hemming (Applied Health Sciences)" w:date="2026-03-09T10:42:00Z" w16du:dateUtc="2026-03-09T10:42:00Z">
+      <w:del w:id="111" w:author="Karla Hemming (Applied Health Sciences)" w:date="2026-03-09T10:42:00Z" w16du:dateUtc="2026-03-09T10:42:00Z">
         <w:r>
           <w:delText xml:space="preserve">according to the </w:delText>
         </w:r>
@@ -6176,78 +6245,78 @@
       <w:r>
         <w:t>planned date of transition from standard care.</w:t>
       </w:r>
-      <w:ins w:id="105" w:author="Anna Olofsson" w:date="2026-04-10T11:57:00Z" w16du:dateUtc="2026-04-10T09:57:00Z">
+      <w:ins w:id="112" w:author="Anna Olofsson" w:date="2026-04-10T11:57:00Z" w16du:dateUtc="2026-04-10T09:57:00Z">
         <w:r>
           <w:t xml:space="preserve"> </w:t>
         </w:r>
       </w:ins>
-      <w:ins w:id="106" w:author="Anna Olofsson" w:date="2026-04-10T11:57:00Z">
+      <w:ins w:id="113" w:author="Anna Olofsson" w:date="2026-04-10T11:57:00Z">
         <w:r>
           <w:t xml:space="preserve">If the actual date of transition deviates considerably from the planned date of transition, defined as more than X weeks, a </w:t>
         </w:r>
-        <w:commentRangeStart w:id="107"/>
+        <w:commentRangeStart w:id="114"/>
         <w:r>
           <w:t xml:space="preserve">per-protocol sensitivity </w:t>
         </w:r>
       </w:ins>
-      <w:commentRangeEnd w:id="107"/>
+      <w:commentRangeEnd w:id="114"/>
       <w:r>
         <w:rPr>
           <w:rStyle w:val="CommentReference"/>
           <w:sz w:val="24"/>
           <w:szCs w:val="24"/>
         </w:rPr>
-        <w:commentReference w:id="107"/>
-      </w:r>
-      <w:ins w:id="108" w:author="Anna Olofsson" w:date="2026-04-10T11:57:00Z">
+        <w:commentReference w:id="114"/>
+      </w:r>
+      <w:ins w:id="115" w:author="Anna Olofsson" w:date="2026-04-10T11:57:00Z">
         <w:r>
           <w:t>analysis will be considered using the actual date of transition as the cut-off point for intervention exposure.</w:t>
         </w:r>
       </w:ins>
-      <w:del w:id="109" w:author="Anna Olofsson" w:date="2026-04-10T11:57:00Z" w16du:dateUtc="2026-04-10T09:57:00Z">
+      <w:del w:id="116" w:author="Anna Olofsson" w:date="2026-04-10T11:57:00Z" w16du:dateUtc="2026-04-10T09:57:00Z">
         <w:r>
           <w:delText xml:space="preserve"> We </w:delText>
         </w:r>
       </w:del>
-      <w:ins w:id="110" w:author="Karla Hemming (Applied Health Sciences)" w:date="2026-03-09T10:43:00Z" w16du:dateUtc="2026-03-09T10:43:00Z">
-        <w:del w:id="111" w:author="Anna Olofsson" w:date="2026-04-10T11:57:00Z" w16du:dateUtc="2026-04-10T09:57:00Z">
+      <w:ins w:id="117" w:author="Karla Hemming (Applied Health Sciences)" w:date="2026-03-09T10:43:00Z" w16du:dateUtc="2026-03-09T10:43:00Z">
+        <w:del w:id="118" w:author="Anna Olofsson" w:date="2026-04-10T11:57:00Z" w16du:dateUtc="2026-04-10T09:57:00Z">
           <w:r>
             <w:delText>will</w:delText>
           </w:r>
         </w:del>
       </w:ins>
-      <w:del w:id="112" w:author="Anna Olofsson" w:date="2026-04-10T11:57:00Z" w16du:dateUtc="2026-04-10T09:57:00Z">
+      <w:del w:id="119" w:author="Anna Olofsson" w:date="2026-04-10T11:57:00Z" w16du:dateUtc="2026-04-10T09:57:00Z">
         <w:r>
           <w:delText xml:space="preserve">might consider </w:delText>
         </w:r>
       </w:del>
-      <w:ins w:id="113" w:author="Karla Hemming (Applied Health Sciences)" w:date="2026-03-09T10:43:00Z" w16du:dateUtc="2026-03-09T10:43:00Z">
-        <w:del w:id="114" w:author="Anna Olofsson" w:date="2026-04-10T11:57:00Z" w16du:dateUtc="2026-04-10T09:57:00Z">
+      <w:ins w:id="120" w:author="Karla Hemming (Applied Health Sciences)" w:date="2026-03-09T10:43:00Z" w16du:dateUtc="2026-03-09T10:43:00Z">
+        <w:del w:id="121" w:author="Anna Olofsson" w:date="2026-04-10T11:57:00Z" w16du:dateUtc="2026-04-10T09:57:00Z">
           <w:r>
             <w:delText xml:space="preserve">other analysis (as a sensitivity analysis) </w:delText>
           </w:r>
         </w:del>
       </w:ins>
-      <w:del w:id="115" w:author="Anna Olofsson" w:date="2026-04-10T11:57:00Z" w16du:dateUtc="2026-04-10T09:57:00Z">
+      <w:del w:id="122" w:author="Anna Olofsson" w:date="2026-04-10T11:57:00Z" w16du:dateUtc="2026-04-10T09:57:00Z">
         <w:r>
           <w:delText>a per protocol analysis if clusters deviate considerably from the planned date of transition,</w:delText>
         </w:r>
       </w:del>
-      <w:ins w:id="116" w:author="Karla Hemming (Applied Health Sciences)" w:date="2026-03-09T10:43:00Z" w16du:dateUtc="2026-03-09T10:43:00Z">
-        <w:del w:id="117" w:author="Anna Olofsson" w:date="2026-04-10T11:57:00Z" w16du:dateUtc="2026-04-10T09:57:00Z">
+      <w:ins w:id="123" w:author="Karla Hemming (Applied Health Sciences)" w:date="2026-03-09T10:43:00Z" w16du:dateUtc="2026-03-09T10:43:00Z">
+        <w:del w:id="124" w:author="Anna Olofsson" w:date="2026-04-10T11:57:00Z" w16du:dateUtc="2026-04-10T09:57:00Z">
           <w:r>
             <w:delText xml:space="preserve"> by more than X </w:delText>
           </w:r>
         </w:del>
       </w:ins>
-      <w:ins w:id="118" w:author="Karla Hemming (Applied Health Sciences)" w:date="2026-03-09T10:44:00Z" w16du:dateUtc="2026-03-09T10:44:00Z">
-        <w:del w:id="119" w:author="Anna Olofsson" w:date="2026-04-10T11:57:00Z" w16du:dateUtc="2026-04-10T09:57:00Z">
+      <w:ins w:id="125" w:author="Karla Hemming (Applied Health Sciences)" w:date="2026-03-09T10:44:00Z" w16du:dateUtc="2026-03-09T10:44:00Z">
+        <w:del w:id="126" w:author="Anna Olofsson" w:date="2026-04-10T11:57:00Z" w16du:dateUtc="2026-04-10T09:57:00Z">
           <w:r>
             <w:delText>weeks,</w:delText>
           </w:r>
         </w:del>
       </w:ins>
-      <w:del w:id="120" w:author="Anna Olofsson" w:date="2026-04-10T11:57:00Z" w16du:dateUtc="2026-04-10T09:57:00Z">
+      <w:del w:id="127" w:author="Anna Olofsson" w:date="2026-04-10T11:57:00Z" w16du:dateUtc="2026-04-10T09:57:00Z">
         <w:r>
           <w:delText xml:space="preserve"> using the actual date of transition as the cut-off point.</w:delText>
         </w:r>
@@ -6260,19 +6329,19 @@
       <w:pPr>
         <w:pStyle w:val="FirstParagraph"/>
         <w:rPr>
-          <w:ins w:id="121" w:author="Anna Olofsson" w:date="2026-04-10T11:56:00Z"/>
-          <w:rPrChange w:id="122" w:author="Anna Olofsson" w:date="2026-04-10T11:56:00Z" w16du:dateUtc="2026-04-10T09:56:00Z">
+          <w:ins w:id="128" w:author="Anna Olofsson" w:date="2026-04-10T11:56:00Z"/>
+          <w:rPrChange w:id="129" w:author="Anna Olofsson" w:date="2026-04-10T11:56:00Z" w16du:dateUtc="2026-04-10T09:56:00Z">
             <w:rPr>
-              <w:ins w:id="123" w:author="Anna Olofsson" w:date="2026-04-10T11:56:00Z"/>
+              <w:ins w:id="130" w:author="Anna Olofsson" w:date="2026-04-10T11:56:00Z"/>
               <w:lang w:val="sv-SE"/>
             </w:rPr>
           </w:rPrChange>
         </w:rPr>
       </w:pPr>
-      <w:ins w:id="124" w:author="Anna Olofsson" w:date="2026-04-10T11:56:00Z">
+      <w:ins w:id="131" w:author="Anna Olofsson" w:date="2026-04-10T11:56:00Z">
         <w:r>
           <w:rPr>
-            <w:rPrChange w:id="125" w:author="Anna Olofsson" w:date="2026-04-10T11:56:00Z" w16du:dateUtc="2026-04-10T09:56:00Z">
+            <w:rPrChange w:id="132" w:author="Anna Olofsson" w:date="2026-04-10T11:56:00Z" w16du:dateUtc="2026-04-10T09:56:00Z">
               <w:rPr>
                 <w:lang w:val="sv-SE"/>
               </w:rPr>
@@ -6281,10 +6350,10 @@
           <w:t>The target population will be specified for each analysis. For the primary outcome and mortality secondary outcomes, the target population comprises all eligible patient participants included in the main stepped-wedge trial. For quality-of-life, disability, and return-to-work outcomes, the target population comprises patients alive at the relevant follow-up time point. For adherence to ATLS® principles, the target population comprises the random sample of patients observed within the nested staircase design.</w:t>
         </w:r>
       </w:ins>
-      <w:ins w:id="126" w:author="Anna Olofsson" w:date="2026-04-10T11:56:00Z" w16du:dateUtc="2026-04-10T09:56:00Z">
+      <w:ins w:id="133" w:author="Anna Olofsson" w:date="2026-04-10T11:56:00Z" w16du:dateUtc="2026-04-10T09:56:00Z">
         <w:r>
           <w:rPr>
-            <w:rPrChange w:id="127" w:author="Anna Olofsson" w:date="2026-04-10T11:56:00Z" w16du:dateUtc="2026-04-10T09:56:00Z">
+            <w:rPrChange w:id="134" w:author="Anna Olofsson" w:date="2026-04-10T11:56:00Z" w16du:dateUtc="2026-04-10T09:56:00Z">
               <w:rPr>
                 <w:lang w:val="sv-SE"/>
               </w:rPr>
@@ -6305,10 +6374,10 @@
       <w:pPr>
         <w:pStyle w:val="FirstParagraph"/>
         <w:rPr>
-          <w:ins w:id="128" w:author="Anna Olofsson" w:date="2026-04-10T11:51:00Z" w16du:dateUtc="2026-04-10T09:51:00Z"/>
-        </w:rPr>
-      </w:pPr>
-      <w:del w:id="129" w:author="Anna Olofsson" w:date="2026-04-10T12:10:00Z" w16du:dateUtc="2026-04-10T10:10:00Z">
+          <w:ins w:id="135" w:author="Anna Olofsson" w:date="2026-04-10T11:51:00Z" w16du:dateUtc="2026-04-10T09:51:00Z"/>
+        </w:rPr>
+      </w:pPr>
+      <w:del w:id="136" w:author="Anna Olofsson" w:date="2026-04-10T12:10:00Z" w16du:dateUtc="2026-04-10T10:10:00Z">
         <w:r>
           <w:delText xml:space="preserve">We will report the results of the per protocol analysis as a sensitivity analysis. </w:delText>
         </w:r>
@@ -6316,12 +6385,12 @@
       <w:r>
         <w:t>We will use a CONSORT diagram to display the flow of hospitals, clusters and patients through the trial. We will present cluster</w:t>
       </w:r>
-      <w:ins w:id="130" w:author="Karla Hemming (Applied Health Sciences)" w:date="2026-03-09T10:44:00Z" w16du:dateUtc="2026-03-09T10:44:00Z">
+      <w:ins w:id="137" w:author="Karla Hemming (Applied Health Sciences)" w:date="2026-03-09T10:44:00Z" w16du:dateUtc="2026-03-09T10:44:00Z">
         <w:r>
           <w:t>-specific</w:t>
         </w:r>
       </w:ins>
-      <w:del w:id="131" w:author="Karla Hemming (Applied Health Sciences)" w:date="2026-03-09T10:44:00Z" w16du:dateUtc="2026-03-09T10:44:00Z">
+      <w:del w:id="138" w:author="Karla Hemming (Applied Health Sciences)" w:date="2026-03-09T10:44:00Z" w16du:dateUtc="2026-03-09T10:44:00Z">
         <w:r>
           <w:delText xml:space="preserve"> level</w:delText>
         </w:r>
@@ -6343,14 +6412,14 @@
       <w:pPr>
         <w:pStyle w:val="BodyText"/>
         <w:rPr>
-          <w:ins w:id="132" w:author="Anna Olofsson" w:date="2026-04-10T11:51:00Z" w16du:dateUtc="2026-04-10T09:51:00Z"/>
+          <w:ins w:id="139" w:author="Anna Olofsson" w:date="2026-04-10T11:51:00Z" w16du:dateUtc="2026-04-10T09:51:00Z"/>
         </w:rPr>
       </w:pPr>
     </w:p>
     <w:p>
       <w:pPr>
         <w:pStyle w:val="BodyText"/>
-        <w:pPrChange w:id="133" w:author="Anna Olofsson" w:date="2026-04-10T11:51:00Z" w16du:dateUtc="2026-04-10T09:51:00Z">
+        <w:pPrChange w:id="140" w:author="Anna Olofsson" w:date="2026-04-10T11:51:00Z" w16du:dateUtc="2026-04-10T09:51:00Z">
           <w:pPr>
             <w:pStyle w:val="FirstParagraph"/>
           </w:pPr>
@@ -6361,33 +6430,33 @@
       <w:pPr>
         <w:pStyle w:val="Heading2"/>
         <w:rPr>
-          <w:ins w:id="134" w:author="Anna Olofsson" w:date="2026-04-10T12:57:00Z" w16du:dateUtc="2026-04-10T10:57:00Z"/>
-        </w:rPr>
-      </w:pPr>
-      <w:bookmarkStart w:id="135" w:name="_Toc223944495"/>
-      <w:bookmarkStart w:id="136" w:name="baseline-analyses"/>
-      <w:bookmarkEnd w:id="88"/>
+          <w:ins w:id="141" w:author="Anna Olofsson" w:date="2026-04-10T12:57:00Z" w16du:dateUtc="2026-04-10T10:57:00Z"/>
+        </w:rPr>
+      </w:pPr>
+      <w:bookmarkStart w:id="142" w:name="_Toc223944495"/>
+      <w:bookmarkStart w:id="143" w:name="baseline-analyses"/>
+      <w:bookmarkEnd w:id="95"/>
       <w:r>
         <w:t>5.8 Baseline analyses</w:t>
       </w:r>
-      <w:bookmarkEnd w:id="135"/>
+      <w:bookmarkEnd w:id="142"/>
     </w:p>
     <w:p>
       <w:pPr>
         <w:pStyle w:val="BodyText"/>
         <w:rPr>
-          <w:del w:id="137" w:author="Anna Olofsson" w:date="2026-04-10T13:02:00Z" w16du:dateUtc="2026-04-10T11:02:00Z"/>
-        </w:rPr>
-        <w:pPrChange w:id="138" w:author="Anna Olofsson" w:date="2026-04-10T12:57:00Z" w16du:dateUtc="2026-04-10T10:57:00Z">
+          <w:del w:id="144" w:author="Anna Olofsson" w:date="2026-04-10T13:02:00Z" w16du:dateUtc="2026-04-10T11:02:00Z"/>
+        </w:rPr>
+        <w:pPrChange w:id="145" w:author="Anna Olofsson" w:date="2026-04-10T12:57:00Z" w16du:dateUtc="2026-04-10T10:57:00Z">
           <w:pPr>
             <w:pStyle w:val="Heading2"/>
           </w:pPr>
         </w:pPrChange>
       </w:pPr>
-      <w:ins w:id="139" w:author="Anna Olofsson" w:date="2026-04-10T13:02:00Z">
+      <w:ins w:id="146" w:author="Anna Olofsson" w:date="2026-04-10T13:02:00Z">
         <w:r>
           <w:rPr>
-            <w:rPrChange w:id="140" w:author="Anna Olofsson" w:date="2026-04-10T13:03:00Z" w16du:dateUtc="2026-04-10T11:03:00Z">
+            <w:rPrChange w:id="147" w:author="Anna Olofsson" w:date="2026-04-10T13:03:00Z" w16du:dateUtc="2026-04-10T11:03:00Z">
               <w:rPr>
                 <w:b/>
                 <w:bCs/>
@@ -6403,30 +6472,30 @@
       <w:pPr>
         <w:pStyle w:val="Heading3"/>
       </w:pPr>
-      <w:bookmarkStart w:id="141" w:name="_Toc223944496"/>
-      <w:bookmarkStart w:id="142" w:name="cluster-characteristics"/>
+      <w:bookmarkStart w:id="148" w:name="_Toc223944496"/>
+      <w:bookmarkStart w:id="149" w:name="cluster-characteristics"/>
       <w:r>
         <w:t>5.8.1 Cluster characteristics</w:t>
       </w:r>
-      <w:bookmarkEnd w:id="141"/>
+      <w:bookmarkEnd w:id="148"/>
     </w:p>
     <w:p>
       <w:pPr>
         <w:pStyle w:val="FirstParagraph"/>
         <w:rPr>
-          <w:ins w:id="143" w:author="Anna Olofsson" w:date="2026-04-10T13:00:00Z"/>
-          <w:rPrChange w:id="144" w:author="Anna Olofsson" w:date="2026-04-10T13:00:00Z" w16du:dateUtc="2026-04-10T11:00:00Z">
+          <w:ins w:id="150" w:author="Anna Olofsson" w:date="2026-04-10T13:00:00Z"/>
+          <w:rPrChange w:id="151" w:author="Anna Olofsson" w:date="2026-04-10T13:00:00Z" w16du:dateUtc="2026-04-10T11:00:00Z">
             <w:rPr>
-              <w:ins w:id="145" w:author="Anna Olofsson" w:date="2026-04-10T13:00:00Z"/>
+              <w:ins w:id="152" w:author="Anna Olofsson" w:date="2026-04-10T13:00:00Z"/>
               <w:lang w:val="sv-SE"/>
             </w:rPr>
           </w:rPrChange>
         </w:rPr>
       </w:pPr>
-      <w:ins w:id="146" w:author="Anna Olofsson" w:date="2026-04-10T13:00:00Z">
+      <w:ins w:id="153" w:author="Anna Olofsson" w:date="2026-04-10T13:00:00Z">
         <w:r>
           <w:rPr>
-            <w:rPrChange w:id="147" w:author="Anna Olofsson" w:date="2026-04-10T13:00:00Z" w16du:dateUtc="2026-04-10T11:00:00Z">
+            <w:rPrChange w:id="154" w:author="Anna Olofsson" w:date="2026-04-10T13:00:00Z" w16du:dateUtc="2026-04-10T11:00:00Z">
               <w:rPr>
                 <w:lang w:val="sv-SE"/>
               </w:rPr>
@@ -6435,10 +6504,10 @@
           <w:t>Cluster characteristics to be summarised will include cluster location (state) and cluster size.</w:t>
         </w:r>
       </w:ins>
-      <w:ins w:id="148" w:author="Anna Olofsson" w:date="2026-04-10T13:00:00Z" w16du:dateUtc="2026-04-10T11:00:00Z">
+      <w:ins w:id="155" w:author="Anna Olofsson" w:date="2026-04-10T13:00:00Z" w16du:dateUtc="2026-04-10T11:00:00Z">
         <w:r>
           <w:rPr>
-            <w:rPrChange w:id="149" w:author="Anna Olofsson" w:date="2026-04-10T13:00:00Z" w16du:dateUtc="2026-04-10T11:00:00Z">
+            <w:rPrChange w:id="156" w:author="Anna Olofsson" w:date="2026-04-10T13:00:00Z" w16du:dateUtc="2026-04-10T11:00:00Z">
               <w:rPr>
                 <w:lang w:val="sv-SE"/>
               </w:rPr>
@@ -6447,10 +6516,10 @@
           <w:t xml:space="preserve"> </w:t>
         </w:r>
       </w:ins>
-      <w:ins w:id="150" w:author="Anna Olofsson" w:date="2026-04-10T13:00:00Z">
+      <w:ins w:id="157" w:author="Anna Olofsson" w:date="2026-04-10T13:00:00Z">
         <w:r>
           <w:rPr>
-            <w:rPrChange w:id="151" w:author="Anna Olofsson" w:date="2026-04-10T13:00:00Z" w16du:dateUtc="2026-04-10T11:00:00Z">
+            <w:rPrChange w:id="158" w:author="Anna Olofsson" w:date="2026-04-10T13:00:00Z" w16du:dateUtc="2026-04-10T11:00:00Z">
               <w:rPr>
                 <w:lang w:val="sv-SE"/>
               </w:rPr>
@@ -6464,10 +6533,10 @@
       <w:pPr>
         <w:pStyle w:val="FirstParagraph"/>
         <w:rPr>
-          <w:del w:id="152" w:author="Anna Olofsson" w:date="2026-04-10T13:00:00Z" w16du:dateUtc="2026-04-10T11:00:00Z"/>
-        </w:rPr>
-      </w:pPr>
-      <w:del w:id="153" w:author="Anna Olofsson" w:date="2026-04-10T13:00:00Z" w16du:dateUtc="2026-04-10T11:00:00Z">
+          <w:del w:id="159" w:author="Anna Olofsson" w:date="2026-04-10T13:00:00Z" w16du:dateUtc="2026-04-10T11:00:00Z"/>
+        </w:rPr>
+      </w:pPr>
+      <w:del w:id="160" w:author="Anna Olofsson" w:date="2026-04-10T13:00:00Z" w16du:dateUtc="2026-04-10T11:00:00Z">
         <w:r>
           <w:delText>We will describe cluster characteristics including location and size using frequencies and percentages for discrete variables and means, standard deviations, medians and interquartile ranges (Q1-Q3) for continuous variables.</w:delText>
         </w:r>
@@ -6477,22 +6546,22 @@
       <w:pPr>
         <w:pStyle w:val="Heading3"/>
       </w:pPr>
-      <w:bookmarkStart w:id="154" w:name="_Toc223944497"/>
-      <w:bookmarkStart w:id="155" w:name="patient-characteristics"/>
-      <w:bookmarkEnd w:id="142"/>
+      <w:bookmarkStart w:id="161" w:name="_Toc223944497"/>
+      <w:bookmarkStart w:id="162" w:name="patient-characteristics"/>
+      <w:bookmarkEnd w:id="149"/>
       <w:r>
         <w:t>5.8.2 Patient characteristics</w:t>
       </w:r>
-      <w:bookmarkEnd w:id="154"/>
+      <w:bookmarkEnd w:id="161"/>
     </w:p>
     <w:p>
       <w:pPr>
         <w:pStyle w:val="FirstParagraph"/>
       </w:pPr>
-      <w:ins w:id="156" w:author="Anna Olofsson" w:date="2026-04-10T12:59:00Z">
+      <w:ins w:id="163" w:author="Anna Olofsson" w:date="2026-04-10T12:59:00Z">
         <w:r>
           <w:rPr>
-            <w:rPrChange w:id="157" w:author="Anna Olofsson" w:date="2026-04-10T12:59:00Z" w16du:dateUtc="2026-04-10T10:59:00Z">
+            <w:rPrChange w:id="164" w:author="Anna Olofsson" w:date="2026-04-10T12:59:00Z" w16du:dateUtc="2026-04-10T10:59:00Z">
               <w:rPr>
                 <w:lang w:val="sv-SE"/>
               </w:rPr>
@@ -6501,7 +6570,7 @@
           <w:t>Patient characteristics to be summarised will include age, sex, systolic blood pressure, Glasgow Coma Scale, Injury Severity Score, and mechanism of injury.</w:t>
         </w:r>
       </w:ins>
-      <w:ins w:id="158" w:author="Anna Olofsson" w:date="2026-04-10T13:00:00Z" w16du:dateUtc="2026-04-10T11:00:00Z">
+      <w:ins w:id="165" w:author="Anna Olofsson" w:date="2026-04-10T13:00:00Z" w16du:dateUtc="2026-04-10T11:00:00Z">
         <w:r>
           <w:t xml:space="preserve"> </w:t>
         </w:r>
@@ -6509,38 +6578,38 @@
       <w:r>
         <w:t xml:space="preserve">We will describe patient characteristics at </w:t>
       </w:r>
-      <w:commentRangeStart w:id="159"/>
-      <w:commentRangeStart w:id="160"/>
+      <w:commentRangeStart w:id="166"/>
+      <w:commentRangeStart w:id="167"/>
       <w:r>
         <w:t>baseline</w:t>
       </w:r>
-      <w:commentRangeEnd w:id="159"/>
+      <w:commentRangeEnd w:id="166"/>
       <w:r>
         <w:rPr>
           <w:rStyle w:val="CommentReference"/>
           <w:sz w:val="24"/>
           <w:szCs w:val="24"/>
         </w:rPr>
-        <w:commentReference w:id="159"/>
-      </w:r>
-      <w:commentRangeEnd w:id="160"/>
+        <w:commentReference w:id="166"/>
+      </w:r>
+      <w:commentRangeEnd w:id="167"/>
       <w:r>
         <w:rPr>
           <w:rStyle w:val="CommentReference"/>
           <w:sz w:val="24"/>
           <w:szCs w:val="24"/>
         </w:rPr>
-        <w:commentReference w:id="160"/>
+        <w:commentReference w:id="167"/>
       </w:r>
       <w:r>
         <w:t xml:space="preserve">, </w:t>
       </w:r>
-      <w:del w:id="161" w:author="Anna Olofsson" w:date="2026-04-10T13:03:00Z" w16du:dateUtc="2026-04-10T11:03:00Z">
+      <w:del w:id="168" w:author="Anna Olofsson" w:date="2026-04-10T13:03:00Z" w16du:dateUtc="2026-04-10T11:03:00Z">
         <w:r>
           <w:delText xml:space="preserve">meaning </w:delText>
         </w:r>
       </w:del>
-      <w:ins w:id="162" w:author="Anna Olofsson" w:date="2026-04-10T13:03:00Z" w16du:dateUtc="2026-04-10T11:03:00Z">
+      <w:ins w:id="169" w:author="Anna Olofsson" w:date="2026-04-10T13:03:00Z" w16du:dateUtc="2026-04-10T11:03:00Z">
         <w:r>
           <w:t xml:space="preserve">defined as </w:t>
         </w:r>
@@ -6548,12 +6617,12 @@
       <w:r>
         <w:t xml:space="preserve">all pre-training periods, </w:t>
       </w:r>
-      <w:del w:id="163" w:author="Anna Olofsson" w:date="2026-04-10T13:03:00Z" w16du:dateUtc="2026-04-10T11:03:00Z">
+      <w:del w:id="170" w:author="Anna Olofsson" w:date="2026-04-10T13:03:00Z" w16du:dateUtc="2026-04-10T11:03:00Z">
         <w:r>
           <w:delText xml:space="preserve">per </w:delText>
         </w:r>
       </w:del>
-      <w:ins w:id="164" w:author="Anna Olofsson" w:date="2026-04-10T13:03:00Z" w16du:dateUtc="2026-04-10T11:03:00Z">
+      <w:ins w:id="171" w:author="Anna Olofsson" w:date="2026-04-10T13:03:00Z" w16du:dateUtc="2026-04-10T11:03:00Z">
         <w:r>
           <w:t xml:space="preserve">by </w:t>
         </w:r>
@@ -6566,14 +6635,14 @@
       <w:pPr>
         <w:pStyle w:val="Heading2"/>
       </w:pPr>
-      <w:bookmarkStart w:id="165" w:name="_Toc223944498"/>
-      <w:bookmarkStart w:id="166" w:name="interim-analysis"/>
-      <w:bookmarkEnd w:id="136"/>
-      <w:bookmarkEnd w:id="155"/>
+      <w:bookmarkStart w:id="172" w:name="_Toc223944498"/>
+      <w:bookmarkStart w:id="173" w:name="interim-analysis"/>
+      <w:bookmarkEnd w:id="143"/>
+      <w:bookmarkEnd w:id="162"/>
       <w:r>
         <w:t>5.9 Interim analysis</w:t>
       </w:r>
-      <w:bookmarkEnd w:id="165"/>
+      <w:bookmarkEnd w:id="172"/>
     </w:p>
     <w:p>
       <w:pPr>
@@ -6586,12 +6655,12 @@
         <w:lastRenderedPageBreak/>
         <w:t xml:space="preserve">the randomisation schedule or if there are substantial missing data in outcomes), and to compare characteristics across intervention conditions to monitor for differential recruitment/ascertainment between the intervention and control groups. No efficacy </w:t>
       </w:r>
-      <w:ins w:id="167" w:author="Karla Hemming (Applied Health Sciences)" w:date="2026-03-09T10:46:00Z" w16du:dateUtc="2026-03-09T10:46:00Z">
+      <w:ins w:id="174" w:author="Karla Hemming (Applied Health Sciences)" w:date="2026-03-09T10:46:00Z" w16du:dateUtc="2026-03-09T10:46:00Z">
         <w:r>
           <w:t xml:space="preserve">analysis </w:t>
         </w:r>
       </w:ins>
-      <w:del w:id="168" w:author="Karla Hemming (Applied Health Sciences)" w:date="2026-03-09T10:46:00Z" w16du:dateUtc="2026-03-09T10:46:00Z">
+      <w:del w:id="175" w:author="Karla Hemming (Applied Health Sciences)" w:date="2026-03-09T10:46:00Z" w16du:dateUtc="2026-03-09T10:46:00Z">
         <w:r>
           <w:delText xml:space="preserve">stopping </w:delText>
         </w:r>
@@ -6604,13 +6673,13 @@
       <w:pPr>
         <w:pStyle w:val="Heading2"/>
       </w:pPr>
-      <w:bookmarkStart w:id="169" w:name="_Toc223944499"/>
-      <w:bookmarkStart w:id="170" w:name="analysis-of-the-primary-outcome"/>
-      <w:bookmarkEnd w:id="166"/>
+      <w:bookmarkStart w:id="176" w:name="_Toc223944499"/>
+      <w:bookmarkStart w:id="177" w:name="analysis-of-the-primary-outcome"/>
+      <w:bookmarkEnd w:id="173"/>
       <w:r>
         <w:t>5.10 Analysis of the primary outcome</w:t>
       </w:r>
-      <w:bookmarkEnd w:id="169"/>
+      <w:bookmarkEnd w:id="176"/>
     </w:p>
     <w:p>
       <w:pPr>
@@ -6624,13 +6693,13 @@
       <w:pPr>
         <w:pStyle w:val="BodyText"/>
         <w:rPr>
-          <w:ins w:id="171" w:author="Anna Olofsson" w:date="2026-04-15T12:21:00Z" w16du:dateUtc="2026-04-15T10:21:00Z"/>
+          <w:ins w:id="178" w:author="Anna Olofsson" w:date="2026-04-15T12:21:00Z" w16du:dateUtc="2026-04-15T10:21:00Z"/>
         </w:rPr>
       </w:pPr>
       <w:r>
         <w:t>We will use a mixed-effects binomial regression model to estimate the effect of ATLS® on mortality. The OR will be estimated using the logit link, and the ARD will be estimated using the identity link. The primary analysis will be based on the most complex model that converges from a prespecified sequence of models of decreasing complexity, and this model will then be subject to sensitivity analyses. The analysis will proceed from the most complex model to progressively simpler models if there are convergence or numerical stability issues. If the binomial model with the logit link converges but the corresponding model with the identity link does not, then we will report only an OR.</w:t>
       </w:r>
-      <w:ins w:id="172" w:author="Anna Olofsson" w:date="2026-04-15T12:21:00Z" w16du:dateUtc="2026-04-15T10:21:00Z">
+      <w:ins w:id="179" w:author="Anna Olofsson" w:date="2026-04-15T12:21:00Z" w16du:dateUtc="2026-04-15T10:21:00Z">
         <w:r>
           <w:t xml:space="preserve"> </w:t>
         </w:r>
@@ -6640,10 +6709,10 @@
       <w:pPr>
         <w:pStyle w:val="BodyText"/>
         <w:rPr>
-          <w:del w:id="173" w:author="Anna Olofsson" w:date="2026-04-15T12:22:00Z" w16du:dateUtc="2026-04-15T10:22:00Z"/>
-        </w:rPr>
-      </w:pPr>
-      <w:ins w:id="174" w:author="Anna Olofsson" w:date="2026-04-15T12:23:00Z">
+          <w:del w:id="180" w:author="Anna Olofsson" w:date="2026-04-15T12:22:00Z" w16du:dateUtc="2026-04-15T10:22:00Z"/>
+        </w:rPr>
+      </w:pPr>
+      <w:ins w:id="181" w:author="Anna Olofsson" w:date="2026-04-15T12:23:00Z">
         <w:r>
           <w:t>The planned mixed-effects models account for clustering at the hospital level and provide cluster-specific estimates of the intervention effect. For the primary outcome, effect measures will be reported according to the link function used, including odds ratios and absolute risk differences.</w:t>
         </w:r>
@@ -6653,18 +6722,18 @@
       <w:pPr>
         <w:pStyle w:val="BodyText"/>
         <w:rPr>
-          <w:ins w:id="175" w:author="Anna Olofsson" w:date="2026-04-15T12:09:00Z" w16du:dateUtc="2026-04-15T10:09:00Z"/>
+          <w:ins w:id="182" w:author="Anna Olofsson" w:date="2026-04-15T12:09:00Z" w16du:dateUtc="2026-04-15T10:09:00Z"/>
         </w:rPr>
       </w:pPr>
       <w:r>
         <w:t>All models in this sequence will include a fixed effect for intervention exposure and adjust for time, although the parametrisation of time and the random effects structure may be simplified.</w:t>
       </w:r>
-      <w:ins w:id="176" w:author="Anna Olofsson" w:date="2026-04-10T12:13:00Z" w16du:dateUtc="2026-04-10T10:13:00Z">
+      <w:ins w:id="183" w:author="Anna Olofsson" w:date="2026-04-10T12:13:00Z" w16du:dateUtc="2026-04-10T10:13:00Z">
         <w:r>
           <w:t xml:space="preserve"> </w:t>
         </w:r>
       </w:ins>
-      <w:ins w:id="177" w:author="Anna Olofsson" w:date="2026-04-10T12:13:00Z">
+      <w:ins w:id="184" w:author="Anna Olofsson" w:date="2026-04-10T12:13:00Z">
         <w:r>
           <w:t>Appropriate model diagnostics will be used to assess the assumptions of each fitted model, including distributional assumptions, and model convergence.</w:t>
         </w:r>
@@ -6674,10 +6743,10 @@
       <w:pPr>
         <w:pStyle w:val="BodyText"/>
       </w:pPr>
-      <w:ins w:id="178" w:author="Anna Olofsson" w:date="2026-04-15T12:24:00Z">
+      <w:ins w:id="185" w:author="Anna Olofsson" w:date="2026-04-15T12:24:00Z">
         <w:r>
           <w:rPr>
-            <w:rPrChange w:id="179" w:author="Anna Olofsson" w:date="2026-04-15T12:24:00Z" w16du:dateUtc="2026-04-15T10:24:00Z">
+            <w:rPrChange w:id="186" w:author="Anna Olofsson" w:date="2026-04-15T12:24:00Z" w16du:dateUtc="2026-04-15T10:24:00Z">
               <w:rPr>
                 <w:b/>
                 <w:bCs/>
@@ -6687,12 +6756,12 @@
           <w:t>For the primary outcome, we will report time-adjusted within-cluster correlations with 95% confidence intervals.</w:t>
         </w:r>
       </w:ins>
-      <w:ins w:id="180" w:author="Anna Olofsson" w:date="2026-04-15T12:24:00Z" w16du:dateUtc="2026-04-15T10:24:00Z">
+      <w:ins w:id="187" w:author="Anna Olofsson" w:date="2026-04-15T12:24:00Z" w16du:dateUtc="2026-04-15T10:24:00Z">
         <w:r>
           <w:t xml:space="preserve"> </w:t>
         </w:r>
       </w:ins>
-      <w:ins w:id="181" w:author="Anna Olofsson" w:date="2026-04-15T12:09:00Z">
+      <w:ins w:id="188" w:author="Anna Olofsson" w:date="2026-04-15T12:09:00Z">
         <w:r>
           <w:t>We will report correlations from the different assumed correlation structures, including intra-cluster correlations (ICC), within- and between-period correlations, and within-period correlations with exponential decay where applicable. We will additionally report all estimated variance components. For binary outcomes, correlations will be reported on the latent scale, as appropriate to inform future sample size calculations.</w:t>
         </w:r>
@@ -6741,7 +6810,7 @@
       <w:pPr>
         <w:pStyle w:val="FirstParagraph"/>
       </w:pPr>
-      <w:bookmarkStart w:id="182" w:name="eq-primary-model"/>
+      <w:bookmarkStart w:id="189" w:name="eq-primary-model"/>
       <m:oMathPara>
         <m:oMathParaPr>
           <m:jc m:val="center"/>
@@ -7013,7 +7082,7 @@
           </m:d>
         </m:oMath>
       </m:oMathPara>
-      <w:bookmarkEnd w:id="182"/>
+      <w:bookmarkEnd w:id="189"/>
     </w:p>
     <w:p>
       <w:pPr>
@@ -7049,7 +7118,7 @@
       <w:pPr>
         <w:pStyle w:val="FirstParagraph"/>
       </w:pPr>
-      <w:bookmarkStart w:id="183" w:name="eq-simplified-random-effects-model"/>
+      <w:bookmarkStart w:id="190" w:name="eq-simplified-random-effects-model"/>
       <m:oMathPara>
         <m:oMathParaPr>
           <m:jc m:val="center"/>
@@ -7281,7 +7350,7 @@
           </m:d>
         </m:oMath>
       </m:oMathPara>
-      <w:bookmarkEnd w:id="183"/>
+      <w:bookmarkEnd w:id="190"/>
     </w:p>
     <w:p>
       <w:pPr>
@@ -7301,28 +7370,28 @@
       <w:r>
         <w:t xml:space="preserve">: a model in which period effects are shared across batches, with time adjusted for using a common period effect or calendar time modelled directly (e.g., as a continuous covariate or using splines), </w:t>
       </w:r>
-      <w:commentRangeStart w:id="184"/>
-      <w:commentRangeStart w:id="185"/>
+      <w:commentRangeStart w:id="191"/>
+      <w:commentRangeStart w:id="192"/>
       <w:r>
         <w:t>while</w:t>
       </w:r>
-      <w:commentRangeEnd w:id="184"/>
+      <w:commentRangeEnd w:id="191"/>
       <w:r>
         <w:rPr>
           <w:rStyle w:val="CommentReference"/>
           <w:sz w:val="24"/>
           <w:szCs w:val="24"/>
         </w:rPr>
-        <w:commentReference w:id="184"/>
-      </w:r>
-      <w:commentRangeEnd w:id="185"/>
+        <w:commentReference w:id="191"/>
+      </w:r>
+      <w:commentRangeEnd w:id="192"/>
       <w:r>
         <w:rPr>
           <w:rStyle w:val="CommentReference"/>
           <w:sz w:val="24"/>
           <w:szCs w:val="24"/>
         </w:rPr>
-        <w:commentReference w:id="185"/>
+        <w:commentReference w:id="192"/>
       </w:r>
       <w:r>
         <w:t xml:space="preserve"> retaining the random effects structure. The model is specified in </w:t>
@@ -7343,7 +7412,7 @@
       <w:pPr>
         <w:pStyle w:val="FirstParagraph"/>
       </w:pPr>
-      <w:bookmarkStart w:id="186" w:name="eq-shared-period-model"/>
+      <w:bookmarkStart w:id="193" w:name="eq-shared-period-model"/>
       <m:oMathPara>
         <m:oMathParaPr>
           <m:jc m:val="center"/>
@@ -7597,7 +7666,7 @@
           </m:d>
         </m:oMath>
       </m:oMathPara>
-      <w:bookmarkEnd w:id="186"/>
+      <w:bookmarkEnd w:id="193"/>
     </w:p>
     <w:p>
       <w:pPr>
@@ -7633,7 +7702,7 @@
       <w:pPr>
         <w:pStyle w:val="FirstParagraph"/>
       </w:pPr>
-      <w:bookmarkStart w:id="187" w:name="eq-combined-simplified-model"/>
+      <w:bookmarkStart w:id="194" w:name="eq-combined-simplified-model"/>
       <m:oMathPara>
         <m:oMathParaPr>
           <m:jc m:val="center"/>
@@ -7853,7 +7922,7 @@
           </m:d>
         </m:oMath>
       </m:oMathPara>
-      <w:bookmarkEnd w:id="187"/>
+      <w:bookmarkEnd w:id="194"/>
     </w:p>
     <w:p>
       <w:pPr>
@@ -8766,7 +8835,7 @@
         <w:t>.</w:t>
       </w:r>
     </w:p>
-    <w:bookmarkStart w:id="188" w:name="eq-distributional-assumptions"/>
+    <w:bookmarkStart w:id="195" w:name="eq-distributional-assumptions"/>
     <w:p>
       <w:pPr>
         <w:pStyle w:val="BodyText"/>
@@ -9173,7 +9242,7 @@
           </m:d>
         </m:oMath>
       </m:oMathPara>
-      <w:bookmarkEnd w:id="188"/>
+      <w:bookmarkEnd w:id="195"/>
     </w:p>
     <w:p>
       <w:pPr>
@@ -9191,12 +9260,12 @@
       <w:r>
         <w:t>, but this choice may be updated based on methodological developments available closer to the end of patient inclusion. The correction applied may also differ for outcomes collected via the complete stepped-wedge design and the incomplete nested staircase designs.</w:t>
       </w:r>
-      <w:ins w:id="189" w:author="Anna Olofsson" w:date="2026-04-15T12:17:00Z" w16du:dateUtc="2026-04-15T10:17:00Z">
+      <w:ins w:id="196" w:author="Anna Olofsson" w:date="2026-04-15T12:17:00Z" w16du:dateUtc="2026-04-15T10:17:00Z">
         <w:r>
           <w:t xml:space="preserve"> </w:t>
         </w:r>
       </w:ins>
-      <w:ins w:id="190" w:author="Anna Olofsson" w:date="2026-04-15T12:17:00Z">
+      <w:ins w:id="197" w:author="Anna Olofsson" w:date="2026-04-15T12:17:00Z">
         <w:r>
           <w:t>Standard errors will be obtained using model-based estimators. Given the cluster-randomised design with a limited number of clusters, appropriate small-sample adjustments, including degrees-of-freedom corrections where relevant, will be applied. Confidence intervals will be constructed using Wald-type methods.</w:t>
         </w:r>
@@ -9206,44 +9275,44 @@
       <w:pPr>
         <w:pStyle w:val="BodyText"/>
         <w:rPr>
-          <w:ins w:id="191" w:author="Anna Olofsson" w:date="2026-04-15T12:06:00Z" w16du:dateUtc="2026-04-15T10:06:00Z"/>
+          <w:ins w:id="198" w:author="Anna Olofsson" w:date="2026-04-15T12:06:00Z" w16du:dateUtc="2026-04-15T10:06:00Z"/>
         </w:rPr>
       </w:pPr>
       <w:r>
         <w:t>All models will be fitted using residual pseudo-likelihood estimation based on linearisation with subject-specific expansion (</w:t>
       </w:r>
-      <w:commentRangeStart w:id="192"/>
-      <w:commentRangeStart w:id="193"/>
+      <w:commentRangeStart w:id="199"/>
+      <w:commentRangeStart w:id="200"/>
       <w:r>
         <w:t>RSPL</w:t>
       </w:r>
-      <w:commentRangeEnd w:id="192"/>
+      <w:commentRangeEnd w:id="199"/>
       <w:r>
         <w:rPr>
           <w:rStyle w:val="CommentReference"/>
           <w:sz w:val="24"/>
           <w:szCs w:val="24"/>
         </w:rPr>
-        <w:commentReference w:id="192"/>
-      </w:r>
-      <w:commentRangeEnd w:id="193"/>
+        <w:commentReference w:id="199"/>
+      </w:r>
+      <w:commentRangeEnd w:id="200"/>
       <w:r>
         <w:rPr>
           <w:rStyle w:val="CommentReference"/>
           <w:sz w:val="24"/>
           <w:szCs w:val="24"/>
         </w:rPr>
-        <w:commentReference w:id="193"/>
+        <w:commentReference w:id="200"/>
       </w:r>
       <w:r>
         <w:t>), due to its computational stability and robust performance in small-sample settings. If the binomial model with the logit link converges but the corresponding model with the identity link does not, then we will report only an OR.</w:t>
       </w:r>
-      <w:ins w:id="194" w:author="Anna Olofsson" w:date="2026-04-15T12:13:00Z" w16du:dateUtc="2026-04-15T10:13:00Z">
+      <w:ins w:id="201" w:author="Anna Olofsson" w:date="2026-04-15T12:13:00Z" w16du:dateUtc="2026-04-15T10:13:00Z">
         <w:r>
           <w:t xml:space="preserve"> </w:t>
         </w:r>
       </w:ins>
-      <w:ins w:id="195" w:author="Anna Olofsson" w:date="2026-04-15T12:13:00Z">
+      <w:ins w:id="202" w:author="Anna Olofsson" w:date="2026-04-15T12:13:00Z">
         <w:r>
           <w:t>Models will be estimated using likelihood-based or pseudo-likelihood methods as appropriate for the model class and estimation procedure.</w:t>
         </w:r>
@@ -9253,10 +9322,10 @@
       <w:pPr>
         <w:pStyle w:val="BodyText"/>
         <w:rPr>
-          <w:del w:id="196" w:author="Anna Olofsson" w:date="2026-04-15T12:06:00Z" w16du:dateUtc="2026-04-15T10:06:00Z"/>
-        </w:rPr>
-      </w:pPr>
-      <w:ins w:id="197" w:author="Anna Olofsson" w:date="2026-04-15T12:06:00Z">
+          <w:del w:id="203" w:author="Anna Olofsson" w:date="2026-04-15T12:06:00Z" w16du:dateUtc="2026-04-15T10:06:00Z"/>
+        </w:rPr>
+      </w:pPr>
+      <w:ins w:id="204" w:author="Anna Olofsson" w:date="2026-04-15T12:06:00Z">
         <w:r>
           <w:t>Correlation parameters will be derived from the estimated variance components of the fitted mixed-effects models. For models with autoregressive within-cluster correlation, the correlation parameter will be estimated directly from the AR(1) structure.</w:t>
         </w:r>
@@ -9266,12 +9335,12 @@
       <w:pPr>
         <w:pStyle w:val="Heading3"/>
       </w:pPr>
-      <w:bookmarkStart w:id="198" w:name="_Toc223944500"/>
-      <w:bookmarkStart w:id="199" w:name="sensitivity-analyses"/>
+      <w:bookmarkStart w:id="205" w:name="_Toc223944500"/>
+      <w:bookmarkStart w:id="206" w:name="sensitivity-analyses"/>
       <w:r>
         <w:t>5.10.1 Sensitivity analyses</w:t>
       </w:r>
-      <w:bookmarkEnd w:id="198"/>
+      <w:bookmarkEnd w:id="205"/>
     </w:p>
     <w:p>
       <w:pPr>
@@ -9296,12 +9365,12 @@
       <w:pPr>
         <w:pStyle w:val="Heading4"/>
       </w:pPr>
-      <w:bookmarkStart w:id="200" w:name="_Toc223944501"/>
-      <w:bookmarkStart w:id="201" w:name="X22dda602ebb4652e0fd291705062d91648ada05"/>
+      <w:bookmarkStart w:id="207" w:name="_Toc223944501"/>
+      <w:bookmarkStart w:id="208" w:name="X22dda602ebb4652e0fd291705062d91648ada05"/>
       <w:r>
         <w:t>5.10.1.1 Models with autoregressive within-cluster correlation</w:t>
       </w:r>
-      <w:bookmarkEnd w:id="200"/>
+      <w:bookmarkEnd w:id="207"/>
     </w:p>
     <w:p>
       <w:pPr>
@@ -9334,7 +9403,7 @@
         <w:t>. This parameterisation assumes that correlations between cluster-level random effects decay geometrically with increasing temporal separation between periods.</w:t>
       </w:r>
     </w:p>
-    <w:bookmarkStart w:id="202" w:name="eq-ar1"/>
+    <w:bookmarkStart w:id="209" w:name="eq-ar1"/>
     <w:p>
       <w:pPr>
         <w:pStyle w:val="BodyText"/>
@@ -9631,7 +9700,7 @@
           </m:d>
         </m:oMath>
       </m:oMathPara>
-      <w:bookmarkEnd w:id="202"/>
+      <w:bookmarkEnd w:id="209"/>
     </w:p>
     <w:p>
       <w:pPr>
@@ -9810,35 +9879,35 @@
       <w:pPr>
         <w:pStyle w:val="Heading4"/>
       </w:pPr>
-      <w:bookmarkStart w:id="203" w:name="_Toc223944502"/>
-      <w:bookmarkStart w:id="204" w:name="X265de50a776706f6d9ec7b4549b866a94e548a1"/>
-      <w:bookmarkEnd w:id="201"/>
+      <w:bookmarkStart w:id="210" w:name="_Toc223944502"/>
+      <w:bookmarkStart w:id="211" w:name="X265de50a776706f6d9ec7b4549b866a94e548a1"/>
+      <w:bookmarkEnd w:id="208"/>
       <w:r>
         <w:t xml:space="preserve">5.10.1.2 Models with batch-specific secular </w:t>
       </w:r>
-      <w:commentRangeStart w:id="205"/>
-      <w:commentRangeStart w:id="206"/>
+      <w:commentRangeStart w:id="212"/>
+      <w:commentRangeStart w:id="213"/>
       <w:r>
         <w:t>trends</w:t>
       </w:r>
-      <w:bookmarkEnd w:id="203"/>
-      <w:commentRangeEnd w:id="205"/>
+      <w:bookmarkEnd w:id="210"/>
+      <w:commentRangeEnd w:id="212"/>
       <w:r>
         <w:rPr>
           <w:rStyle w:val="CommentReference"/>
           <w:sz w:val="24"/>
           <w:szCs w:val="24"/>
         </w:rPr>
-        <w:commentReference w:id="205"/>
-      </w:r>
-      <w:commentRangeEnd w:id="206"/>
+        <w:commentReference w:id="212"/>
+      </w:r>
+      <w:commentRangeEnd w:id="213"/>
       <w:r>
         <w:rPr>
           <w:rStyle w:val="CommentReference"/>
           <w:sz w:val="24"/>
           <w:szCs w:val="24"/>
         </w:rPr>
-        <w:commentReference w:id="206"/>
+        <w:commentReference w:id="213"/>
       </w:r>
     </w:p>
     <w:p>
@@ -9864,7 +9933,7 @@
       <w:pPr>
         <w:pStyle w:val="BodyText"/>
       </w:pPr>
-      <w:bookmarkStart w:id="207" w:name="eq-model-batch-trend"/>
+      <w:bookmarkStart w:id="214" w:name="eq-model-batch-trend"/>
       <m:oMathPara>
         <m:oMathParaPr>
           <m:jc m:val="center"/>
@@ -10152,7 +10221,7 @@
           </m:d>
         </m:oMath>
       </m:oMathPara>
-      <w:bookmarkEnd w:id="207"/>
+      <w:bookmarkEnd w:id="214"/>
     </w:p>
     <w:p>
       <w:pPr>
@@ -10218,13 +10287,13 @@
       <w:pPr>
         <w:pStyle w:val="Heading4"/>
       </w:pPr>
-      <w:bookmarkStart w:id="208" w:name="_Toc223944503"/>
-      <w:bookmarkStart w:id="209" w:name="X831bc7e780a434f5c3512e5d33d43284b7d37ce"/>
-      <w:bookmarkEnd w:id="204"/>
+      <w:bookmarkStart w:id="215" w:name="_Toc223944503"/>
+      <w:bookmarkStart w:id="216" w:name="X831bc7e780a434f5c3512e5d33d43284b7d37ce"/>
+      <w:bookmarkEnd w:id="211"/>
       <w:r>
         <w:t>5.10.1.3 Models with random cluster by intervention effects</w:t>
       </w:r>
-      <w:bookmarkEnd w:id="208"/>
+      <w:bookmarkEnd w:id="215"/>
     </w:p>
     <w:p>
       <w:pPr>
@@ -10249,7 +10318,7 @@
       <w:pPr>
         <w:pStyle w:val="BodyText"/>
       </w:pPr>
-      <w:bookmarkStart w:id="210" w:name="eq-model-random-cluster-intervention"/>
+      <w:bookmarkStart w:id="217" w:name="eq-model-random-cluster-intervention"/>
       <m:oMathPara>
         <m:oMathParaPr>
           <m:jc m:val="center"/>
@@ -10562,7 +10631,7 @@
           </m:d>
         </m:oMath>
       </m:oMathPara>
-      <w:bookmarkEnd w:id="210"/>
+      <w:bookmarkEnd w:id="217"/>
     </w:p>
     <w:p>
       <w:pPr>
@@ -10792,35 +10861,35 @@
       <w:pPr>
         <w:pStyle w:val="Heading4"/>
       </w:pPr>
-      <w:bookmarkStart w:id="211" w:name="_Toc223944504"/>
-      <w:bookmarkStart w:id="212" w:name="X0324ad02af1274e3e5fe3c1dbe99d3dad84fc47"/>
-      <w:bookmarkEnd w:id="209"/>
+      <w:bookmarkStart w:id="218" w:name="_Toc223944504"/>
+      <w:bookmarkStart w:id="219" w:name="X0324ad02af1274e3e5fe3c1dbe99d3dad84fc47"/>
+      <w:bookmarkEnd w:id="216"/>
       <w:r>
         <w:t xml:space="preserve">5.10.1.4 Models with correlated random cluster-by-intervention </w:t>
       </w:r>
-      <w:commentRangeStart w:id="213"/>
-      <w:commentRangeStart w:id="214"/>
+      <w:commentRangeStart w:id="220"/>
+      <w:commentRangeStart w:id="221"/>
       <w:r>
         <w:t>effects</w:t>
       </w:r>
-      <w:bookmarkEnd w:id="211"/>
-      <w:commentRangeEnd w:id="213"/>
+      <w:bookmarkEnd w:id="218"/>
+      <w:commentRangeEnd w:id="220"/>
       <w:r>
         <w:rPr>
           <w:rStyle w:val="CommentReference"/>
           <w:sz w:val="24"/>
           <w:szCs w:val="24"/>
         </w:rPr>
-        <w:commentReference w:id="213"/>
-      </w:r>
-      <w:commentRangeEnd w:id="214"/>
+        <w:commentReference w:id="220"/>
+      </w:r>
+      <w:commentRangeEnd w:id="221"/>
       <w:r>
         <w:rPr>
           <w:rStyle w:val="CommentReference"/>
           <w:sz w:val="24"/>
           <w:szCs w:val="24"/>
         </w:rPr>
-        <w:commentReference w:id="214"/>
+        <w:commentReference w:id="221"/>
       </w:r>
     </w:p>
     <w:p>
@@ -10936,7 +11005,7 @@
       <w:pPr>
         <w:pStyle w:val="BodyText"/>
       </w:pPr>
-      <w:bookmarkStart w:id="215" w:name="eq-model-correlated-random-effects"/>
+      <w:bookmarkStart w:id="222" w:name="eq-model-correlated-random-effects"/>
       <m:oMathPara>
         <m:oMathParaPr>
           <m:jc m:val="center"/>
@@ -11249,7 +11318,7 @@
           </m:d>
         </m:oMath>
       </m:oMathPara>
-      <w:bookmarkEnd w:id="215"/>
+      <w:bookmarkEnd w:id="222"/>
     </w:p>
     <w:p>
       <w:pPr>
@@ -11806,13 +11875,13 @@
       <w:pPr>
         <w:pStyle w:val="Heading4"/>
       </w:pPr>
-      <w:bookmarkStart w:id="216" w:name="_Toc223944505"/>
-      <w:bookmarkStart w:id="217" w:name="Xb7b1d3ff7c24f0b8dca2081a41dd1947ef59e07"/>
-      <w:bookmarkEnd w:id="212"/>
+      <w:bookmarkStart w:id="223" w:name="_Toc223944505"/>
+      <w:bookmarkStart w:id="224" w:name="Xb7b1d3ff7c24f0b8dca2081a41dd1947ef59e07"/>
+      <w:bookmarkEnd w:id="219"/>
       <w:r>
         <w:t>5.10.1.5 Models with time modelled with a spline function</w:t>
       </w:r>
-      <w:bookmarkEnd w:id="216"/>
+      <w:bookmarkEnd w:id="223"/>
     </w:p>
     <w:p>
       <w:pPr>
@@ -11846,7 +11915,7 @@
       <w:pPr>
         <w:pStyle w:val="BodyText"/>
       </w:pPr>
-      <w:bookmarkStart w:id="218" w:name="eq-spline-model"/>
+      <w:bookmarkStart w:id="225" w:name="eq-spline-model"/>
       <m:oMathPara>
         <m:oMathParaPr>
           <m:jc m:val="center"/>
@@ -12240,7 +12309,7 @@
           </m:d>
         </m:oMath>
       </m:oMathPara>
-      <w:bookmarkEnd w:id="218"/>
+      <w:bookmarkEnd w:id="225"/>
     </w:p>
     <w:p>
       <w:pPr>
@@ -12445,14 +12514,14 @@
       <w:pPr>
         <w:pStyle w:val="Heading4"/>
       </w:pPr>
-      <w:bookmarkStart w:id="219" w:name="_Toc223944506"/>
-      <w:bookmarkStart w:id="220" w:name="models-exploring-lag-and-weaning-effects"/>
-      <w:bookmarkEnd w:id="217"/>
+      <w:bookmarkStart w:id="226" w:name="_Toc223944506"/>
+      <w:bookmarkStart w:id="227" w:name="models-exploring-lag-and-weaning-effects"/>
+      <w:bookmarkEnd w:id="224"/>
       <w:r>
         <w:lastRenderedPageBreak/>
         <w:t>5.10.1.6 Models exploring lag and weaning effects</w:t>
       </w:r>
-      <w:bookmarkEnd w:id="219"/>
+      <w:bookmarkEnd w:id="226"/>
     </w:p>
     <w:p>
       <w:pPr>
@@ -12477,7 +12546,7 @@
       <w:pPr>
         <w:pStyle w:val="BodyText"/>
       </w:pPr>
-      <w:bookmarkStart w:id="221" w:name="eq-lag-weaning-model"/>
+      <w:bookmarkStart w:id="228" w:name="eq-lag-weaning-model"/>
       <m:oMathPara>
         <m:oMathParaPr>
           <m:jc m:val="center"/>
@@ -12824,7 +12893,7 @@
           </m:d>
         </m:oMath>
       </m:oMathPara>
-      <w:bookmarkEnd w:id="221"/>
+      <w:bookmarkEnd w:id="228"/>
     </w:p>
     <w:p>
       <w:pPr>
@@ -12898,14 +12967,14 @@
       <w:pPr>
         <w:pStyle w:val="Heading3"/>
       </w:pPr>
-      <w:bookmarkStart w:id="222" w:name="_Toc223944507"/>
-      <w:bookmarkStart w:id="223" w:name="adjusted-analyses"/>
-      <w:bookmarkEnd w:id="199"/>
-      <w:bookmarkEnd w:id="220"/>
+      <w:bookmarkStart w:id="229" w:name="_Toc223944507"/>
+      <w:bookmarkStart w:id="230" w:name="adjusted-analyses"/>
+      <w:bookmarkEnd w:id="206"/>
+      <w:bookmarkEnd w:id="227"/>
       <w:r>
         <w:t>5.10.2 Adjusted analyses</w:t>
       </w:r>
-      <w:bookmarkEnd w:id="222"/>
+      <w:bookmarkEnd w:id="229"/>
     </w:p>
     <w:p>
       <w:pPr>
@@ -13010,30 +13079,30 @@
       <w:pPr>
         <w:pStyle w:val="Heading3"/>
         <w:rPr>
-          <w:ins w:id="224" w:author="Anna Olofsson" w:date="2026-04-10T11:12:00Z" w16du:dateUtc="2026-04-10T09:12:00Z"/>
-        </w:rPr>
-      </w:pPr>
-      <w:bookmarkStart w:id="225" w:name="_Toc223944508"/>
-      <w:bookmarkStart w:id="226" w:name="subgroup-analyses"/>
-      <w:bookmarkEnd w:id="223"/>
+          <w:ins w:id="231" w:author="Anna Olofsson" w:date="2026-04-10T11:12:00Z" w16du:dateUtc="2026-04-10T09:12:00Z"/>
+        </w:rPr>
+      </w:pPr>
+      <w:bookmarkStart w:id="232" w:name="_Toc223944508"/>
+      <w:bookmarkStart w:id="233" w:name="subgroup-analyses"/>
+      <w:bookmarkEnd w:id="230"/>
       <w:r>
         <w:t>5.10.3 Subgroup analyses</w:t>
       </w:r>
-      <w:bookmarkEnd w:id="225"/>
+      <w:bookmarkEnd w:id="232"/>
     </w:p>
     <w:p>
       <w:pPr>
         <w:pStyle w:val="BodyText"/>
         <w:rPr>
-          <w:del w:id="227" w:author="Anna Olofsson" w:date="2026-04-10T11:12:00Z" w16du:dateUtc="2026-04-10T09:12:00Z"/>
-        </w:rPr>
-        <w:pPrChange w:id="228" w:author="Anna Olofsson" w:date="2026-04-10T11:12:00Z" w16du:dateUtc="2026-04-10T09:12:00Z">
+          <w:del w:id="234" w:author="Anna Olofsson" w:date="2026-04-10T11:12:00Z" w16du:dateUtc="2026-04-10T09:12:00Z"/>
+        </w:rPr>
+        <w:pPrChange w:id="235" w:author="Anna Olofsson" w:date="2026-04-10T11:12:00Z" w16du:dateUtc="2026-04-10T09:12:00Z">
           <w:pPr>
             <w:pStyle w:val="Heading3"/>
           </w:pPr>
         </w:pPrChange>
       </w:pPr>
-      <w:ins w:id="229" w:author="Anna Olofsson" w:date="2026-04-10T11:12:00Z">
+      <w:ins w:id="236" w:author="Anna Olofsson" w:date="2026-04-10T11:12:00Z">
         <w:r>
           <w:t>Prespecified subgroup analyses will be conducted for the primary outcome only.</w:t>
         </w:r>
@@ -13042,7 +13111,7 @@
     <w:p>
       <w:pPr>
         <w:pStyle w:val="BodyText"/>
-        <w:pPrChange w:id="230" w:author="Anna Olofsson" w:date="2026-04-10T11:12:00Z" w16du:dateUtc="2026-04-10T09:12:00Z">
+        <w:pPrChange w:id="237" w:author="Anna Olofsson" w:date="2026-04-10T11:12:00Z" w16du:dateUtc="2026-04-10T09:12:00Z">
           <w:pPr>
             <w:pStyle w:val="FirstParagraph"/>
           </w:pPr>
@@ -13063,43 +13132,43 @@
       <w:r>
         <w:t xml:space="preserve">geographical region, defined using the state in which the </w:t>
       </w:r>
-      <w:commentRangeStart w:id="231"/>
-      <w:commentRangeStart w:id="232"/>
+      <w:commentRangeStart w:id="238"/>
+      <w:commentRangeStart w:id="239"/>
       <w:r>
         <w:t>participating</w:t>
       </w:r>
-      <w:commentRangeEnd w:id="231"/>
+      <w:commentRangeEnd w:id="238"/>
       <w:r>
         <w:rPr>
           <w:rStyle w:val="CommentReference"/>
           <w:sz w:val="24"/>
           <w:szCs w:val="24"/>
         </w:rPr>
-        <w:commentReference w:id="231"/>
-      </w:r>
-      <w:commentRangeEnd w:id="232"/>
+        <w:commentReference w:id="238"/>
+      </w:r>
+      <w:commentRangeEnd w:id="239"/>
       <w:r>
         <w:rPr>
           <w:rStyle w:val="CommentReference"/>
           <w:sz w:val="24"/>
           <w:szCs w:val="24"/>
         </w:rPr>
-        <w:commentReference w:id="232"/>
+        <w:commentReference w:id="239"/>
       </w:r>
       <w:r>
         <w:t xml:space="preserve"> hospital is located</w:t>
       </w:r>
-      <w:ins w:id="233" w:author="Anna Olofsson" w:date="2026-04-10T10:35:00Z" w16du:dateUtc="2026-04-10T08:35:00Z">
+      <w:ins w:id="240" w:author="Anna Olofsson" w:date="2026-04-10T10:35:00Z" w16du:dateUtc="2026-04-10T08:35:00Z">
         <w:r>
           <w:t xml:space="preserve">. </w:t>
         </w:r>
       </w:ins>
-      <w:ins w:id="234" w:author="Anna Olofsson" w:date="2026-04-10T10:35:00Z">
+      <w:ins w:id="241" w:author="Anna Olofsson" w:date="2026-04-10T10:35:00Z">
         <w:r>
           <w:t>Region will be defined according to the official state in which the cluster is located. The number of states represented will depend on the final set of participating clusters.</w:t>
         </w:r>
       </w:ins>
-      <w:del w:id="235" w:author="Anna Olofsson" w:date="2026-04-10T10:35:00Z" w16du:dateUtc="2026-04-10T08:35:00Z">
+      <w:del w:id="242" w:author="Anna Olofsson" w:date="2026-04-10T10:35:00Z" w16du:dateUtc="2026-04-10T08:35:00Z">
         <w:r>
           <w:delText>;</w:delText>
         </w:r>
@@ -13147,18 +13216,18 @@
       <w:r>
         <w:t xml:space="preserve">clinical cohorts, defined as blunt multisystem </w:t>
       </w:r>
-      <w:commentRangeStart w:id="236"/>
+      <w:commentRangeStart w:id="243"/>
       <w:r>
         <w:t>trauma</w:t>
       </w:r>
-      <w:commentRangeEnd w:id="236"/>
+      <w:commentRangeEnd w:id="243"/>
       <w:r>
         <w:rPr>
           <w:rStyle w:val="CommentReference"/>
           <w:sz w:val="24"/>
           <w:szCs w:val="24"/>
         </w:rPr>
-        <w:commentReference w:id="236"/>
+        <w:commentReference w:id="243"/>
       </w:r>
       <w:r>
         <w:t>, penetrating trauma, and severe isolated traumatic brain injury, with modification to avoid overlap between the cohorts</w:t>
@@ -13193,40 +13262,40 @@
           <w:numId w:val="16"/>
         </w:numPr>
       </w:pPr>
-      <w:del w:id="237" w:author="Anna Olofsson" w:date="2026-04-10T10:38:00Z" w16du:dateUtc="2026-04-10T08:38:00Z">
+      <w:del w:id="244" w:author="Anna Olofsson" w:date="2026-04-10T10:38:00Z" w16du:dateUtc="2026-04-10T08:38:00Z">
         <w:r>
           <w:delText>c</w:delText>
         </w:r>
       </w:del>
-      <w:del w:id="238" w:author="Anna Olofsson" w:date="2026-04-10T10:37:00Z" w16du:dateUtc="2026-04-10T08:37:00Z">
+      <w:del w:id="245" w:author="Anna Olofsson" w:date="2026-04-10T10:37:00Z" w16du:dateUtc="2026-04-10T08:37:00Z">
         <w:r>
           <w:delText xml:space="preserve">luster size (number of patients per </w:delText>
         </w:r>
-        <w:commentRangeStart w:id="239"/>
+        <w:commentRangeStart w:id="246"/>
         <w:r>
           <w:delText>hospital</w:delText>
         </w:r>
       </w:del>
-      <w:commentRangeEnd w:id="239"/>
+      <w:commentRangeEnd w:id="246"/>
       <w:r>
         <w:rPr>
           <w:rStyle w:val="CommentReference"/>
           <w:sz w:val="24"/>
           <w:szCs w:val="24"/>
         </w:rPr>
-        <w:commentReference w:id="239"/>
-      </w:r>
-      <w:del w:id="240" w:author="Anna Olofsson" w:date="2026-04-10T10:37:00Z" w16du:dateUtc="2026-04-10T08:37:00Z">
+        <w:commentReference w:id="246"/>
+      </w:r>
+      <w:del w:id="247" w:author="Anna Olofsson" w:date="2026-04-10T10:37:00Z" w16du:dateUtc="2026-04-10T08:37:00Z">
         <w:r>
           <w:delText>)</w:delText>
         </w:r>
       </w:del>
-      <w:ins w:id="241" w:author="Anna Olofsson" w:date="2026-04-10T10:38:00Z" w16du:dateUtc="2026-04-10T08:38:00Z">
+      <w:ins w:id="248" w:author="Anna Olofsson" w:date="2026-04-10T10:38:00Z" w16du:dateUtc="2026-04-10T08:38:00Z">
         <w:r>
           <w:t xml:space="preserve"> </w:t>
         </w:r>
       </w:ins>
-      <w:ins w:id="242" w:author="Anna Olofsson" w:date="2026-04-10T10:38:00Z">
+      <w:ins w:id="249" w:author="Anna Olofsson" w:date="2026-04-10T10:38:00Z">
         <w:r>
           <w:t>the randomized cluster corresponds to the participating hospital. Cluster size will be defined as the number of patients included per hospital and categorized as small (≤12 patients), medium (13–20 patients), or large (&gt;20 patients).</w:t>
         </w:r>
@@ -13250,15 +13319,15 @@
       <w:r>
         <w:t>.</w:t>
       </w:r>
-      <w:ins w:id="243" w:author="Anna Olofsson" w:date="2026-04-15T11:45:00Z" w16du:dateUtc="2026-04-15T09:45:00Z">
+      <w:ins w:id="250" w:author="Anna Olofsson" w:date="2026-04-15T11:45:00Z" w16du:dateUtc="2026-04-15T09:45:00Z">
         <w:r>
           <w:t xml:space="preserve"> </w:t>
         </w:r>
       </w:ins>
-      <w:ins w:id="244" w:author="Anna Olofsson" w:date="2026-04-15T11:46:00Z">
+      <w:ins w:id="251" w:author="Anna Olofsson" w:date="2026-04-15T11:46:00Z">
         <w:r>
           <w:rPr>
-            <w:rPrChange w:id="245" w:author="Anna Olofsson" w:date="2026-04-15T11:46:00Z" w16du:dateUtc="2026-04-15T09:46:00Z">
+            <w:rPrChange w:id="252" w:author="Anna Olofsson" w:date="2026-04-15T11:46:00Z" w16du:dateUtc="2026-04-15T09:46:00Z">
               <w:rPr>
                 <w:b/>
                 <w:bCs/>
@@ -13273,22 +13342,22 @@
       <w:pPr>
         <w:pStyle w:val="Heading3"/>
       </w:pPr>
-      <w:bookmarkStart w:id="246" w:name="_Toc223944509"/>
-      <w:bookmarkStart w:id="247" w:name="treatment-of-missing-data"/>
-      <w:bookmarkEnd w:id="226"/>
+      <w:bookmarkStart w:id="253" w:name="_Toc223944509"/>
+      <w:bookmarkStart w:id="254" w:name="treatment-of-missing-data"/>
+      <w:bookmarkEnd w:id="233"/>
       <w:r>
         <w:t>5.10.4 Treatment of missing data</w:t>
       </w:r>
-      <w:bookmarkEnd w:id="246"/>
+      <w:bookmarkEnd w:id="253"/>
     </w:p>
     <w:p>
       <w:pPr>
         <w:pStyle w:val="FirstParagraph"/>
         <w:rPr>
-          <w:del w:id="248" w:author="Anna Olofsson" w:date="2026-04-10T11:19:00Z" w16du:dateUtc="2026-04-10T09:19:00Z"/>
-        </w:rPr>
-      </w:pPr>
-      <w:del w:id="249" w:author="Anna Olofsson" w:date="2026-04-10T11:19:00Z" w16du:dateUtc="2026-04-10T09:19:00Z">
+          <w:del w:id="255" w:author="Anna Olofsson" w:date="2026-04-10T11:19:00Z" w16du:dateUtc="2026-04-10T09:19:00Z"/>
+        </w:rPr>
+      </w:pPr>
+      <w:del w:id="256" w:author="Anna Olofsson" w:date="2026-04-10T11:19:00Z" w16du:dateUtc="2026-04-10T09:19:00Z">
         <w:r>
           <w:delText>We will present the frequency and percentage of missing data for all variables. If the percentage of missing data for the primary outcome is less than 10%, we will perform a complete case analysis. If the percentage of missing data for the primary outcome is 10% or more, we will handle missing data depending on the missing data mechanism. If the data are missing at random (MAR), we will perform multiple imputation using multiple imputation by chained equations (MICE), imputing data for the primary outcome as well as all covariates included in the fully adjusted model. The number of imputations will be determined by the percentage of missing data, with a minimum of 20 imputations. If there is evidence that the data are missing not at random (MNAR), we will explore the impact of this assumption using a sensitivity analysis (e.g., pattern mixture models or selection models) to assess how robust our findings are to different assumptions about the missing data mechanism. Evidence that data are MNAR may include systematic differences in missingness across observed covariates, patterns suggestive of non-random dropout, or clinical expectations that missingness is related to unmeasured outcomes. Additionally, we will perform diagnostic checks after multiple imputation to ensure the quality of the imputation process, including comparing distributions of observed and imputed data and checking convergence.</w:delText>
         </w:r>
@@ -13298,18 +13367,18 @@
       <w:pPr>
         <w:pStyle w:val="Heading2"/>
         <w:rPr>
-          <w:ins w:id="250" w:author="Anna Olofsson" w:date="2026-04-10T11:39:00Z" w16du:dateUtc="2026-04-10T09:39:00Z"/>
+          <w:ins w:id="257" w:author="Anna Olofsson" w:date="2026-04-10T11:39:00Z" w16du:dateUtc="2026-04-10T09:39:00Z"/>
           <w:rFonts w:asciiTheme="minorHAnsi" w:hAnsiTheme="minorHAnsi"/>
           <w:sz w:val="24"/>
           <w:szCs w:val="24"/>
         </w:rPr>
       </w:pPr>
-      <w:bookmarkStart w:id="251" w:name="_Toc223944510"/>
-      <w:bookmarkStart w:id="252" w:name="analysis-of-secondary-outcomes"/>
-      <w:bookmarkEnd w:id="170"/>
-      <w:bookmarkEnd w:id="247"/>
-      <w:commentRangeStart w:id="253"/>
-      <w:ins w:id="254" w:author="Anna Olofsson" w:date="2026-04-10T11:39:00Z">
+      <w:bookmarkStart w:id="258" w:name="_Toc223944510"/>
+      <w:bookmarkStart w:id="259" w:name="analysis-of-secondary-outcomes"/>
+      <w:bookmarkEnd w:id="177"/>
+      <w:bookmarkEnd w:id="254"/>
+      <w:commentRangeStart w:id="260"/>
+      <w:ins w:id="261" w:author="Anna Olofsson" w:date="2026-04-10T11:39:00Z">
         <w:r>
           <w:rPr>
             <w:rFonts w:asciiTheme="minorHAnsi" w:hAnsiTheme="minorHAnsi"/>
@@ -13320,13 +13389,13 @@
           <w:t xml:space="preserve">We will present the frequency and percentage of missing data for all variables. We anticipate less than 1% missingness for the primary outcome. The primary analysis will therefore be based on all available primary outcome data. Some patient-level covariates used in adjusted analyses, including vital parameters, may have higher levels of missingness. Adjusted analyses will therefore be conducted as complete-case analyses with respect to the covariates included in the adjusted model. To allow comparison of the intervention effect before and after covariate adjustment, the corresponding unadjusted analysis will also be repeated in the same complete-case population. If missingness in patient-level covariates is considered substantial in light of the extent and pattern of missing data, multiple imputation will be considered as a sensitivity analysis under a missing at random assumption. If multiple imputation is used, imputations will be generated using multiple imputation by chained equations (MICE), including all variables in the fully adjusted model. </w:t>
         </w:r>
       </w:ins>
-      <w:ins w:id="255" w:author="Anna Olofsson" w:date="2026-04-15T12:00:00Z">
+      <w:ins w:id="262" w:author="Anna Olofsson" w:date="2026-04-15T12:00:00Z">
         <w:r>
           <w:rPr>
             <w:rFonts w:asciiTheme="minorHAnsi" w:hAnsiTheme="minorHAnsi"/>
             <w:sz w:val="24"/>
             <w:szCs w:val="24"/>
-            <w:rPrChange w:id="256" w:author="Anna Olofsson" w:date="2026-04-15T12:00:00Z" w16du:dateUtc="2026-04-15T10:00:00Z">
+            <w:rPrChange w:id="263" w:author="Anna Olofsson" w:date="2026-04-15T12:00:00Z" w16du:dateUtc="2026-04-15T10:00:00Z">
               <w:rPr>
                 <w:rFonts w:asciiTheme="minorHAnsi" w:hAnsiTheme="minorHAnsi"/>
                 <w:b/>
@@ -13339,7 +13408,7 @@
           <w:t>The imputation model will be specified to reflect the hierarchical structure of the data, including clustering at hospital level and relevant trial design variables such as period and intervention exposure.</w:t>
         </w:r>
       </w:ins>
-      <w:ins w:id="257" w:author="Anna Olofsson" w:date="2026-04-15T12:00:00Z" w16du:dateUtc="2026-04-15T10:00:00Z">
+      <w:ins w:id="264" w:author="Anna Olofsson" w:date="2026-04-15T12:00:00Z" w16du:dateUtc="2026-04-15T10:00:00Z">
         <w:r>
           <w:rPr>
             <w:rFonts w:asciiTheme="minorHAnsi" w:hAnsiTheme="minorHAnsi"/>
@@ -13351,7 +13420,7 @@
           <w:t xml:space="preserve"> </w:t>
         </w:r>
       </w:ins>
-      <w:ins w:id="258" w:author="Anna Olofsson" w:date="2026-04-10T11:39:00Z">
+      <w:ins w:id="265" w:author="Anna Olofsson" w:date="2026-04-10T11:39:00Z">
         <w:r>
           <w:rPr>
             <w:rFonts w:asciiTheme="minorHAnsi" w:hAnsiTheme="minorHAnsi"/>
@@ -13361,7 +13430,7 @@
           <w:t>The number of imputations will be chosen with reference to the extent of missing data, with a minimum of 20 imputations. If there is evidence that data may be missing not at random, we will explore the impact of this assumption in sensitivity analyses. Diagnostic checks will be performed to assess the quality of the imputation process, including comparison of observed and imputed data distributions and assessment of convergence.</w:t>
         </w:r>
       </w:ins>
-      <w:commentRangeEnd w:id="253"/>
+      <w:commentRangeEnd w:id="260"/>
       <w:r>
         <w:rPr>
           <w:rStyle w:val="CommentReference"/>
@@ -13369,7 +13438,7 @@
           <w:sz w:val="24"/>
           <w:szCs w:val="24"/>
         </w:rPr>
-        <w:commentReference w:id="253"/>
+        <w:commentReference w:id="260"/>
       </w:r>
     </w:p>
     <w:p>
@@ -13379,13 +13448,13 @@
       <w:r>
         <w:t>5.11 Analysis of secondary outcomes</w:t>
       </w:r>
-      <w:bookmarkEnd w:id="251"/>
+      <w:bookmarkEnd w:id="258"/>
     </w:p>
     <w:p>
       <w:pPr>
         <w:pStyle w:val="FirstParagraph"/>
         <w:rPr>
-          <w:ins w:id="259" w:author="Anna Olofsson" w:date="2026-04-15T12:22:00Z" w16du:dateUtc="2026-04-15T10:22:00Z"/>
+          <w:ins w:id="266" w:author="Anna Olofsson" w:date="2026-04-15T12:22:00Z" w16du:dateUtc="2026-04-15T10:22:00Z"/>
         </w:rPr>
       </w:pPr>
       <w:r>
@@ -13396,15 +13465,15 @@
       <w:pPr>
         <w:pStyle w:val="BodyText"/>
         <w:rPr>
-          <w:ins w:id="260" w:author="Anna Olofsson" w:date="2026-04-10T12:11:00Z" w16du:dateUtc="2026-04-10T10:11:00Z"/>
-        </w:rPr>
-        <w:pPrChange w:id="261" w:author="Anna Olofsson" w:date="2026-04-15T12:22:00Z" w16du:dateUtc="2026-04-15T10:22:00Z">
+          <w:ins w:id="267" w:author="Anna Olofsson" w:date="2026-04-10T12:11:00Z" w16du:dateUtc="2026-04-10T10:11:00Z"/>
+        </w:rPr>
+        <w:pPrChange w:id="268" w:author="Anna Olofsson" w:date="2026-04-15T12:22:00Z" w16du:dateUtc="2026-04-15T10:22:00Z">
           <w:pPr>
             <w:pStyle w:val="FirstParagraph"/>
           </w:pPr>
         </w:pPrChange>
       </w:pPr>
-      <w:ins w:id="262" w:author="Anna Olofsson" w:date="2026-04-15T12:22:00Z">
+      <w:ins w:id="269" w:author="Anna Olofsson" w:date="2026-04-15T12:22:00Z">
         <w:r>
           <w:t>The planned mixed-effects models account for clustering at hospital level and provide cluster-specific estimates of the intervention effect. Link functions and effect measures will be selected according to outcome type, as described below for each secondary outcome.</w:t>
         </w:r>
@@ -13414,25 +13483,25 @@
       <w:pPr>
         <w:pStyle w:val="BodyText"/>
         <w:rPr>
-          <w:ins w:id="263" w:author="Anna Olofsson" w:date="2026-04-10T12:05:00Z" w16du:dateUtc="2026-04-10T10:05:00Z"/>
-        </w:rPr>
-        <w:pPrChange w:id="264" w:author="Anna Olofsson" w:date="2026-04-10T12:11:00Z" w16du:dateUtc="2026-04-10T10:11:00Z">
+          <w:ins w:id="270" w:author="Anna Olofsson" w:date="2026-04-10T12:05:00Z" w16du:dateUtc="2026-04-10T10:05:00Z"/>
+        </w:rPr>
+        <w:pPrChange w:id="271" w:author="Anna Olofsson" w:date="2026-04-10T12:11:00Z" w16du:dateUtc="2026-04-10T10:11:00Z">
           <w:pPr>
             <w:pStyle w:val="FirstParagraph"/>
           </w:pPr>
         </w:pPrChange>
       </w:pPr>
-      <w:ins w:id="265" w:author="Anna Olofsson" w:date="2026-04-10T12:11:00Z">
+      <w:ins w:id="272" w:author="Anna Olofsson" w:date="2026-04-10T12:11:00Z">
         <w:r>
           <w:t>Binary outcomes will be summarised as proportions; continuous outcomes as means and standard deviations, or medians and interquartile ranges where appropriate; ordinal outcomes by category; and adherence as a proportion. Effect measures will be selected to match the outcome scale and model, as described below for each outcome.</w:t>
         </w:r>
       </w:ins>
-      <w:ins w:id="266" w:author="Anna Olofsson" w:date="2026-04-15T12:35:00Z" w16du:dateUtc="2026-04-15T10:35:00Z">
+      <w:ins w:id="273" w:author="Anna Olofsson" w:date="2026-04-15T12:35:00Z" w16du:dateUtc="2026-04-15T10:35:00Z">
         <w:r>
           <w:t xml:space="preserve"> </w:t>
         </w:r>
       </w:ins>
-      <w:ins w:id="267" w:author="Anna Olofsson" w:date="2026-04-15T12:35:00Z">
+      <w:ins w:id="274" w:author="Anna Olofsson" w:date="2026-04-15T12:35:00Z">
         <w:r>
           <w:t>These summaries will be presented by intervention group. Missing outcome data will be reported for each outcome</w:t>
         </w:r>
@@ -13440,10 +13509,10 @@
           <w:t xml:space="preserve">. </w:t>
         </w:r>
       </w:ins>
-      <w:ins w:id="268" w:author="Anna Olofsson" w:date="2026-04-15T12:36:00Z">
+      <w:ins w:id="275" w:author="Anna Olofsson" w:date="2026-04-15T12:36:00Z">
         <w:r>
           <w:rPr>
-            <w:rPrChange w:id="269" w:author="Anna Olofsson" w:date="2026-04-15T12:36:00Z" w16du:dateUtc="2026-04-15T10:36:00Z">
+            <w:rPrChange w:id="276" w:author="Anna Olofsson" w:date="2026-04-15T12:36:00Z" w16du:dateUtc="2026-04-15T10:36:00Z">
               <w:rPr>
                 <w:b/>
                 <w:bCs/>
@@ -13458,20 +13527,20 @@
       <w:pPr>
         <w:pStyle w:val="BodyText"/>
         <w:rPr>
-          <w:ins w:id="270" w:author="Anna Olofsson" w:date="2026-04-10T12:13:00Z" w16du:dateUtc="2026-04-10T10:13:00Z"/>
-        </w:rPr>
-      </w:pPr>
-      <w:ins w:id="271" w:author="Anna Olofsson" w:date="2026-04-10T11:00:00Z">
+          <w:ins w:id="277" w:author="Anna Olofsson" w:date="2026-04-10T12:13:00Z" w16du:dateUtc="2026-04-10T10:13:00Z"/>
+        </w:rPr>
+      </w:pPr>
+      <w:ins w:id="278" w:author="Anna Olofsson" w:date="2026-04-10T11:00:00Z">
         <w:r>
           <w:t xml:space="preserve">Three secondary outcomes, namely adherence to </w:t>
         </w:r>
       </w:ins>
-      <w:ins w:id="272" w:author="Anna Olofsson" w:date="2026-04-10T12:11:00Z">
+      <w:ins w:id="279" w:author="Anna Olofsson" w:date="2026-04-10T12:11:00Z">
         <w:r>
           <w:t>ATLS®</w:t>
         </w:r>
       </w:ins>
-      <w:ins w:id="273" w:author="Anna Olofsson" w:date="2026-04-10T11:00:00Z">
+      <w:ins w:id="280" w:author="Anna Olofsson" w:date="2026-04-10T11:00:00Z">
         <w:r>
           <w:t xml:space="preserve"> principles, quality of life, and disability, are collected within the nested staircase design. For these outcomes, not all clusters will contribute data in every period. Period effects will be defined with respect to the global study timeline, and not separately within each batch.</w:t>
         </w:r>
@@ -13481,15 +13550,15 @@
       <w:pPr>
         <w:pStyle w:val="BodyText"/>
         <w:rPr>
-          <w:del w:id="274" w:author="Anna Olofsson" w:date="2026-04-10T12:15:00Z" w16du:dateUtc="2026-04-10T10:15:00Z"/>
-        </w:rPr>
-        <w:pPrChange w:id="275" w:author="Anna Olofsson" w:date="2026-04-10T11:00:00Z" w16du:dateUtc="2026-04-10T09:00:00Z">
+          <w:del w:id="281" w:author="Anna Olofsson" w:date="2026-04-10T12:15:00Z" w16du:dateUtc="2026-04-10T10:15:00Z"/>
+        </w:rPr>
+        <w:pPrChange w:id="282" w:author="Anna Olofsson" w:date="2026-04-10T11:00:00Z" w16du:dateUtc="2026-04-10T09:00:00Z">
           <w:pPr>
             <w:pStyle w:val="FirstParagraph"/>
           </w:pPr>
         </w:pPrChange>
       </w:pPr>
-      <w:ins w:id="276" w:author="Anna Olofsson" w:date="2026-04-10T12:15:00Z">
+      <w:ins w:id="283" w:author="Anna Olofsson" w:date="2026-04-10T12:15:00Z">
         <w:r>
           <w:lastRenderedPageBreak/>
           <w:t>Appropriate model diagnostics will be used to assess the assumptions of each fitted model, including distributional assumptions, proportional odds assumptions where relevant, and convergence of the fitted models.</w:t>
@@ -13500,12 +13569,12 @@
       <w:pPr>
         <w:pStyle w:val="Heading3"/>
       </w:pPr>
-      <w:bookmarkStart w:id="277" w:name="_Toc223944511"/>
-      <w:bookmarkStart w:id="278" w:name="Xf8ad26412ad98b449304d4475d81963b294c2ae"/>
+      <w:bookmarkStart w:id="284" w:name="_Toc223944511"/>
+      <w:bookmarkStart w:id="285" w:name="Xf8ad26412ad98b449304d4475d81963b294c2ae"/>
       <w:r>
         <w:t>5.11.1 All cause mortality within 24 hours, 30 days and three months of arrival at the emergency department</w:t>
       </w:r>
-      <w:bookmarkEnd w:id="277"/>
+      <w:bookmarkEnd w:id="284"/>
     </w:p>
     <w:p>
       <w:pPr>
@@ -13530,67 +13599,67 @@
       <w:pPr>
         <w:pStyle w:val="Heading3"/>
       </w:pPr>
-      <w:bookmarkStart w:id="279" w:name="_Toc223944512"/>
-      <w:bookmarkStart w:id="280" w:name="X89c97a0c38ba473d58b2facce729a073a7e8df9"/>
-      <w:bookmarkEnd w:id="278"/>
+      <w:bookmarkStart w:id="286" w:name="_Toc223944512"/>
+      <w:bookmarkStart w:id="287" w:name="X89c97a0c38ba473d58b2facce729a073a7e8df9"/>
+      <w:bookmarkEnd w:id="285"/>
       <w:r>
         <w:t xml:space="preserve">5.11.2 Quality of life within seven days of discharge, and at 30 days and three months of arrival at the emergency department, among </w:t>
       </w:r>
-      <w:commentRangeStart w:id="281"/>
-      <w:commentRangeStart w:id="282"/>
-      <w:commentRangeStart w:id="283"/>
-      <w:commentRangeStart w:id="284"/>
+      <w:commentRangeStart w:id="288"/>
+      <w:commentRangeStart w:id="289"/>
+      <w:commentRangeStart w:id="290"/>
+      <w:commentRangeStart w:id="291"/>
       <w:r>
         <w:t>survivors</w:t>
       </w:r>
-      <w:bookmarkEnd w:id="279"/>
-      <w:commentRangeEnd w:id="281"/>
+      <w:bookmarkEnd w:id="286"/>
+      <w:commentRangeEnd w:id="288"/>
       <w:r>
         <w:rPr>
           <w:rStyle w:val="CommentReference"/>
           <w:sz w:val="28"/>
           <w:szCs w:val="28"/>
         </w:rPr>
-        <w:commentReference w:id="281"/>
-      </w:r>
-      <w:commentRangeEnd w:id="282"/>
+        <w:commentReference w:id="288"/>
+      </w:r>
+      <w:commentRangeEnd w:id="289"/>
       <w:r>
         <w:rPr>
           <w:rStyle w:val="CommentReference"/>
           <w:sz w:val="28"/>
           <w:szCs w:val="28"/>
         </w:rPr>
-        <w:commentReference w:id="282"/>
-      </w:r>
-      <w:commentRangeEnd w:id="283"/>
+        <w:commentReference w:id="289"/>
+      </w:r>
+      <w:commentRangeEnd w:id="290"/>
       <w:r>
         <w:rPr>
           <w:rStyle w:val="CommentReference"/>
           <w:sz w:val="28"/>
           <w:szCs w:val="28"/>
         </w:rPr>
-        <w:commentReference w:id="283"/>
-      </w:r>
-      <w:commentRangeEnd w:id="284"/>
+        <w:commentReference w:id="290"/>
+      </w:r>
+      <w:commentRangeEnd w:id="291"/>
       <w:r>
         <w:rPr>
           <w:rStyle w:val="CommentReference"/>
           <w:sz w:val="28"/>
           <w:szCs w:val="28"/>
         </w:rPr>
-        <w:commentReference w:id="284"/>
+        <w:commentReference w:id="291"/>
       </w:r>
     </w:p>
     <w:p>
       <w:pPr>
         <w:pStyle w:val="FirstParagraph"/>
       </w:pPr>
-      <w:ins w:id="285" w:author="Anna Olofsson" w:date="2026-04-10T11:00:00Z">
+      <w:ins w:id="292" w:author="Anna Olofsson" w:date="2026-04-10T11:00:00Z">
         <w:r>
           <w:t>This outcome is assessed among patients alive at the relevant follow-up time point</w:t>
         </w:r>
       </w:ins>
-      <w:ins w:id="286" w:author="Anna Olofsson" w:date="2026-04-10T11:00:00Z" w16du:dateUtc="2026-04-10T09:00:00Z">
+      <w:ins w:id="293" w:author="Anna Olofsson" w:date="2026-04-10T11:00:00Z" w16du:dateUtc="2026-04-10T09:00:00Z">
         <w:r>
           <w:t xml:space="preserve">. </w:t>
         </w:r>
@@ -13598,7 +13667,7 @@
       <w:r>
         <w:t>Quality of life will be measured using the official and validated translations of the EQ5D</w:t>
       </w:r>
-      <w:ins w:id="287" w:author="Anna Olofsson" w:date="2026-03-20T11:00:00Z" w16du:dateUtc="2026-03-20T10:00:00Z">
+      <w:ins w:id="294" w:author="Anna Olofsson" w:date="2026-03-20T11:00:00Z" w16du:dateUtc="2026-03-20T10:00:00Z">
         <w:r>
           <w:t>-</w:t>
         </w:r>
@@ -13606,17 +13675,17 @@
       <w:r>
         <w:t xml:space="preserve">5L. This tool assesses five dimensions of health-related quality of life: mobility, self-care, usual activities, pain/discomfort, and anxiety/depression. Each dimension is rated on a Likert scale from 1 to 5. </w:t>
       </w:r>
-      <w:commentRangeStart w:id="288"/>
-      <w:commentRangeStart w:id="289"/>
+      <w:commentRangeStart w:id="295"/>
+      <w:commentRangeStart w:id="296"/>
       <w:r>
         <w:t>The</w:t>
       </w:r>
-      <w:ins w:id="290" w:author="Anna Olofsson" w:date="2026-03-20T11:01:00Z" w16du:dateUtc="2026-03-20T10:01:00Z">
+      <w:ins w:id="297" w:author="Anna Olofsson" w:date="2026-03-20T11:01:00Z" w16du:dateUtc="2026-03-20T10:01:00Z">
         <w:r>
           <w:t xml:space="preserve"> instrument </w:t>
         </w:r>
       </w:ins>
-      <w:del w:id="291" w:author="Anna Olofsson" w:date="2026-03-20T11:01:00Z" w16du:dateUtc="2026-03-20T10:01:00Z">
+      <w:del w:id="298" w:author="Anna Olofsson" w:date="2026-03-20T11:01:00Z" w16du:dateUtc="2026-03-20T10:01:00Z">
         <w:r>
           <w:delText>re is</w:delText>
         </w:r>
@@ -13624,7 +13693,7 @@
       <w:r>
         <w:t xml:space="preserve"> also</w:t>
       </w:r>
-      <w:ins w:id="292" w:author="Anna Olofsson" w:date="2026-03-20T11:01:00Z" w16du:dateUtc="2026-03-20T10:01:00Z">
+      <w:ins w:id="299" w:author="Anna Olofsson" w:date="2026-03-20T11:01:00Z" w16du:dateUtc="2026-03-20T10:01:00Z">
         <w:r>
           <w:t xml:space="preserve"> includes</w:t>
         </w:r>
@@ -13632,35 +13701,35 @@
       <w:r>
         <w:t xml:space="preserve"> a visual analogue scale (VAS) ranging from 0 to 100.</w:t>
       </w:r>
-      <w:commentRangeEnd w:id="288"/>
+      <w:commentRangeEnd w:id="295"/>
       <w:r>
         <w:rPr>
           <w:rStyle w:val="CommentReference"/>
           <w:sz w:val="24"/>
           <w:szCs w:val="24"/>
         </w:rPr>
-        <w:commentReference w:id="288"/>
-      </w:r>
-      <w:commentRangeEnd w:id="289"/>
+        <w:commentReference w:id="295"/>
+      </w:r>
+      <w:commentRangeEnd w:id="296"/>
       <w:r>
         <w:rPr>
           <w:rStyle w:val="CommentReference"/>
           <w:sz w:val="24"/>
           <w:szCs w:val="24"/>
         </w:rPr>
-        <w:commentReference w:id="289"/>
+        <w:commentReference w:id="296"/>
       </w:r>
     </w:p>
     <w:p>
       <w:pPr>
         <w:pStyle w:val="BodyText"/>
       </w:pPr>
-      <w:del w:id="293" w:author="Anna Olofsson" w:date="2026-03-20T10:58:00Z" w16du:dateUtc="2026-03-20T09:58:00Z">
+      <w:del w:id="300" w:author="Anna Olofsson" w:date="2026-03-20T10:58:00Z" w16du:dateUtc="2026-03-20T09:58:00Z">
         <w:r>
           <w:delText>For each of t</w:delText>
         </w:r>
       </w:del>
-      <w:ins w:id="294" w:author="Anna Olofsson" w:date="2026-03-20T10:58:00Z" w16du:dateUtc="2026-03-20T09:58:00Z">
+      <w:ins w:id="301" w:author="Anna Olofsson" w:date="2026-03-20T10:58:00Z" w16du:dateUtc="2026-03-20T09:58:00Z">
         <w:r>
           <w:t>T</w:t>
         </w:r>
@@ -13668,7 +13737,7 @@
       <w:r>
         <w:t>he five ordinal</w:t>
       </w:r>
-      <w:ins w:id="295" w:author="Anna Olofsson" w:date="2026-03-20T10:58:00Z" w16du:dateUtc="2026-03-20T09:58:00Z">
+      <w:ins w:id="302" w:author="Anna Olofsson" w:date="2026-03-20T10:58:00Z" w16du:dateUtc="2026-03-20T09:58:00Z">
         <w:r>
           <w:t xml:space="preserve"> EQ5D</w:t>
         </w:r>
@@ -13676,20 +13745,20 @@
       <w:r>
         <w:t xml:space="preserve"> </w:t>
       </w:r>
-      <w:commentRangeStart w:id="296"/>
+      <w:commentRangeStart w:id="303"/>
       <w:r>
         <w:t>dimensions</w:t>
       </w:r>
-      <w:commentRangeEnd w:id="296"/>
+      <w:commentRangeEnd w:id="303"/>
       <w:r>
         <w:rPr>
           <w:rStyle w:val="CommentReference"/>
           <w:sz w:val="24"/>
           <w:szCs w:val="24"/>
         </w:rPr>
-        <w:commentReference w:id="296"/>
-      </w:r>
-      <w:del w:id="297" w:author="Anna Olofsson" w:date="2026-03-20T10:58:00Z" w16du:dateUtc="2026-03-20T09:58:00Z">
+        <w:commentReference w:id="303"/>
+      </w:r>
+      <w:del w:id="304" w:author="Anna Olofsson" w:date="2026-03-20T10:58:00Z" w16du:dateUtc="2026-03-20T09:58:00Z">
         <w:r>
           <w:delText xml:space="preserve">, we </w:delText>
         </w:r>
@@ -13697,7 +13766,7 @@
       <w:r>
         <w:t xml:space="preserve">will </w:t>
       </w:r>
-      <w:ins w:id="298" w:author="Anna Olofsson" w:date="2026-03-20T10:58:00Z" w16du:dateUtc="2026-03-20T09:58:00Z">
+      <w:ins w:id="305" w:author="Anna Olofsson" w:date="2026-03-20T10:58:00Z" w16du:dateUtc="2026-03-20T09:58:00Z">
         <w:r>
           <w:t xml:space="preserve">be analysed </w:t>
         </w:r>
@@ -13705,12 +13774,12 @@
       <w:r>
         <w:t>us</w:t>
       </w:r>
-      <w:ins w:id="299" w:author="Anna Olofsson" w:date="2026-03-20T10:59:00Z" w16du:dateUtc="2026-03-20T09:59:00Z">
+      <w:ins w:id="306" w:author="Anna Olofsson" w:date="2026-03-20T10:59:00Z" w16du:dateUtc="2026-03-20T09:59:00Z">
         <w:r>
           <w:t>ing</w:t>
         </w:r>
       </w:ins>
-      <w:del w:id="300" w:author="Anna Olofsson" w:date="2026-03-20T10:59:00Z" w16du:dateUtc="2026-03-20T09:59:00Z">
+      <w:del w:id="307" w:author="Anna Olofsson" w:date="2026-03-20T10:59:00Z" w16du:dateUtc="2026-03-20T09:59:00Z">
         <w:r>
           <w:delText>e</w:delText>
         </w:r>
@@ -13718,7 +13787,7 @@
       <w:r>
         <w:t xml:space="preserve"> </w:t>
       </w:r>
-      <w:del w:id="301" w:author="Anna Olofsson" w:date="2026-03-20T10:59:00Z" w16du:dateUtc="2026-03-20T09:59:00Z">
+      <w:del w:id="308" w:author="Anna Olofsson" w:date="2026-03-20T10:59:00Z" w16du:dateUtc="2026-03-20T09:59:00Z">
         <w:r>
           <w:delText>a</w:delText>
         </w:r>
@@ -13726,7 +13795,7 @@
       <w:r>
         <w:t xml:space="preserve"> mixed-effects cumulative logit (proportional odds) model</w:t>
       </w:r>
-      <w:ins w:id="302" w:author="Anna Olofsson" w:date="2026-03-20T10:59:00Z" w16du:dateUtc="2026-03-20T09:59:00Z">
+      <w:ins w:id="309" w:author="Anna Olofsson" w:date="2026-03-20T10:59:00Z" w16du:dateUtc="2026-03-20T09:59:00Z">
         <w:r>
           <w:t>s</w:t>
         </w:r>
@@ -13740,12 +13809,12 @@
         <w:pStyle w:val="BodyText"/>
         <w:rPr>
           <w:lang w:val="sv-SE"/>
-          <w:rPrChange w:id="303" w:author="Anna Olofsson" w:date="2026-03-16T12:45:00Z" w16du:dateUtc="2026-03-16T11:45:00Z">
+          <w:rPrChange w:id="310" w:author="Anna Olofsson" w:date="2026-03-16T12:45:00Z" w16du:dateUtc="2026-03-16T11:45:00Z">
             <w:rPr/>
           </w:rPrChange>
         </w:rPr>
       </w:pPr>
-      <w:bookmarkStart w:id="304" w:name="eq-ordinal-model"/>
+      <w:bookmarkStart w:id="311" w:name="eq-ordinal-model"/>
       <m:oMathPara>
         <m:oMathParaPr>
           <m:jc m:val="center"/>
@@ -13757,7 +13826,7 @@
             </m:rPr>
             <w:rPr>
               <w:lang w:val="sv-SE"/>
-              <w:rPrChange w:id="305" w:author="Anna Olofsson" w:date="2026-03-16T12:45:00Z" w16du:dateUtc="2026-03-16T11:45:00Z">
+              <w:rPrChange w:id="312" w:author="Anna Olofsson" w:date="2026-03-16T12:45:00Z" w16du:dateUtc="2026-03-16T11:45:00Z">
                 <w:rPr/>
               </w:rPrChange>
             </w:rPr>
@@ -13770,7 +13839,7 @@
             <w:rPr>
               <w:rFonts w:ascii="Cambria Math" w:hAnsi="Cambria Math"/>
               <w:lang w:val="sv-SE"/>
-              <w:rPrChange w:id="306" w:author="Anna Olofsson" w:date="2026-03-16T12:45:00Z" w16du:dateUtc="2026-03-16T11:45:00Z">
+              <w:rPrChange w:id="313" w:author="Anna Olofsson" w:date="2026-03-16T12:45:00Z" w16du:dateUtc="2026-03-16T11:45:00Z">
                 <w:rPr>
                   <w:rFonts w:ascii="Cambria Math" w:hAnsi="Cambria Math"/>
                 </w:rPr>
@@ -13819,7 +13888,7 @@
                 <w:rPr>
                   <w:rFonts w:ascii="Cambria Math" w:hAnsi="Cambria Math"/>
                   <w:lang w:val="sv-SE"/>
-                  <w:rPrChange w:id="307" w:author="Anna Olofsson" w:date="2026-03-16T12:45:00Z" w16du:dateUtc="2026-03-16T11:45:00Z">
+                  <w:rPrChange w:id="314" w:author="Anna Olofsson" w:date="2026-03-16T12:45:00Z" w16du:dateUtc="2026-03-16T11:45:00Z">
                     <w:rPr>
                       <w:rFonts w:ascii="Cambria Math" w:hAnsi="Cambria Math"/>
                     </w:rPr>
@@ -13842,7 +13911,7 @@
             <w:rPr>
               <w:rFonts w:ascii="Cambria Math" w:hAnsi="Cambria Math"/>
               <w:lang w:val="sv-SE"/>
-              <w:rPrChange w:id="308" w:author="Anna Olofsson" w:date="2026-03-16T12:45:00Z" w16du:dateUtc="2026-03-16T11:45:00Z">
+              <w:rPrChange w:id="315" w:author="Anna Olofsson" w:date="2026-03-16T12:45:00Z" w16du:dateUtc="2026-03-16T11:45:00Z">
                 <w:rPr>
                   <w:rFonts w:ascii="Cambria Math" w:hAnsi="Cambria Math"/>
                 </w:rPr>
@@ -13882,7 +13951,7 @@
             <w:rPr>
               <w:rFonts w:ascii="Cambria Math" w:hAnsi="Cambria Math"/>
               <w:lang w:val="sv-SE"/>
-              <w:rPrChange w:id="309" w:author="Anna Olofsson" w:date="2026-03-16T12:45:00Z" w16du:dateUtc="2026-03-16T11:45:00Z">
+              <w:rPrChange w:id="316" w:author="Anna Olofsson" w:date="2026-03-16T12:45:00Z" w16du:dateUtc="2026-03-16T11:45:00Z">
                 <w:rPr>
                   <w:rFonts w:ascii="Cambria Math" w:hAnsi="Cambria Math"/>
                 </w:rPr>
@@ -13922,7 +13991,7 @@
             <w:rPr>
               <w:rFonts w:ascii="Cambria Math" w:hAnsi="Cambria Math"/>
               <w:lang w:val="sv-SE"/>
-              <w:rPrChange w:id="310" w:author="Anna Olofsson" w:date="2026-03-16T12:45:00Z" w16du:dateUtc="2026-03-16T11:45:00Z">
+              <w:rPrChange w:id="317" w:author="Anna Olofsson" w:date="2026-03-16T12:45:00Z" w16du:dateUtc="2026-03-16T11:45:00Z">
                 <w:rPr>
                   <w:rFonts w:ascii="Cambria Math" w:hAnsi="Cambria Math"/>
                 </w:rPr>
@@ -13968,7 +14037,7 @@
             <w:rPr>
               <w:rFonts w:ascii="Cambria Math" w:hAnsi="Cambria Math"/>
               <w:lang w:val="sv-SE"/>
-              <w:rPrChange w:id="311" w:author="Anna Olofsson" w:date="2026-03-16T12:45:00Z" w16du:dateUtc="2026-03-16T11:45:00Z">
+              <w:rPrChange w:id="318" w:author="Anna Olofsson" w:date="2026-03-16T12:45:00Z" w16du:dateUtc="2026-03-16T11:45:00Z">
                 <w:rPr>
                   <w:rFonts w:ascii="Cambria Math" w:hAnsi="Cambria Math"/>
                 </w:rPr>
@@ -14008,7 +14077,7 @@
             <w:rPr>
               <w:rFonts w:ascii="Cambria Math" w:hAnsi="Cambria Math"/>
               <w:lang w:val="sv-SE"/>
-              <w:rPrChange w:id="312" w:author="Anna Olofsson" w:date="2026-03-16T12:45:00Z" w16du:dateUtc="2026-03-16T11:45:00Z">
+              <w:rPrChange w:id="319" w:author="Anna Olofsson" w:date="2026-03-16T12:45:00Z" w16du:dateUtc="2026-03-16T11:45:00Z">
                 <w:rPr>
                   <w:rFonts w:ascii="Cambria Math" w:hAnsi="Cambria Math"/>
                 </w:rPr>
@@ -14045,7 +14114,7 @@
             <w:rPr>
               <w:rFonts w:ascii="Cambria Math" w:hAnsi="Cambria Math"/>
               <w:lang w:val="sv-SE"/>
-              <w:rPrChange w:id="313" w:author="Anna Olofsson" w:date="2026-03-16T12:45:00Z" w16du:dateUtc="2026-03-16T11:45:00Z">
+              <w:rPrChange w:id="320" w:author="Anna Olofsson" w:date="2026-03-16T12:45:00Z" w16du:dateUtc="2026-03-16T11:45:00Z">
                 <w:rPr>
                   <w:rFonts w:ascii="Cambria Math" w:hAnsi="Cambria Math"/>
                 </w:rPr>
@@ -14066,7 +14135,7 @@
                 <w:rPr>
                   <w:rFonts w:ascii="Cambria Math" w:hAnsi="Cambria Math"/>
                   <w:lang w:val="sv-SE"/>
-                  <w:rPrChange w:id="314" w:author="Anna Olofsson" w:date="2026-03-16T12:45:00Z" w16du:dateUtc="2026-03-16T11:45:00Z">
+                  <w:rPrChange w:id="321" w:author="Anna Olofsson" w:date="2026-03-16T12:45:00Z" w16du:dateUtc="2026-03-16T11:45:00Z">
                     <w:rPr>
                       <w:rFonts w:ascii="Cambria Math" w:hAnsi="Cambria Math"/>
                     </w:rPr>
@@ -14078,7 +14147,7 @@
           </m:d>
         </m:oMath>
       </m:oMathPara>
-      <w:bookmarkEnd w:id="304"/>
+      <w:bookmarkEnd w:id="311"/>
     </w:p>
     <w:p>
       <w:pPr>
@@ -14136,7 +14205,7 @@
       <w:r>
         <w:t xml:space="preserve">The VAS will be analysed </w:t>
       </w:r>
-      <w:ins w:id="315" w:author="Anna Olofsson" w:date="2026-03-20T10:59:00Z" w16du:dateUtc="2026-03-20T09:59:00Z">
+      <w:ins w:id="322" w:author="Anna Olofsson" w:date="2026-03-20T10:59:00Z" w16du:dateUtc="2026-03-20T09:59:00Z">
         <w:r>
           <w:t xml:space="preserve">separately </w:t>
         </w:r>
@@ -14145,13 +14214,13 @@
         <w:t>as a continuous outcome using a linear mixed-effects model:</w:t>
       </w:r>
     </w:p>
-    <w:bookmarkStart w:id="316" w:name="eq-linear-model"/>
+    <w:bookmarkStart w:id="323" w:name="eq-linear-model"/>
     <w:p>
       <w:pPr>
         <w:pStyle w:val="BodyText"/>
         <w:rPr>
           <w:lang w:val="sv-SE"/>
-          <w:rPrChange w:id="317" w:author="Anna Olofsson" w:date="2026-03-16T12:45:00Z" w16du:dateUtc="2026-03-16T11:45:00Z">
+          <w:rPrChange w:id="324" w:author="Anna Olofsson" w:date="2026-03-16T12:45:00Z" w16du:dateUtc="2026-03-16T11:45:00Z">
             <w:rPr/>
           </w:rPrChange>
         </w:rPr>
@@ -14176,7 +14245,7 @@
                 </m:rPr>
                 <w:rPr>
                   <w:lang w:val="sv-SE"/>
-                  <w:rPrChange w:id="318" w:author="Anna Olofsson" w:date="2026-03-16T12:45:00Z" w16du:dateUtc="2026-03-16T11:45:00Z">
+                  <w:rPrChange w:id="325" w:author="Anna Olofsson" w:date="2026-03-16T12:45:00Z" w16du:dateUtc="2026-03-16T11:45:00Z">
                     <w:rPr/>
                   </w:rPrChange>
                 </w:rPr>
@@ -14199,7 +14268,7 @@
             <w:rPr>
               <w:rFonts w:ascii="Cambria Math" w:hAnsi="Cambria Math"/>
               <w:lang w:val="sv-SE"/>
-              <w:rPrChange w:id="319" w:author="Anna Olofsson" w:date="2026-03-16T12:45:00Z" w16du:dateUtc="2026-03-16T11:45:00Z">
+              <w:rPrChange w:id="326" w:author="Anna Olofsson" w:date="2026-03-16T12:45:00Z" w16du:dateUtc="2026-03-16T11:45:00Z">
                 <w:rPr>
                   <w:rFonts w:ascii="Cambria Math" w:hAnsi="Cambria Math"/>
                 </w:rPr>
@@ -14220,7 +14289,7 @@
             <w:rPr>
               <w:rFonts w:ascii="Cambria Math" w:hAnsi="Cambria Math"/>
               <w:lang w:val="sv-SE"/>
-              <w:rPrChange w:id="320" w:author="Anna Olofsson" w:date="2026-03-16T12:45:00Z" w16du:dateUtc="2026-03-16T11:45:00Z">
+              <w:rPrChange w:id="327" w:author="Anna Olofsson" w:date="2026-03-16T12:45:00Z" w16du:dateUtc="2026-03-16T11:45:00Z">
                 <w:rPr>
                   <w:rFonts w:ascii="Cambria Math" w:hAnsi="Cambria Math"/>
                 </w:rPr>
@@ -14260,7 +14329,7 @@
             <w:rPr>
               <w:rFonts w:ascii="Cambria Math" w:hAnsi="Cambria Math"/>
               <w:lang w:val="sv-SE"/>
-              <w:rPrChange w:id="321" w:author="Anna Olofsson" w:date="2026-03-16T12:45:00Z" w16du:dateUtc="2026-03-16T11:45:00Z">
+              <w:rPrChange w:id="328" w:author="Anna Olofsson" w:date="2026-03-16T12:45:00Z" w16du:dateUtc="2026-03-16T11:45:00Z">
                 <w:rPr>
                   <w:rFonts w:ascii="Cambria Math" w:hAnsi="Cambria Math"/>
                 </w:rPr>
@@ -14306,7 +14375,7 @@
             <w:rPr>
               <w:rFonts w:ascii="Cambria Math" w:hAnsi="Cambria Math"/>
               <w:lang w:val="sv-SE"/>
-              <w:rPrChange w:id="322" w:author="Anna Olofsson" w:date="2026-03-16T12:45:00Z" w16du:dateUtc="2026-03-16T11:45:00Z">
+              <w:rPrChange w:id="329" w:author="Anna Olofsson" w:date="2026-03-16T12:45:00Z" w16du:dateUtc="2026-03-16T11:45:00Z">
                 <w:rPr>
                   <w:rFonts w:ascii="Cambria Math" w:hAnsi="Cambria Math"/>
                 </w:rPr>
@@ -14346,7 +14415,7 @@
             <w:rPr>
               <w:rFonts w:ascii="Cambria Math" w:hAnsi="Cambria Math"/>
               <w:lang w:val="sv-SE"/>
-              <w:rPrChange w:id="323" w:author="Anna Olofsson" w:date="2026-03-16T12:45:00Z" w16du:dateUtc="2026-03-16T11:45:00Z">
+              <w:rPrChange w:id="330" w:author="Anna Olofsson" w:date="2026-03-16T12:45:00Z" w16du:dateUtc="2026-03-16T11:45:00Z">
                 <w:rPr>
                   <w:rFonts w:ascii="Cambria Math" w:hAnsi="Cambria Math"/>
                 </w:rPr>
@@ -14386,7 +14455,7 @@
             <w:rPr>
               <w:rFonts w:ascii="Cambria Math" w:hAnsi="Cambria Math"/>
               <w:lang w:val="sv-SE"/>
-              <w:rPrChange w:id="324" w:author="Anna Olofsson" w:date="2026-03-16T12:45:00Z" w16du:dateUtc="2026-03-16T11:45:00Z">
+              <w:rPrChange w:id="331" w:author="Anna Olofsson" w:date="2026-03-16T12:45:00Z" w16du:dateUtc="2026-03-16T11:45:00Z">
                 <w:rPr>
                   <w:rFonts w:ascii="Cambria Math" w:hAnsi="Cambria Math"/>
                 </w:rPr>
@@ -14426,7 +14495,7 @@
             <w:rPr>
               <w:rFonts w:ascii="Cambria Math" w:hAnsi="Cambria Math"/>
               <w:lang w:val="sv-SE"/>
-              <w:rPrChange w:id="325" w:author="Anna Olofsson" w:date="2026-03-16T12:45:00Z" w16du:dateUtc="2026-03-16T11:45:00Z">
+              <w:rPrChange w:id="332" w:author="Anna Olofsson" w:date="2026-03-16T12:45:00Z" w16du:dateUtc="2026-03-16T11:45:00Z">
                 <w:rPr>
                   <w:rFonts w:ascii="Cambria Math" w:hAnsi="Cambria Math"/>
                 </w:rPr>
@@ -14438,7 +14507,7 @@
             <w:rPr>
               <w:rFonts w:ascii="Cambria Math" w:hAnsi="Cambria Math"/>
               <w:lang w:val="sv-SE"/>
-              <w:rPrChange w:id="326" w:author="Anna Olofsson" w:date="2026-03-16T12:45:00Z" w16du:dateUtc="2026-03-16T11:45:00Z">
+              <w:rPrChange w:id="333" w:author="Anna Olofsson" w:date="2026-03-16T12:45:00Z" w16du:dateUtc="2026-03-16T11:45:00Z">
                 <w:rPr>
                   <w:rFonts w:ascii="Cambria Math" w:hAnsi="Cambria Math"/>
                 </w:rPr>
@@ -14478,7 +14547,7 @@
             <w:rPr>
               <w:rFonts w:ascii="Cambria Math" w:hAnsi="Cambria Math"/>
               <w:lang w:val="sv-SE"/>
-              <w:rPrChange w:id="327" w:author="Anna Olofsson" w:date="2026-03-16T12:45:00Z" w16du:dateUtc="2026-03-16T11:45:00Z">
+              <w:rPrChange w:id="334" w:author="Anna Olofsson" w:date="2026-03-16T12:45:00Z" w16du:dateUtc="2026-03-16T11:45:00Z">
                 <w:rPr>
                   <w:rFonts w:ascii="Cambria Math" w:hAnsi="Cambria Math"/>
                 </w:rPr>
@@ -14509,7 +14578,7 @@
                 <w:rPr>
                   <w:rFonts w:ascii="Cambria Math" w:hAnsi="Cambria Math"/>
                   <w:lang w:val="sv-SE"/>
-                  <w:rPrChange w:id="328" w:author="Anna Olofsson" w:date="2026-03-16T12:45:00Z" w16du:dateUtc="2026-03-16T11:45:00Z">
+                  <w:rPrChange w:id="335" w:author="Anna Olofsson" w:date="2026-03-16T12:45:00Z" w16du:dateUtc="2026-03-16T11:45:00Z">
                     <w:rPr>
                       <w:rFonts w:ascii="Cambria Math" w:hAnsi="Cambria Math"/>
                     </w:rPr>
@@ -14524,7 +14593,7 @@
                 <w:rPr>
                   <w:rFonts w:ascii="Cambria Math" w:hAnsi="Cambria Math"/>
                   <w:lang w:val="sv-SE"/>
-                  <w:rPrChange w:id="329" w:author="Anna Olofsson" w:date="2026-03-16T12:45:00Z" w16du:dateUtc="2026-03-16T11:45:00Z">
+                  <w:rPrChange w:id="336" w:author="Anna Olofsson" w:date="2026-03-16T12:45:00Z" w16du:dateUtc="2026-03-16T11:45:00Z">
                     <w:rPr>
                       <w:rFonts w:ascii="Cambria Math" w:hAnsi="Cambria Math"/>
                     </w:rPr>
@@ -14553,7 +14622,7 @@
                     <w:rPr>
                       <w:rFonts w:ascii="Cambria Math" w:hAnsi="Cambria Math"/>
                       <w:lang w:val="sv-SE"/>
-                      <w:rPrChange w:id="330" w:author="Anna Olofsson" w:date="2026-03-16T12:45:00Z" w16du:dateUtc="2026-03-16T11:45:00Z">
+                      <w:rPrChange w:id="337" w:author="Anna Olofsson" w:date="2026-03-16T12:45:00Z" w16du:dateUtc="2026-03-16T11:45:00Z">
                         <w:rPr>
                           <w:rFonts w:ascii="Cambria Math" w:hAnsi="Cambria Math"/>
                         </w:rPr>
@@ -14569,7 +14638,7 @@
             <w:rPr>
               <w:rFonts w:ascii="Cambria Math" w:hAnsi="Cambria Math"/>
               <w:lang w:val="sv-SE"/>
-              <w:rPrChange w:id="331" w:author="Anna Olofsson" w:date="2026-03-16T12:45:00Z" w16du:dateUtc="2026-03-16T11:45:00Z">
+              <w:rPrChange w:id="338" w:author="Anna Olofsson" w:date="2026-03-16T12:45:00Z" w16du:dateUtc="2026-03-16T11:45:00Z">
                 <w:rPr>
                   <w:rFonts w:ascii="Cambria Math" w:hAnsi="Cambria Math"/>
                 </w:rPr>
@@ -14590,7 +14659,7 @@
                 <w:rPr>
                   <w:rFonts w:ascii="Cambria Math" w:hAnsi="Cambria Math"/>
                   <w:lang w:val="sv-SE"/>
-                  <w:rPrChange w:id="332" w:author="Anna Olofsson" w:date="2026-03-16T12:45:00Z" w16du:dateUtc="2026-03-16T11:45:00Z">
+                  <w:rPrChange w:id="339" w:author="Anna Olofsson" w:date="2026-03-16T12:45:00Z" w16du:dateUtc="2026-03-16T11:45:00Z">
                     <w:rPr>
                       <w:rFonts w:ascii="Cambria Math" w:hAnsi="Cambria Math"/>
                     </w:rPr>
@@ -14602,30 +14671,30 @@
           </m:d>
         </m:oMath>
       </m:oMathPara>
-      <w:bookmarkEnd w:id="316"/>
+      <w:bookmarkEnd w:id="323"/>
     </w:p>
     <w:p>
       <w:pPr>
         <w:pStyle w:val="Heading3"/>
       </w:pPr>
-      <w:bookmarkStart w:id="333" w:name="_Toc223944513"/>
-      <w:bookmarkStart w:id="334" w:name="X90cb4e0ebfb4fe618dcdd24cc99dbcaedd01b78"/>
-      <w:bookmarkEnd w:id="280"/>
+      <w:bookmarkStart w:id="340" w:name="_Toc223944513"/>
+      <w:bookmarkStart w:id="341" w:name="X90cb4e0ebfb4fe618dcdd24cc99dbcaedd01b78"/>
+      <w:bookmarkEnd w:id="287"/>
       <w:r>
         <w:t>5.11.3 Disability within seven days of discharge, and at 30 days and three months of arrival at the emergency department, among survivors</w:t>
       </w:r>
-      <w:bookmarkEnd w:id="333"/>
+      <w:bookmarkEnd w:id="340"/>
     </w:p>
     <w:p>
       <w:pPr>
         <w:pStyle w:val="FirstParagraph"/>
       </w:pPr>
-      <w:ins w:id="335" w:author="Anna Olofsson" w:date="2026-04-10T11:01:00Z">
+      <w:ins w:id="342" w:author="Anna Olofsson" w:date="2026-04-10T11:01:00Z">
         <w:r>
           <w:t>This outcome is assessed among patients alive at the relevant follow-up time point.</w:t>
         </w:r>
       </w:ins>
-      <w:ins w:id="336" w:author="Anna Olofsson" w:date="2026-04-10T11:01:00Z" w16du:dateUtc="2026-04-10T09:01:00Z">
+      <w:ins w:id="343" w:author="Anna Olofsson" w:date="2026-04-10T11:01:00Z" w16du:dateUtc="2026-04-10T09:01:00Z">
         <w:r>
           <w:t xml:space="preserve"> </w:t>
         </w:r>
@@ -14669,14 +14738,14 @@
       <w:pPr>
         <w:pStyle w:val="Heading3"/>
       </w:pPr>
-      <w:bookmarkStart w:id="337" w:name="_Toc223944514"/>
-      <w:bookmarkStart w:id="338" w:name="X0c0155e4b87aec11ab06b9d09220f8543002113"/>
-      <w:bookmarkEnd w:id="334"/>
+      <w:bookmarkStart w:id="344" w:name="_Toc223944514"/>
+      <w:bookmarkStart w:id="345" w:name="X0c0155e4b87aec11ab06b9d09220f8543002113"/>
+      <w:bookmarkEnd w:id="341"/>
       <w:r>
         <w:lastRenderedPageBreak/>
         <w:t>5.11.4 Return to work at 30 days and three months after arrival at the emergency department, among survivors</w:t>
       </w:r>
-      <w:bookmarkEnd w:id="337"/>
+      <w:bookmarkEnd w:id="344"/>
     </w:p>
     <w:p>
       <w:pPr>
@@ -14701,25 +14770,25 @@
       <w:pPr>
         <w:pStyle w:val="Heading3"/>
       </w:pPr>
-      <w:bookmarkStart w:id="339" w:name="_Toc223944515"/>
-      <w:bookmarkStart w:id="340" w:name="length-of-emergency-department-stay"/>
-      <w:bookmarkEnd w:id="338"/>
+      <w:bookmarkStart w:id="346" w:name="_Toc223944515"/>
+      <w:bookmarkStart w:id="347" w:name="length-of-emergency-department-stay"/>
+      <w:bookmarkEnd w:id="345"/>
       <w:r>
         <w:t xml:space="preserve">5.11.5 </w:t>
       </w:r>
-      <w:commentRangeStart w:id="341"/>
+      <w:commentRangeStart w:id="348"/>
       <w:r>
         <w:t>Length of emergency department stay</w:t>
       </w:r>
-      <w:bookmarkEnd w:id="339"/>
-      <w:commentRangeEnd w:id="341"/>
+      <w:bookmarkEnd w:id="346"/>
+      <w:commentRangeEnd w:id="348"/>
       <w:r>
         <w:rPr>
           <w:rStyle w:val="CommentReference"/>
           <w:sz w:val="28"/>
           <w:szCs w:val="28"/>
         </w:rPr>
-        <w:commentReference w:id="341"/>
+        <w:commentReference w:id="348"/>
       </w:r>
     </w:p>
     <w:p>
@@ -14729,44 +14798,44 @@
       <w:r>
         <w:t>Length of emergency department stay will be analysed as a time-to-event outcome, defined as time from arrival at the emergency department to discharge. We will treat death as a competing event and therefore use a mixed-</w:t>
       </w:r>
-      <w:commentRangeStart w:id="342"/>
+      <w:commentRangeStart w:id="349"/>
       <w:r>
         <w:t xml:space="preserve">effects competing risks model, </w:t>
       </w:r>
-      <w:commentRangeEnd w:id="342"/>
+      <w:commentRangeEnd w:id="349"/>
       <w:r>
         <w:rPr>
           <w:rStyle w:val="CommentReference"/>
           <w:sz w:val="24"/>
           <w:szCs w:val="24"/>
         </w:rPr>
-        <w:commentReference w:id="342"/>
+        <w:commentReference w:id="349"/>
       </w:r>
       <w:r>
         <w:t xml:space="preserve">specifically a Fine and </w:t>
       </w:r>
-      <w:commentRangeStart w:id="343"/>
-      <w:commentRangeStart w:id="344"/>
+      <w:commentRangeStart w:id="350"/>
+      <w:commentRangeStart w:id="351"/>
       <w:r>
         <w:t>Gray</w:t>
       </w:r>
-      <w:commentRangeEnd w:id="343"/>
+      <w:commentRangeEnd w:id="350"/>
       <w:r>
         <w:rPr>
           <w:rStyle w:val="CommentReference"/>
           <w:sz w:val="24"/>
           <w:szCs w:val="24"/>
         </w:rPr>
-        <w:commentReference w:id="343"/>
-      </w:r>
-      <w:commentRangeEnd w:id="344"/>
+        <w:commentReference w:id="350"/>
+      </w:r>
+      <w:commentRangeEnd w:id="351"/>
       <w:r>
         <w:rPr>
           <w:rStyle w:val="CommentReference"/>
           <w:sz w:val="24"/>
           <w:szCs w:val="24"/>
         </w:rPr>
-        <w:commentReference w:id="344"/>
+        <w:commentReference w:id="351"/>
       </w:r>
       <w:r>
         <w:t xml:space="preserve"> subdistribution hazards model. The model is specified in </w:t>
@@ -14783,7 +14852,7 @@
         <w:t>.</w:t>
       </w:r>
     </w:p>
-    <w:bookmarkStart w:id="345" w:name="eq-competing-risks-model"/>
+    <w:bookmarkStart w:id="352" w:name="eq-competing-risks-model"/>
     <w:p>
       <w:pPr>
         <w:pStyle w:val="BodyText"/>
@@ -15066,7 +15135,7 @@
           </m:d>
         </m:oMath>
       </m:oMathPara>
-      <w:bookmarkEnd w:id="345"/>
+      <w:bookmarkEnd w:id="352"/>
     </w:p>
     <w:p>
       <w:pPr>
@@ -15295,13 +15364,13 @@
       <w:pPr>
         <w:pStyle w:val="Heading3"/>
       </w:pPr>
-      <w:bookmarkStart w:id="346" w:name="_Toc223944516"/>
-      <w:bookmarkStart w:id="347" w:name="length-of-hospital-stay"/>
-      <w:bookmarkEnd w:id="340"/>
+      <w:bookmarkStart w:id="353" w:name="_Toc223944516"/>
+      <w:bookmarkStart w:id="354" w:name="length-of-hospital-stay"/>
+      <w:bookmarkEnd w:id="347"/>
       <w:r>
         <w:t>5.11.6 Length of hospital stay</w:t>
       </w:r>
-      <w:bookmarkEnd w:id="346"/>
+      <w:bookmarkEnd w:id="353"/>
     </w:p>
     <w:p>
       <w:pPr>
@@ -15326,13 +15395,13 @@
       <w:pPr>
         <w:pStyle w:val="Heading3"/>
       </w:pPr>
-      <w:bookmarkStart w:id="348" w:name="_Toc223944517"/>
-      <w:bookmarkStart w:id="349" w:name="intensive-care-unit-admission"/>
-      <w:bookmarkEnd w:id="347"/>
+      <w:bookmarkStart w:id="355" w:name="_Toc223944517"/>
+      <w:bookmarkStart w:id="356" w:name="intensive-care-unit-admission"/>
+      <w:bookmarkEnd w:id="354"/>
       <w:r>
         <w:t>5.11.7 Intensive care unit admission</w:t>
       </w:r>
-      <w:bookmarkEnd w:id="348"/>
+      <w:bookmarkEnd w:id="355"/>
     </w:p>
     <w:p>
       <w:pPr>
@@ -15357,13 +15426,13 @@
       <w:pPr>
         <w:pStyle w:val="Heading3"/>
       </w:pPr>
-      <w:bookmarkStart w:id="350" w:name="_Toc223944518"/>
-      <w:bookmarkStart w:id="351" w:name="length-of-intensive-care-unit-stay"/>
-      <w:bookmarkEnd w:id="349"/>
+      <w:bookmarkStart w:id="357" w:name="_Toc223944518"/>
+      <w:bookmarkStart w:id="358" w:name="length-of-intensive-care-unit-stay"/>
+      <w:bookmarkEnd w:id="356"/>
       <w:r>
         <w:t>5.11.8 Length of intensive care unit stay</w:t>
       </w:r>
-      <w:bookmarkEnd w:id="350"/>
+      <w:bookmarkEnd w:id="357"/>
     </w:p>
     <w:p>
       <w:pPr>
@@ -15388,9 +15457,9 @@
       <w:pPr>
         <w:pStyle w:val="Heading3"/>
       </w:pPr>
-      <w:bookmarkStart w:id="352" w:name="_Toc223944519"/>
-      <w:bookmarkStart w:id="353" w:name="X5037a1d47abaf80439915bb3ba5c524d444c7d7"/>
-      <w:bookmarkEnd w:id="351"/>
+      <w:bookmarkStart w:id="359" w:name="_Toc223944519"/>
+      <w:bookmarkStart w:id="360" w:name="X5037a1d47abaf80439915bb3ba5c524d444c7d7"/>
+      <w:bookmarkEnd w:id="358"/>
       <w:r>
         <w:t>5.11.9 Adherence to ATLS</w:t>
       </w:r>
@@ -15403,39 +15472,39 @@
       <w:r>
         <w:t xml:space="preserve"> principles </w:t>
       </w:r>
-      <w:commentRangeStart w:id="354"/>
+      <w:commentRangeStart w:id="361"/>
       <w:r>
         <w:t>during</w:t>
       </w:r>
-      <w:commentRangeEnd w:id="354"/>
+      <w:commentRangeEnd w:id="361"/>
       <w:r>
         <w:rPr>
           <w:rStyle w:val="CommentReference"/>
           <w:sz w:val="28"/>
           <w:szCs w:val="28"/>
         </w:rPr>
-        <w:commentReference w:id="354"/>
+        <w:commentReference w:id="361"/>
       </w:r>
       <w:r>
         <w:t xml:space="preserve"> initial patient resuscitation</w:t>
       </w:r>
-      <w:bookmarkEnd w:id="352"/>
+      <w:bookmarkEnd w:id="359"/>
     </w:p>
     <w:p>
       <w:pPr>
         <w:pStyle w:val="FirstParagraph"/>
       </w:pPr>
-      <w:ins w:id="355" w:author="Anna Olofsson" w:date="2026-04-10T11:10:00Z">
+      <w:ins w:id="362" w:author="Anna Olofsson" w:date="2026-04-10T11:10:00Z">
         <w:r>
           <w:t>This outcome is collected within the nested staircase design and is assessed in both control and intervention periods, in a random sample of patients presenting during the three months before and the three months after the transition period.</w:t>
         </w:r>
       </w:ins>
-      <w:ins w:id="356" w:author="Anna Olofsson" w:date="2026-04-10T11:10:00Z" w16du:dateUtc="2026-04-10T09:10:00Z">
+      <w:ins w:id="363" w:author="Anna Olofsson" w:date="2026-04-10T11:10:00Z" w16du:dateUtc="2026-04-10T09:10:00Z">
         <w:r>
           <w:t xml:space="preserve"> </w:t>
         </w:r>
       </w:ins>
-      <w:del w:id="357" w:author="Anna Olofsson" w:date="2026-04-15T10:18:00Z" w16du:dateUtc="2026-04-15T08:18:00Z">
+      <w:del w:id="364" w:author="Anna Olofsson" w:date="2026-04-15T10:18:00Z" w16du:dateUtc="2026-04-15T08:18:00Z">
         <w:r>
           <w:delText xml:space="preserve">We will assess </w:delText>
         </w:r>
@@ -15457,7 +15526,7 @@
       <w:pPr>
         <w:pStyle w:val="BodyText"/>
       </w:pPr>
-      <w:bookmarkStart w:id="358" w:name="eq-beta-model"/>
+      <w:bookmarkStart w:id="365" w:name="eq-beta-model"/>
       <m:oMathPara>
         <m:oMathParaPr>
           <m:jc m:val="center"/>
@@ -15697,7 +15766,7 @@
           </m:d>
         </m:oMath>
       </m:oMathPara>
-      <w:bookmarkEnd w:id="358"/>
+      <w:bookmarkEnd w:id="365"/>
     </w:p>
     <w:p>
       <w:pPr>
@@ -15810,35 +15879,35 @@
       <w:pPr>
         <w:pStyle w:val="Heading1"/>
       </w:pPr>
-      <w:bookmarkStart w:id="359" w:name="_Toc223944520"/>
-      <w:bookmarkStart w:id="360" w:name="references"/>
+      <w:bookmarkStart w:id="366" w:name="_Toc223944520"/>
+      <w:bookmarkStart w:id="367" w:name="references"/>
       <w:bookmarkEnd w:id="23"/>
-      <w:bookmarkEnd w:id="252"/>
-      <w:bookmarkEnd w:id="353"/>
+      <w:bookmarkEnd w:id="259"/>
+      <w:bookmarkEnd w:id="360"/>
       <w:r>
         <w:t xml:space="preserve">6. </w:t>
       </w:r>
-      <w:commentRangeStart w:id="361"/>
+      <w:commentRangeStart w:id="368"/>
       <w:r>
         <w:t>References</w:t>
       </w:r>
-      <w:bookmarkEnd w:id="359"/>
-      <w:commentRangeEnd w:id="361"/>
+      <w:bookmarkEnd w:id="366"/>
+      <w:commentRangeEnd w:id="368"/>
       <w:r>
         <w:rPr>
           <w:rStyle w:val="CommentReference"/>
           <w:sz w:val="40"/>
           <w:szCs w:val="40"/>
         </w:rPr>
-        <w:commentReference w:id="361"/>
+        <w:commentReference w:id="368"/>
       </w:r>
     </w:p>
     <w:p>
       <w:pPr>
         <w:pStyle w:val="Bibliography"/>
       </w:pPr>
-      <w:bookmarkStart w:id="362" w:name="ref-Kasza2022"/>
-      <w:bookmarkStart w:id="363" w:name="refs"/>
+      <w:bookmarkStart w:id="369" w:name="ref-Kasza2022"/>
+      <w:bookmarkStart w:id="370" w:name="refs"/>
       <w:r>
         <w:t xml:space="preserve">1. </w:t>
       </w:r>
@@ -15881,8 +15950,8 @@
       <w:pPr>
         <w:pStyle w:val="Bibliography"/>
       </w:pPr>
-      <w:bookmarkStart w:id="364" w:name="ref-grantham_staircase_2024"/>
-      <w:bookmarkEnd w:id="362"/>
+      <w:bookmarkStart w:id="371" w:name="ref-grantham_staircase_2024"/>
+      <w:bookmarkEnd w:id="369"/>
       <w:r>
         <w:t xml:space="preserve">2. </w:t>
       </w:r>
@@ -15925,8 +15994,8 @@
       <w:pPr>
         <w:pStyle w:val="Bibliography"/>
       </w:pPr>
-      <w:bookmarkStart w:id="365" w:name="ref-aukstakalnis_impact_2024"/>
-      <w:bookmarkEnd w:id="364"/>
+      <w:bookmarkStart w:id="372" w:name="ref-aukstakalnis_impact_2024"/>
+      <w:bookmarkEnd w:id="371"/>
       <w:r>
         <w:t xml:space="preserve">3. </w:t>
       </w:r>
@@ -15959,8 +16028,8 @@
       <w:pPr>
         <w:pStyle w:val="Bibliography"/>
       </w:pPr>
-      <w:bookmarkStart w:id="366" w:name="ref-Hemming2020Feb"/>
-      <w:bookmarkEnd w:id="365"/>
+      <w:bookmarkStart w:id="373" w:name="ref-Hemming2020Feb"/>
+      <w:bookmarkEnd w:id="372"/>
       <w:r>
         <w:t xml:space="preserve">4. </w:t>
       </w:r>
@@ -16003,8 +16072,8 @@
       <w:pPr>
         <w:pStyle w:val="Bibliography"/>
       </w:pPr>
-      <w:bookmarkStart w:id="367" w:name="ref-nakhid_effect_2026"/>
-      <w:bookmarkEnd w:id="366"/>
+      <w:bookmarkStart w:id="374" w:name="ref-nakhid_effect_2026"/>
+      <w:bookmarkEnd w:id="373"/>
       <w:r>
         <w:t xml:space="preserve">5. </w:t>
       </w:r>
@@ -16037,8 +16106,8 @@
       <w:pPr>
         <w:pStyle w:val="Bibliography"/>
       </w:pPr>
-      <w:bookmarkStart w:id="368" w:name="ref-gerdin_warnberg_feasibility_2025"/>
-      <w:bookmarkEnd w:id="367"/>
+      <w:bookmarkStart w:id="375" w:name="ref-gerdin_warnberg_feasibility_2025"/>
+      <w:bookmarkEnd w:id="374"/>
       <w:r>
         <w:t xml:space="preserve">6. </w:t>
       </w:r>
@@ -16046,16 +16115,35 @@
         <w:tab/>
       </w:r>
       <w:r>
+        <w:rPr>
+          <w:lang w:val="sv-SE"/>
+          <w:rPrChange w:id="376" w:author="Martin Gerdin Wärnberg" w:date="2026-05-29T06:21:00Z" w16du:dateUtc="2026-05-29T04:21:00Z">
+            <w:rPr/>
+          </w:rPrChange>
+        </w:rPr>
         <w:t xml:space="preserve">Gerdin Wärnberg, M. </w:t>
       </w:r>
       <w:r>
         <w:rPr>
           <w:i/>
           <w:iCs/>
+          <w:lang w:val="sv-SE"/>
+          <w:rPrChange w:id="377" w:author="Martin Gerdin Wärnberg" w:date="2026-05-29T06:21:00Z" w16du:dateUtc="2026-05-29T04:21:00Z">
+            <w:rPr>
+              <w:i/>
+              <w:iCs/>
+            </w:rPr>
+          </w:rPrChange>
         </w:rPr>
         <w:t>et al.</w:t>
       </w:r>
       <w:r>
+        <w:rPr>
+          <w:lang w:val="sv-SE"/>
+          <w:rPrChange w:id="378" w:author="Martin Gerdin Wärnberg" w:date="2026-05-29T06:21:00Z" w16du:dateUtc="2026-05-29T04:21:00Z">
+            <w:rPr/>
+          </w:rPrChange>
+        </w:rPr>
         <w:t xml:space="preserve"> </w:t>
       </w:r>
       <w:r>
@@ -16086,8 +16174,8 @@
       <w:pPr>
         <w:pStyle w:val="Bibliography"/>
       </w:pPr>
-      <w:bookmarkStart w:id="369" w:name="ref-Campbell2005"/>
-      <w:bookmarkEnd w:id="368"/>
+      <w:bookmarkStart w:id="379" w:name="ref-Campbell2005"/>
+      <w:bookmarkEnd w:id="375"/>
       <w:r>
         <w:t xml:space="preserve">7. </w:t>
       </w:r>
@@ -16130,8 +16218,8 @@
       <w:pPr>
         <w:pStyle w:val="Bibliography"/>
       </w:pPr>
-      <w:bookmarkStart w:id="370" w:name="ref-Eldridge2015"/>
-      <w:bookmarkEnd w:id="369"/>
+      <w:bookmarkStart w:id="380" w:name="ref-Eldridge2015"/>
+      <w:bookmarkEnd w:id="379"/>
       <w:r>
         <w:lastRenderedPageBreak/>
         <w:t xml:space="preserve">8. </w:t>
@@ -16140,16 +16228,35 @@
         <w:tab/>
       </w:r>
       <w:r>
+        <w:rPr>
+          <w:lang w:val="sv-SE"/>
+          <w:rPrChange w:id="381" w:author="Martin Gerdin Wärnberg" w:date="2026-05-29T06:21:00Z" w16du:dateUtc="2026-05-29T04:21:00Z">
+            <w:rPr/>
+          </w:rPrChange>
+        </w:rPr>
         <w:t xml:space="preserve">Eldridge, S. M. </w:t>
       </w:r>
       <w:r>
         <w:rPr>
           <w:i/>
           <w:iCs/>
+          <w:lang w:val="sv-SE"/>
+          <w:rPrChange w:id="382" w:author="Martin Gerdin Wärnberg" w:date="2026-05-29T06:21:00Z" w16du:dateUtc="2026-05-29T04:21:00Z">
+            <w:rPr>
+              <w:i/>
+              <w:iCs/>
+            </w:rPr>
+          </w:rPrChange>
         </w:rPr>
         <w:t>et al.</w:t>
       </w:r>
       <w:r>
+        <w:rPr>
+          <w:lang w:val="sv-SE"/>
+          <w:rPrChange w:id="383" w:author="Martin Gerdin Wärnberg" w:date="2026-05-29T06:21:00Z" w16du:dateUtc="2026-05-29T04:21:00Z">
+            <w:rPr/>
+          </w:rPrChange>
+        </w:rPr>
         <w:t xml:space="preserve"> </w:t>
       </w:r>
       <w:r>
@@ -16180,8 +16287,8 @@
       <w:pPr>
         <w:pStyle w:val="Bibliography"/>
       </w:pPr>
-      <w:bookmarkStart w:id="371" w:name="ref-Martin2016"/>
-      <w:bookmarkEnd w:id="370"/>
+      <w:bookmarkStart w:id="384" w:name="ref-Martin2016"/>
+      <w:bookmarkEnd w:id="380"/>
       <w:r>
         <w:t xml:space="preserve">9. </w:t>
       </w:r>
@@ -16224,8 +16331,8 @@
       <w:pPr>
         <w:pStyle w:val="Bibliography"/>
       </w:pPr>
-      <w:bookmarkStart w:id="372" w:name="ref-Korevaar2021"/>
-      <w:bookmarkEnd w:id="371"/>
+      <w:bookmarkStart w:id="385" w:name="ref-Korevaar2021"/>
+      <w:bookmarkEnd w:id="384"/>
       <w:r>
         <w:t xml:space="preserve">10. </w:t>
       </w:r>
@@ -16268,8 +16375,8 @@
       <w:pPr>
         <w:pStyle w:val="Bibliography"/>
       </w:pPr>
-      <w:bookmarkStart w:id="373" w:name="ref-lashoher_implementation_2017"/>
-      <w:bookmarkEnd w:id="372"/>
+      <w:bookmarkStart w:id="386" w:name="ref-lashoher_implementation_2017"/>
+      <w:bookmarkEnd w:id="385"/>
       <w:r>
         <w:t xml:space="preserve">11. </w:t>
       </w:r>
@@ -16312,8 +16419,8 @@
       <w:pPr>
         <w:pStyle w:val="Bibliography"/>
       </w:pPr>
-      <w:bookmarkStart w:id="374" w:name="ref-kapitan_effect_2024"/>
-      <w:bookmarkEnd w:id="373"/>
+      <w:bookmarkStart w:id="387" w:name="ref-kapitan_effect_2024"/>
+      <w:bookmarkEnd w:id="386"/>
       <w:r>
         <w:t xml:space="preserve">12. </w:t>
       </w:r>
@@ -16346,8 +16453,8 @@
       <w:pPr>
         <w:pStyle w:val="Bibliography"/>
       </w:pPr>
-      <w:bookmarkStart w:id="375" w:name="ref-higgins_psychometric_2021"/>
-      <w:bookmarkEnd w:id="374"/>
+      <w:bookmarkStart w:id="388" w:name="ref-higgins_psychometric_2021"/>
+      <w:bookmarkEnd w:id="387"/>
       <w:r>
         <w:t xml:space="preserve">13. </w:t>
       </w:r>
@@ -16390,8 +16497,8 @@
       <w:pPr>
         <w:pStyle w:val="Bibliography"/>
       </w:pPr>
-      <w:bookmarkStart w:id="376" w:name="ref-R"/>
-      <w:bookmarkEnd w:id="375"/>
+      <w:bookmarkStart w:id="389" w:name="ref-R"/>
+      <w:bookmarkEnd w:id="388"/>
       <w:r>
         <w:t xml:space="preserve">14. </w:t>
       </w:r>
@@ -16414,8 +16521,8 @@
       <w:pPr>
         <w:pStyle w:val="Bibliography"/>
       </w:pPr>
-      <w:bookmarkStart w:id="377" w:name="ref-Hemming2018"/>
-      <w:bookmarkEnd w:id="376"/>
+      <w:bookmarkStart w:id="390" w:name="ref-Hemming2018"/>
+      <w:bookmarkEnd w:id="389"/>
       <w:r>
         <w:t xml:space="preserve">15. </w:t>
       </w:r>
@@ -16448,8 +16555,8 @@
       <w:pPr>
         <w:pStyle w:val="Bibliography"/>
       </w:pPr>
-      <w:bookmarkStart w:id="378" w:name="ref-grantham_evaluating_2022"/>
-      <w:bookmarkEnd w:id="377"/>
+      <w:bookmarkStart w:id="391" w:name="ref-grantham_evaluating_2022"/>
+      <w:bookmarkEnd w:id="390"/>
       <w:r>
         <w:t xml:space="preserve">16. </w:t>
       </w:r>
@@ -16457,16 +16564,35 @@
         <w:tab/>
       </w:r>
       <w:r>
+        <w:rPr>
+          <w:lang w:val="sv-SE"/>
+          <w:rPrChange w:id="392" w:author="Martin Gerdin Wärnberg" w:date="2026-05-29T06:21:00Z" w16du:dateUtc="2026-05-29T04:21:00Z">
+            <w:rPr/>
+          </w:rPrChange>
+        </w:rPr>
         <w:t xml:space="preserve">Grantham, K. L. </w:t>
       </w:r>
       <w:r>
         <w:rPr>
           <w:i/>
           <w:iCs/>
+          <w:lang w:val="sv-SE"/>
+          <w:rPrChange w:id="393" w:author="Martin Gerdin Wärnberg" w:date="2026-05-29T06:21:00Z" w16du:dateUtc="2026-05-29T04:21:00Z">
+            <w:rPr>
+              <w:i/>
+              <w:iCs/>
+            </w:rPr>
+          </w:rPrChange>
         </w:rPr>
         <w:t>et al.</w:t>
       </w:r>
       <w:r>
+        <w:rPr>
+          <w:lang w:val="sv-SE"/>
+          <w:rPrChange w:id="394" w:author="Martin Gerdin Wärnberg" w:date="2026-05-29T06:21:00Z" w16du:dateUtc="2026-05-29T04:21:00Z">
+            <w:rPr/>
+          </w:rPrChange>
+        </w:rPr>
         <w:t xml:space="preserve"> </w:t>
       </w:r>
       <w:r>
@@ -16497,8 +16623,8 @@
       <w:pPr>
         <w:pStyle w:val="Bibliography"/>
       </w:pPr>
-      <w:bookmarkStart w:id="379" w:name="ref-kenny_analysis_2022"/>
-      <w:bookmarkEnd w:id="378"/>
+      <w:bookmarkStart w:id="395" w:name="ref-kenny_analysis_2022"/>
+      <w:bookmarkEnd w:id="391"/>
       <w:r>
         <w:t xml:space="preserve">17. </w:t>
       </w:r>
@@ -16531,8 +16657,8 @@
       <w:pPr>
         <w:pStyle w:val="Bibliography"/>
       </w:pPr>
-      <w:bookmarkStart w:id="380" w:name="ref-Diaz2021"/>
-      <w:bookmarkEnd w:id="379"/>
+      <w:bookmarkStart w:id="396" w:name="ref-Diaz2021"/>
+      <w:bookmarkEnd w:id="395"/>
       <w:r>
         <w:t xml:space="preserve">18. </w:t>
       </w:r>
@@ -16575,8 +16701,8 @@
       <w:pPr>
         <w:pStyle w:val="Bibliography"/>
       </w:pPr>
-      <w:bookmarkStart w:id="381" w:name="ref-hornor_quality_2018"/>
-      <w:bookmarkEnd w:id="380"/>
+      <w:bookmarkStart w:id="397" w:name="ref-hornor_quality_2018"/>
+      <w:bookmarkEnd w:id="396"/>
       <w:r>
         <w:t xml:space="preserve">19. </w:t>
       </w:r>
@@ -16619,8 +16745,8 @@
       <w:pPr>
         <w:pStyle w:val="Bibliography"/>
       </w:pPr>
-      <w:bookmarkStart w:id="382" w:name="ref-ustun_measuring_2010"/>
-      <w:bookmarkEnd w:id="381"/>
+      <w:bookmarkStart w:id="398" w:name="ref-ustun_measuring_2010"/>
+      <w:bookmarkEnd w:id="397"/>
       <w:r>
         <w:t xml:space="preserve">20. </w:t>
       </w:r>
@@ -16628,16 +16754,35 @@
         <w:tab/>
       </w:r>
       <w:r>
+        <w:rPr>
+          <w:lang w:val="sv-SE"/>
+          <w:rPrChange w:id="399" w:author="Martin Gerdin Wärnberg" w:date="2026-05-29T06:21:00Z" w16du:dateUtc="2026-05-29T04:21:00Z">
+            <w:rPr/>
+          </w:rPrChange>
+        </w:rPr>
         <w:t xml:space="preserve">Ustun, T. B. </w:t>
       </w:r>
       <w:r>
         <w:rPr>
           <w:i/>
           <w:iCs/>
+          <w:lang w:val="sv-SE"/>
+          <w:rPrChange w:id="400" w:author="Martin Gerdin Wärnberg" w:date="2026-05-29T06:21:00Z" w16du:dateUtc="2026-05-29T04:21:00Z">
+            <w:rPr>
+              <w:i/>
+              <w:iCs/>
+            </w:rPr>
+          </w:rPrChange>
         </w:rPr>
         <w:t>et al.</w:t>
       </w:r>
       <w:r>
+        <w:rPr>
+          <w:lang w:val="sv-SE"/>
+          <w:rPrChange w:id="401" w:author="Martin Gerdin Wärnberg" w:date="2026-05-29T06:21:00Z" w16du:dateUtc="2026-05-29T04:21:00Z">
+            <w:rPr/>
+          </w:rPrChange>
+        </w:rPr>
         <w:t xml:space="preserve"> </w:t>
       </w:r>
       <w:r>
@@ -16650,9 +16795,9 @@
       <w:r>
         <w:t>. (World Health Organization, 2010).</w:t>
       </w:r>
-      <w:bookmarkEnd w:id="360"/>
-      <w:bookmarkEnd w:id="363"/>
-      <w:bookmarkEnd w:id="382"/>
+      <w:bookmarkEnd w:id="367"/>
+      <w:bookmarkEnd w:id="370"/>
+      <w:bookmarkEnd w:id="398"/>
     </w:p>
     <w:sectPr>
       <w:footnotePr>
@@ -16700,7 +16845,24 @@
       </w:r>
     </w:p>
   </w:comment>
-  <w:comment w:id="44" w:author="Karla Hemming (Applied Health Sciences)" w:date="2026-03-09T10:33:00Z" w:initials="KH">
+  <w:comment w:id="44" w:author="Martin Gerdin Wärnberg" w:date="2026-05-29T06:21:00Z" w:initials="MG">
+    <w:p>
+      <w:r>
+        <w:rPr>
+          <w:rStyle w:val="CommentReference"/>
+        </w:rPr>
+        <w:annotationRef/>
+      </w:r>
+      <w:r>
+        <w:rPr>
+          <w:sz w:val="20"/>
+          <w:szCs w:val="20"/>
+        </w:rPr>
+        <w:t>James to add</w:t>
+      </w:r>
+    </w:p>
+  </w:comment>
+  <w:comment w:id="45" w:author="Karla Hemming (Applied Health Sciences)" w:date="2026-03-09T10:33:00Z" w:initials="KH">
     <w:p>
       <w:pPr>
         <w:pStyle w:val="CommentText"/>
@@ -16716,7 +16878,7 @@
       </w:r>
     </w:p>
   </w:comment>
-  <w:comment w:id="45" w:author="Anna Olofsson" w:date="2026-03-16T13:27:00Z" w:initials="AO">
+  <w:comment w:id="46" w:author="Anna Olofsson" w:date="2026-03-16T13:27:00Z" w:initials="AO">
     <w:p>
       <w:pPr>
         <w:pStyle w:val="CommentText"/>
@@ -16729,38 +16891,6 @@
       </w:r>
       <w:r>
         <w:t xml:space="preserve">The random sampling procedure for the staircase component is described later in Section 5.5.2 (Nested staircase design). </w:t>
-      </w:r>
-    </w:p>
-  </w:comment>
-  <w:comment w:id="54" w:author="Karla Hemming (Applied Health Sciences)" w:date="2026-03-09T10:35:00Z" w:initials="KH">
-    <w:p>
-      <w:pPr>
-        <w:pStyle w:val="CommentText"/>
-      </w:pPr>
-      <w:r>
-        <w:rPr>
-          <w:rStyle w:val="CommentReference"/>
-        </w:rPr>
-        <w:annotationRef/>
-      </w:r>
-      <w:r>
-        <w:t>Do we need to think about how will handle the following:</w:t>
-      </w:r>
-    </w:p>
-    <w:p>
-      <w:pPr>
-        <w:pStyle w:val="CommentText"/>
-      </w:pPr>
-      <w:r>
-        <w:t xml:space="preserve">Deaths </w:t>
-      </w:r>
-    </w:p>
-    <w:p>
-      <w:pPr>
-        <w:pStyle w:val="CommentText"/>
-      </w:pPr>
-      <w:r>
-        <w:t>Transfers to other hosptials?</w:t>
       </w:r>
     </w:p>
   </w:comment>
@@ -16776,11 +16906,43 @@
         <w:annotationRef/>
       </w:r>
       <w:r>
+        <w:t>Do we need to think about how will handle the following:</w:t>
+      </w:r>
+    </w:p>
+    <w:p>
+      <w:pPr>
+        <w:pStyle w:val="CommentText"/>
+      </w:pPr>
+      <w:r>
+        <w:t xml:space="preserve">Deaths </w:t>
+      </w:r>
+    </w:p>
+    <w:p>
+      <w:pPr>
+        <w:pStyle w:val="CommentText"/>
+      </w:pPr>
+      <w:r>
+        <w:t>Transfers to other hosptials?</w:t>
+      </w:r>
+    </w:p>
+  </w:comment>
+  <w:comment w:id="56" w:author="Karla Hemming (Applied Health Sciences)" w:date="2026-03-09T10:35:00Z" w:initials="KH">
+    <w:p>
+      <w:pPr>
+        <w:pStyle w:val="CommentText"/>
+      </w:pPr>
+      <w:r>
+        <w:rPr>
+          <w:rStyle w:val="CommentReference"/>
+        </w:rPr>
+        <w:annotationRef/>
+      </w:r>
+      <w:r>
         <w:t xml:space="preserve">Also, I wodner if this applies to other outcomes too </w:t>
       </w:r>
     </w:p>
   </w:comment>
-  <w:comment w:id="56" w:author="Anna Olofsson" w:date="2026-03-16T13:42:00Z" w:initials="AO">
+  <w:comment w:id="57" w:author="Anna Olofsson" w:date="2026-03-16T13:42:00Z" w:initials="AO">
     <w:p>
       <w:pPr>
         <w:pStyle w:val="CommentText"/>
@@ -16902,7 +17064,24 @@
       </w:pPr>
     </w:p>
   </w:comment>
-  <w:comment w:id="59" w:author="Karla Hemming (Applied Health Sciences)" w:date="2026-03-09T10:36:00Z" w:initials="KH">
+  <w:comment w:id="58" w:author="Martin Gerdin Wärnberg" w:date="2026-05-29T06:21:00Z" w:initials="MG">
+    <w:p>
+      <w:r>
+        <w:rPr>
+          <w:rStyle w:val="CommentReference"/>
+        </w:rPr>
+        <w:annotationRef/>
+      </w:r>
+      <w:r>
+        <w:rPr>
+          <w:sz w:val="20"/>
+          <w:szCs w:val="20"/>
+        </w:rPr>
+        <w:t>Clarified in table 1 and in the analysis section</w:t>
+      </w:r>
+    </w:p>
+  </w:comment>
+  <w:comment w:id="61" w:author="Karla Hemming (Applied Health Sciences)" w:date="2026-03-09T10:36:00Z" w:initials="KH">
     <w:p>
       <w:pPr>
         <w:pStyle w:val="CommentText"/>
@@ -16918,7 +17097,7 @@
       </w:r>
     </w:p>
   </w:comment>
-  <w:comment w:id="60" w:author="Anna Olofsson" w:date="2026-03-16T13:54:00Z" w:initials="AO">
+  <w:comment w:id="62" w:author="Anna Olofsson" w:date="2026-03-16T13:54:00Z" w:initials="AO">
     <w:p>
       <w:pPr>
         <w:pStyle w:val="CommentText"/>
@@ -16997,7 +17176,24 @@
       </w:r>
     </w:p>
   </w:comment>
-  <w:comment w:id="63" w:author="Karla Hemming (Applied Health Sciences)" w:date="2026-03-09T10:38:00Z" w:initials="KH">
+  <w:comment w:id="63" w:author="Martin Gerdin Wärnberg" w:date="2026-05-29T06:22:00Z" w:initials="MG">
+    <w:p>
+      <w:r>
+        <w:rPr>
+          <w:rStyle w:val="CommentReference"/>
+        </w:rPr>
+        <w:annotationRef/>
+      </w:r>
+      <w:r>
+        <w:rPr>
+          <w:sz w:val="20"/>
+          <w:szCs w:val="20"/>
+        </w:rPr>
+        <w:t>As a %</w:t>
+      </w:r>
+    </w:p>
+  </w:comment>
+  <w:comment w:id="66" w:author="Karla Hemming (Applied Health Sciences)" w:date="2026-03-09T10:38:00Z" w:initials="KH">
     <w:p>
       <w:pPr>
         <w:pStyle w:val="CommentText"/>
@@ -17039,7 +17235,7 @@
       </w:r>
     </w:p>
   </w:comment>
-  <w:comment w:id="64" w:author="Anna Olofsson" w:date="2026-03-16T14:04:00Z" w:initials="AO">
+  <w:comment w:id="67" w:author="Anna Olofsson" w:date="2026-03-16T14:04:00Z" w:initials="AO">
     <w:p>
       <w:pPr>
         <w:pStyle w:val="CommentText"/>
@@ -17156,7 +17352,24 @@
       </w:pPr>
     </w:p>
   </w:comment>
-  <w:comment w:id="69" w:author="Karla Hemming (Applied Health Sciences)" w:date="2026-03-09T10:39:00Z" w:initials="KH">
+  <w:comment w:id="68" w:author="Martin Gerdin Wärnberg" w:date="2026-05-29T06:22:00Z" w:initials="MG">
+    <w:p>
+      <w:r>
+        <w:rPr>
+          <w:rStyle w:val="CommentReference"/>
+        </w:rPr>
+        <w:annotationRef/>
+      </w:r>
+      <w:r>
+        <w:rPr>
+          <w:sz w:val="20"/>
+          <w:szCs w:val="20"/>
+        </w:rPr>
+        <w:t>Revised to suggested text</w:t>
+      </w:r>
+    </w:p>
+  </w:comment>
+  <w:comment w:id="73" w:author="Karla Hemming (Applied Health Sciences)" w:date="2026-03-09T10:39:00Z" w:initials="KH">
     <w:p>
       <w:pPr>
         <w:pStyle w:val="CommentText"/>
@@ -17172,7 +17385,7 @@
       </w:r>
     </w:p>
   </w:comment>
-  <w:comment w:id="70" w:author="Anna Olofsson" w:date="2026-03-16T14:17:00Z" w:initials="AO">
+  <w:comment w:id="74" w:author="Anna Olofsson" w:date="2026-03-16T14:17:00Z" w:initials="AO">
     <w:p>
       <w:pPr>
         <w:pStyle w:val="CommentText"/>
@@ -17188,7 +17401,24 @@
       </w:r>
     </w:p>
   </w:comment>
-  <w:comment w:id="75" w:author="Karla Hemming (Applied Health Sciences)" w:date="2026-03-09T10:40:00Z" w:initials="KH">
+  <w:comment w:id="75" w:author="Martin Gerdin Wärnberg" w:date="2026-05-29T06:29:00Z" w:initials="MG">
+    <w:p>
+      <w:r>
+        <w:rPr>
+          <w:rStyle w:val="CommentReference"/>
+        </w:rPr>
+        <w:annotationRef/>
+      </w:r>
+      <w:r>
+        <w:rPr>
+          <w:sz w:val="20"/>
+          <w:szCs w:val="20"/>
+        </w:rPr>
+        <w:t>But this text is the same as in the protocol. Karla, you conducted the calculations for the 20 to 15% difference using the shiny app I think. What more details to do you think should be added?</w:t>
+      </w:r>
+    </w:p>
+  </w:comment>
+  <w:comment w:id="80" w:author="Karla Hemming (Applied Health Sciences)" w:date="2026-03-09T10:40:00Z" w:initials="KH">
     <w:p>
       <w:pPr>
         <w:pStyle w:val="CommentText"/>
@@ -17204,7 +17434,7 @@
       </w:r>
     </w:p>
   </w:comment>
-  <w:comment w:id="76" w:author="Anna Olofsson" w:date="2026-03-16T14:24:00Z" w:initials="AO">
+  <w:comment w:id="81" w:author="Anna Olofsson" w:date="2026-03-16T14:24:00Z" w:initials="AO">
     <w:p>
       <w:pPr>
         <w:pStyle w:val="CommentText"/>
@@ -17288,7 +17518,24 @@
       </w:pPr>
     </w:p>
   </w:comment>
-  <w:comment w:id="79" w:author="Karla Hemming (Applied Health Sciences)" w:date="2026-03-09T10:41:00Z" w:initials="KH">
+  <w:comment w:id="82" w:author="Martin Gerdin Wärnberg" w:date="2026-05-29T06:29:00Z" w:initials="MG">
+    <w:p>
+      <w:r>
+        <w:rPr>
+          <w:rStyle w:val="CommentReference"/>
+        </w:rPr>
+        <w:annotationRef/>
+      </w:r>
+      <w:r>
+        <w:rPr>
+          <w:sz w:val="20"/>
+          <w:szCs w:val="20"/>
+        </w:rPr>
+        <w:t>Done</w:t>
+      </w:r>
+    </w:p>
+  </w:comment>
+  <w:comment w:id="86" w:author="Karla Hemming (Applied Health Sciences)" w:date="2026-03-09T10:41:00Z" w:initials="KH">
     <w:p>
       <w:pPr>
         <w:pStyle w:val="CommentText"/>
@@ -17304,7 +17551,7 @@
       </w:r>
     </w:p>
   </w:comment>
-  <w:comment w:id="77" w:author="Karla Hemming (Applied Health Sciences)" w:date="2026-03-09T10:41:00Z" w:initials="KH">
+  <w:comment w:id="83" w:author="Karla Hemming (Applied Health Sciences)" w:date="2026-03-09T10:41:00Z" w:initials="KH">
     <w:p>
       <w:pPr>
         <w:pStyle w:val="CommentText"/>
@@ -17320,7 +17567,7 @@
       </w:r>
     </w:p>
   </w:comment>
-  <w:comment w:id="78" w:author="Anna Olofsson" w:date="2026-03-16T14:26:00Z" w:initials="AO">
+  <w:comment w:id="84" w:author="Anna Olofsson" w:date="2026-03-16T14:26:00Z" w:initials="AO">
     <w:p>
       <w:pPr>
         <w:pStyle w:val="CommentText"/>
@@ -17336,7 +17583,24 @@
       </w:r>
     </w:p>
   </w:comment>
-  <w:comment w:id="95" w:author="Karla Hemming (Applied Health Sciences)" w:date="2026-03-09T10:45:00Z" w:initials="KH">
+  <w:comment w:id="85" w:author="Martin Gerdin Wärnberg" w:date="2026-05-29T06:31:00Z" w:initials="MG">
+    <w:p>
+      <w:r>
+        <w:rPr>
+          <w:rStyle w:val="CommentReference"/>
+        </w:rPr>
+        <w:annotationRef/>
+      </w:r>
+      <w:r>
+        <w:rPr>
+          <w:sz w:val="20"/>
+          <w:szCs w:val="20"/>
+        </w:rPr>
+        <w:t>Done</w:t>
+      </w:r>
+    </w:p>
+  </w:comment>
+  <w:comment w:id="102" w:author="Karla Hemming (Applied Health Sciences)" w:date="2026-03-09T10:45:00Z" w:initials="KH">
     <w:p>
       <w:pPr>
         <w:pStyle w:val="CommentText"/>
@@ -17394,7 +17658,7 @@
       </w:r>
     </w:p>
   </w:comment>
-  <w:comment w:id="96" w:author="Anna Olofsson" w:date="2026-04-10T11:56:00Z" w:initials="AO">
+  <w:comment w:id="103" w:author="Anna Olofsson" w:date="2026-04-10T11:56:00Z" w:initials="AO">
     <w:p>
       <w:pPr>
         <w:pStyle w:val="CommentText"/>
@@ -17470,7 +17734,7 @@
       </w:pPr>
     </w:p>
   </w:comment>
-  <w:comment w:id="107" w:author="Anna Olofsson" w:date="2026-04-10T12:00:00Z" w:initials="AO">
+  <w:comment w:id="114" w:author="Anna Olofsson" w:date="2026-04-10T12:00:00Z" w:initials="AO">
     <w:p>
       <w:pPr>
         <w:pStyle w:val="CommentText"/>
@@ -17499,7 +17763,7 @@
       </w:r>
     </w:p>
   </w:comment>
-  <w:comment w:id="159" w:author="Karla Hemming (Applied Health Sciences)" w:date="2026-03-09T10:46:00Z" w:initials="KH">
+  <w:comment w:id="166" w:author="Karla Hemming (Applied Health Sciences)" w:date="2026-03-09T10:46:00Z" w:initials="KH">
     <w:p>
       <w:pPr>
         <w:pStyle w:val="CommentText"/>
@@ -17528,7 +17792,7 @@
       </w:r>
     </w:p>
   </w:comment>
-  <w:comment w:id="160" w:author="Anna Olofsson" w:date="2026-03-16T14:43:00Z" w:initials="AO">
+  <w:comment w:id="167" w:author="Anna Olofsson" w:date="2026-03-16T14:43:00Z" w:initials="AO">
     <w:p>
       <w:pPr>
         <w:pStyle w:val="CommentText"/>
@@ -17557,7 +17821,7 @@
       </w:r>
     </w:p>
   </w:comment>
-  <w:comment w:id="184" w:author="Karla Hemming (Applied Health Sciences)" w:date="2026-03-09T10:48:00Z" w:initials="KH">
+  <w:comment w:id="191" w:author="Karla Hemming (Applied Health Sciences)" w:date="2026-03-09T10:48:00Z" w:initials="KH">
     <w:p>
       <w:pPr>
         <w:pStyle w:val="CommentText"/>
@@ -17573,7 +17837,7 @@
       </w:r>
     </w:p>
   </w:comment>
-  <w:comment w:id="185" w:author="Anna Olofsson" w:date="2026-03-16T15:09:00Z" w:initials="AO">
+  <w:comment w:id="192" w:author="Anna Olofsson" w:date="2026-03-16T15:09:00Z" w:initials="AO">
     <w:p>
       <w:pPr>
         <w:pStyle w:val="CommentText"/>
@@ -17599,7 +17863,7 @@
       </w:r>
     </w:p>
   </w:comment>
-  <w:comment w:id="192" w:author="Karla Hemming (Applied Health Sciences)" w:date="2026-03-09T10:49:00Z" w:initials="KH">
+  <w:comment w:id="199" w:author="Karla Hemming (Applied Health Sciences)" w:date="2026-03-09T10:49:00Z" w:initials="KH">
     <w:p>
       <w:pPr>
         <w:pStyle w:val="CommentText"/>
@@ -17615,7 +17879,7 @@
       </w:r>
     </w:p>
   </w:comment>
-  <w:comment w:id="193" w:author="Anna Olofsson" w:date="2026-03-20T10:05:00Z" w:initials="AO">
+  <w:comment w:id="200" w:author="Anna Olofsson" w:date="2026-03-20T10:05:00Z" w:initials="AO">
     <w:p>
       <w:pPr>
         <w:pStyle w:val="CommentText"/>
@@ -17631,7 +17895,7 @@
       </w:r>
     </w:p>
   </w:comment>
-  <w:comment w:id="205" w:author="Karla Hemming (Applied Health Sciences)" w:date="2026-03-09T10:50:00Z" w:initials="KH">
+  <w:comment w:id="212" w:author="Karla Hemming (Applied Health Sciences)" w:date="2026-03-09T10:50:00Z" w:initials="KH">
     <w:p>
       <w:pPr>
         <w:pStyle w:val="CommentText"/>
@@ -17647,7 +17911,7 @@
       </w:r>
     </w:p>
   </w:comment>
-  <w:comment w:id="206" w:author="Anna Olofsson" w:date="2026-03-16T15:30:00Z" w:initials="AO">
+  <w:comment w:id="213" w:author="Anna Olofsson" w:date="2026-03-16T15:30:00Z" w:initials="AO">
     <w:p>
       <w:pPr>
         <w:pStyle w:val="CommentText"/>
@@ -17663,7 +17927,7 @@
       </w:r>
     </w:p>
   </w:comment>
-  <w:comment w:id="213" w:author="Karla Hemming (Applied Health Sciences)" w:date="2026-03-09T10:51:00Z" w:initials="KH">
+  <w:comment w:id="220" w:author="Karla Hemming (Applied Health Sciences)" w:date="2026-03-09T10:51:00Z" w:initials="KH">
     <w:p>
       <w:pPr>
         <w:pStyle w:val="CommentText"/>
@@ -17687,7 +17951,7 @@
       </w:r>
     </w:p>
   </w:comment>
-  <w:comment w:id="214" w:author="Anna Olofsson" w:date="2026-03-16T15:33:00Z" w:initials="AO">
+  <w:comment w:id="221" w:author="Anna Olofsson" w:date="2026-03-16T15:33:00Z" w:initials="AO">
     <w:p>
       <w:pPr>
         <w:pStyle w:val="CommentText"/>
@@ -17703,7 +17967,7 @@
       </w:r>
     </w:p>
   </w:comment>
-  <w:comment w:id="231" w:author="Karla Hemming (Applied Health Sciences)" w:date="2026-03-09T10:52:00Z" w:initials="KH">
+  <w:comment w:id="238" w:author="Karla Hemming (Applied Health Sciences)" w:date="2026-03-09T10:52:00Z" w:initials="KH">
     <w:p>
       <w:pPr>
         <w:pStyle w:val="CommentText"/>
@@ -17719,7 +17983,7 @@
       </w:r>
     </w:p>
   </w:comment>
-  <w:comment w:id="232" w:author="Anna Olofsson" w:date="2026-04-10T10:34:00Z" w:initials="AO">
+  <w:comment w:id="239" w:author="Anna Olofsson" w:date="2026-04-10T10:34:00Z" w:initials="AO">
     <w:p>
       <w:pPr>
         <w:pStyle w:val="CommentText"/>
@@ -17735,7 +17999,7 @@
       </w:r>
     </w:p>
   </w:comment>
-  <w:comment w:id="236" w:author="Karla Hemming (Applied Health Sciences)" w:date="2026-03-09T10:52:00Z" w:initials="KH">
+  <w:comment w:id="243" w:author="Karla Hemming (Applied Health Sciences)" w:date="2026-03-09T10:52:00Z" w:initials="KH">
     <w:p>
       <w:pPr>
         <w:pStyle w:val="CommentText"/>
@@ -17759,7 +18023,7 @@
       </w:r>
     </w:p>
   </w:comment>
-  <w:comment w:id="239" w:author="Karla Hemming (Applied Health Sciences)" w:date="2026-03-09T10:52:00Z" w:initials="KH">
+  <w:comment w:id="246" w:author="Karla Hemming (Applied Health Sciences)" w:date="2026-03-09T10:52:00Z" w:initials="KH">
     <w:p>
       <w:pPr>
         <w:pStyle w:val="CommentText"/>
@@ -17775,7 +18039,7 @@
       </w:r>
     </w:p>
   </w:comment>
-  <w:comment w:id="253" w:author="Anna Olofsson" w:date="2026-04-10T11:39:00Z" w:initials="AO">
+  <w:comment w:id="260" w:author="Anna Olofsson" w:date="2026-04-10T11:39:00Z" w:initials="AO">
     <w:p>
       <w:pPr>
         <w:pStyle w:val="CommentText"/>
@@ -17804,7 +18068,7 @@
       </w:r>
     </w:p>
   </w:comment>
-  <w:comment w:id="281" w:author="Karla Hemming (Applied Health Sciences)" w:date="2026-03-09T11:31:00Z" w:initials="KH">
+  <w:comment w:id="288" w:author="Karla Hemming (Applied Health Sciences)" w:date="2026-03-09T11:31:00Z" w:initials="KH">
     <w:p>
       <w:pPr>
         <w:pStyle w:val="CommentText"/>
@@ -17820,7 +18084,7 @@
       </w:r>
     </w:p>
   </w:comment>
-  <w:comment w:id="282" w:author="Karla Hemming (Applied Health Sciences)" w:date="2026-03-09T11:34:00Z" w:initials="KH">
+  <w:comment w:id="289" w:author="Karla Hemming (Applied Health Sciences)" w:date="2026-03-09T11:34:00Z" w:initials="KH">
     <w:p>
       <w:pPr>
         <w:pStyle w:val="CommentText"/>
@@ -17836,7 +18100,7 @@
       </w:r>
     </w:p>
   </w:comment>
-  <w:comment w:id="283" w:author="Anna Olofsson" w:date="2026-03-20T10:31:00Z" w:initials="AO">
+  <w:comment w:id="290" w:author="Anna Olofsson" w:date="2026-03-20T10:31:00Z" w:initials="AO">
     <w:p>
       <w:pPr>
         <w:pStyle w:val="CommentText"/>
@@ -17865,7 +18129,7 @@
       </w:r>
     </w:p>
   </w:comment>
-  <w:comment w:id="284" w:author="Anna Olofsson" w:date="2026-04-10T10:54:00Z" w:initials="AO">
+  <w:comment w:id="291" w:author="Anna Olofsson" w:date="2026-04-10T10:54:00Z" w:initials="AO">
     <w:p>
       <w:pPr>
         <w:pStyle w:val="CommentText"/>
@@ -17881,7 +18145,7 @@
       </w:r>
     </w:p>
   </w:comment>
-  <w:comment w:id="288" w:author="Karla Hemming (Applied Health Sciences)" w:date="2026-03-09T11:33:00Z" w:initials="KH">
+  <w:comment w:id="295" w:author="Karla Hemming (Applied Health Sciences)" w:date="2026-03-09T11:33:00Z" w:initials="KH">
     <w:p>
       <w:pPr>
         <w:pStyle w:val="CommentText"/>
@@ -17897,7 +18161,7 @@
       </w:r>
     </w:p>
   </w:comment>
-  <w:comment w:id="289" w:author="Anna Olofsson" w:date="2026-03-20T10:36:00Z" w:initials="AO">
+  <w:comment w:id="296" w:author="Anna Olofsson" w:date="2026-03-20T10:36:00Z" w:initials="AO">
     <w:p>
       <w:pPr>
         <w:pStyle w:val="CommentText"/>
@@ -17913,7 +18177,7 @@
       </w:r>
     </w:p>
   </w:comment>
-  <w:comment w:id="296" w:author="Karla Hemming (Applied Health Sciences)" w:date="2026-03-09T11:33:00Z" w:initials="KH">
+  <w:comment w:id="303" w:author="Karla Hemming (Applied Health Sciences)" w:date="2026-03-09T11:33:00Z" w:initials="KH">
     <w:p>
       <w:pPr>
         <w:pStyle w:val="CommentText"/>
@@ -17929,7 +18193,7 @@
       </w:r>
     </w:p>
   </w:comment>
-  <w:comment w:id="341" w:author="Anna Olofsson" w:date="2026-03-20T12:48:00Z" w:initials="AO">
+  <w:comment w:id="348" w:author="Anna Olofsson" w:date="2026-03-20T12:48:00Z" w:initials="AO">
     <w:p>
       <w:pPr>
         <w:pStyle w:val="CommentText"/>
@@ -17958,7 +18222,7 @@
       </w:pPr>
     </w:p>
   </w:comment>
-  <w:comment w:id="342" w:author="Karla Hemming (Applied Health Sciences)" w:date="2026-03-09T11:38:00Z" w:initials="KH">
+  <w:comment w:id="349" w:author="Karla Hemming (Applied Health Sciences)" w:date="2026-03-09T11:38:00Z" w:initials="KH">
     <w:p>
       <w:pPr>
         <w:pStyle w:val="CommentText"/>
@@ -17974,7 +18238,7 @@
       </w:r>
     </w:p>
   </w:comment>
-  <w:comment w:id="343" w:author="Karla Hemming (Applied Health Sciences)" w:date="2026-03-09T11:38:00Z" w:initials="KH">
+  <w:comment w:id="350" w:author="Karla Hemming (Applied Health Sciences)" w:date="2026-03-09T11:38:00Z" w:initials="KH">
     <w:p>
       <w:pPr>
         <w:pStyle w:val="CommentText"/>
@@ -18016,7 +18280,7 @@
       </w:r>
     </w:p>
   </w:comment>
-  <w:comment w:id="344" w:author="Anna Olofsson" w:date="2026-03-20T12:50:00Z" w:initials="AO">
+  <w:comment w:id="351" w:author="Anna Olofsson" w:date="2026-03-20T12:50:00Z" w:initials="AO">
     <w:p>
       <w:pPr>
         <w:pStyle w:val="CommentText"/>
@@ -18061,7 +18325,7 @@
       </w:r>
     </w:p>
   </w:comment>
-  <w:comment w:id="354" w:author="Karla Hemming (Applied Health Sciences)" w:date="2026-03-09T11:39:00Z" w:initials="KH">
+  <w:comment w:id="361" w:author="Karla Hemming (Applied Health Sciences)" w:date="2026-03-09T11:39:00Z" w:initials="KH">
     <w:p>
       <w:pPr>
         <w:pStyle w:val="CommentText"/>
@@ -18077,7 +18341,7 @@
       </w:r>
     </w:p>
   </w:comment>
-  <w:comment w:id="361" w:author="Karla Hemming (Applied Health Sciences)" w:date="2026-03-09T11:39:00Z" w:initials="KH">
+  <w:comment w:id="368" w:author="Karla Hemming (Applied Health Sciences)" w:date="2026-03-09T11:39:00Z" w:initials="KH">
     <w:p>
       <w:pPr>
         <w:pStyle w:val="CommentText"/>
@@ -18100,22 +18364,29 @@
 <w15:commentsEx xmlns:wpc="http://schemas.microsoft.com/office/word/2010/wordprocessingCanvas" xmlns:cx="http://schemas.microsoft.com/office/drawing/2014/chartex" xmlns:cx1="http://schemas.microsoft.com/office/drawing/2015/9/8/chartex" xmlns:cx2="http://schemas.microsoft.com/office/drawing/2015/10/21/chartex" xmlns:cx3="http://schemas.microsoft.com/office/drawing/2016/5/9/chartex" xmlns:cx4="http://schemas.microsoft.com/office/drawing/2016/5/10/chartex" xmlns:cx5="http://schemas.microsoft.com/office/drawing/2016/5/11/chartex" xmlns:cx6="http://schemas.microsoft.com/office/drawing/2016/5/12/chartex" xmlns:cx7="http://schemas.microsoft.com/office/drawing/2016/5/13/chartex" xmlns:cx8="http://schemas.microsoft.com/office/drawing/2016/5/14/chartex" xmlns:mc="http://schemas.openxmlformats.org/markup-compatibility/2006" xmlns:aink="http://schemas.microsoft.com/office/drawing/2016/ink" xmlns:am3d="http://schemas.microsoft.com/office/drawing/2017/model3d" xmlns:o="urn:schemas-microsoft-com:office:office" xmlns:oel="http://schemas.microsoft.com/office/2019/extlst" xmlns:r="http://schemas.openxmlformats.org/officeDocument/2006/relationships" xmlns:m="http://schemas.openxmlformats.org/officeDocument/2006/math" xmlns:v="urn:schemas-microsoft-com:vml" xmlns:wp14="http://schemas.microsoft.com/office/word/2010/wordprocessingDrawing" xmlns:wp="http://schemas.openxmlformats.org/drawingml/2006/wordprocessingDrawing" xmlns:w10="urn:schemas-microsoft-com:office:word" xmlns:w="http://schemas.openxmlformats.org/wordprocessingml/2006/main" xmlns:w14="http://schemas.microsoft.com/office/word/2010/wordml" xmlns:w15="http://schemas.microsoft.com/office/word/2012/wordml" xmlns:w16cex="http://schemas.microsoft.com/office/word/2018/wordml/cex" xmlns:w16cid="http://schemas.microsoft.com/office/word/2016/wordml/cid" xmlns:w16="http://schemas.microsoft.com/office/word/2018/wordml" xmlns:w16du="http://schemas.microsoft.com/office/word/2023/wordml/word16du" xmlns:w16sdtdh="http://schemas.microsoft.com/office/word/2020/wordml/sdtdatahash" xmlns:w16sdtfl="http://schemas.microsoft.com/office/word/2024/wordml/sdtformatlock" xmlns:w16se="http://schemas.microsoft.com/office/word/2015/wordml/symex" xmlns:wpg="http://schemas.microsoft.com/office/word/2010/wordprocessingGroup" xmlns:wpi="http://schemas.microsoft.com/office/word/2010/wordprocessingInk" xmlns:wne="http://schemas.microsoft.com/office/word/2006/wordml" xmlns:wps="http://schemas.microsoft.com/office/word/2010/wordprocessingShape" mc:Ignorable="w14 w15 w16se w16cid w16 w16cex w16sdtdh w16sdtfl w16du wp14">
   <w15:commentEx w15:paraId="2F31477C" w15:done="0"/>
   <w15:commentEx w15:paraId="0ABC95AB" w15:done="0"/>
+  <w15:commentEx w15:paraId="5B45C3DD" w15:paraIdParent="0ABC95AB" w15:done="0"/>
   <w15:commentEx w15:paraId="4BC9DDDC" w15:done="0"/>
   <w15:commentEx w15:paraId="5C75237B" w15:paraIdParent="4BC9DDDC" w15:done="0"/>
   <w15:commentEx w15:paraId="3695D47E" w15:done="0"/>
   <w15:commentEx w15:paraId="3B07C8D4" w15:paraIdParent="3695D47E" w15:done="0"/>
   <w15:commentEx w15:paraId="24BD2AB2" w15:paraIdParent="3695D47E" w15:done="0"/>
+  <w15:commentEx w15:paraId="7658F385" w15:paraIdParent="3695D47E" w15:done="0"/>
   <w15:commentEx w15:paraId="2981DCAA" w15:done="0"/>
   <w15:commentEx w15:paraId="61E91D3B" w15:paraIdParent="2981DCAA" w15:done="0"/>
+  <w15:commentEx w15:paraId="5EF33260" w15:paraIdParent="2981DCAA" w15:done="0"/>
   <w15:commentEx w15:paraId="00F43067" w15:done="0"/>
   <w15:commentEx w15:paraId="3A45480A" w15:paraIdParent="00F43067" w15:done="0"/>
+  <w15:commentEx w15:paraId="2D759E68" w15:paraIdParent="00F43067" w15:done="0"/>
   <w15:commentEx w15:paraId="7FF076B2" w15:done="0"/>
   <w15:commentEx w15:paraId="4A66F1A1" w15:paraIdParent="7FF076B2" w15:done="0"/>
+  <w15:commentEx w15:paraId="5773DD85" w15:paraIdParent="7FF076B2" w15:done="0"/>
   <w15:commentEx w15:paraId="53A0C1DE" w15:done="0"/>
   <w15:commentEx w15:paraId="1F30148E" w15:paraIdParent="53A0C1DE" w15:done="0"/>
+  <w15:commentEx w15:paraId="071BD49C" w15:paraIdParent="53A0C1DE" w15:done="0"/>
   <w15:commentEx w15:paraId="30CBB0FC" w15:done="0"/>
   <w15:commentEx w15:paraId="4D792751" w15:done="0"/>
   <w15:commentEx w15:paraId="270E6239" w15:paraIdParent="4D792751" w15:done="0"/>
+  <w15:commentEx w15:paraId="23AC4E6E" w15:paraIdParent="4D792751" w15:done="0"/>
   <w15:commentEx w15:paraId="4E56364F" w15:done="0"/>
   <w15:commentEx w15:paraId="4D034C14" w15:paraIdParent="4E56364F" w15:done="0"/>
   <w15:commentEx w15:paraId="667A5D73" w15:done="0"/>
@@ -18154,22 +18425,29 @@
 <w16cex:commentsExtensible xmlns:wpc="http://schemas.microsoft.com/office/word/2010/wordprocessingCanvas" xmlns:cx="http://schemas.microsoft.com/office/drawing/2014/chartex" xmlns:cx1="http://schemas.microsoft.com/office/drawing/2015/9/8/chartex" xmlns:cx2="http://schemas.microsoft.com/office/drawing/2015/10/21/chartex" xmlns:cx3="http://schemas.microsoft.com/office/drawing/2016/5/9/chartex" xmlns:cx4="http://schemas.microsoft.com/office/drawing/2016/5/10/chartex" xmlns:cx5="http://schemas.microsoft.com/office/drawing/2016/5/11/chartex" xmlns:cx6="http://schemas.microsoft.com/office/drawing/2016/5/12/chartex" xmlns:cx7="http://schemas.microsoft.com/office/drawing/2016/5/13/chartex" xmlns:cx8="http://schemas.microsoft.com/office/drawing/2016/5/14/chartex" xmlns:cr="http://schemas.microsoft.com/office/comments/2020/reactions" xmlns:mc="http://schemas.openxmlformats.org/markup-compatibility/2006" xmlns:aink="http://schemas.microsoft.com/office/drawing/2016/ink" xmlns:am3d="http://schemas.microsoft.com/office/drawing/2017/model3d" xmlns:o="urn:schemas-microsoft-com:office:office" xmlns:oel="http://schemas.microsoft.com/office/2019/extlst" xmlns:r="http://schemas.openxmlformats.org/officeDocument/2006/relationships" xmlns:m="http://schemas.openxmlformats.org/officeDocument/2006/math" xmlns:v="urn:schemas-microsoft-com:vml" xmlns:wp14="http://schemas.microsoft.com/office/word/2010/wordprocessingDrawing" xmlns:wp="http://schemas.openxmlformats.org/drawingml/2006/wordprocessingDrawing" xmlns:w10="urn:schemas-microsoft-com:office:word" xmlns:w="http://schemas.openxmlformats.org/wordprocessingml/2006/main" xmlns:w14="http://schemas.microsoft.com/office/word/2010/wordml" xmlns:w15="http://schemas.microsoft.com/office/word/2012/wordml" xmlns:w16cex="http://schemas.microsoft.com/office/word/2018/wordml/cex" xmlns:w16cid="http://schemas.microsoft.com/office/word/2016/wordml/cid" xmlns:w16="http://schemas.microsoft.com/office/word/2018/wordml" xmlns:w16du="http://schemas.microsoft.com/office/word/2023/wordml/word16du" xmlns:w16sdtdh="http://schemas.microsoft.com/office/word/2020/wordml/sdtdatahash" xmlns:w16sdtfl="http://schemas.microsoft.com/office/word/2024/wordml/sdtformatlock" xmlns:w16se="http://schemas.microsoft.com/office/word/2015/wordml/symex" xmlns:wpg="http://schemas.microsoft.com/office/word/2010/wordprocessingGroup" xmlns:wpi="http://schemas.microsoft.com/office/word/2010/wordprocessingInk" xmlns:wne="http://schemas.microsoft.com/office/word/2006/wordml" xmlns:wps="http://schemas.microsoft.com/office/word/2010/wordprocessingShape" mc:Ignorable="w14 w15 w16se w16cid w16 w16cex w16sdtdh w16sdtfl cr w16du wp14">
   <w16cex:commentExtensible w16cex:durableId="7E574870" w16cex:dateUtc="2026-03-09T10:31:00Z"/>
   <w16cex:commentExtensible w16cex:durableId="43F108E3" w16cex:dateUtc="2026-03-09T10:33:00Z"/>
+  <w16cex:commentExtensible w16cex:durableId="2D44848F" w16cex:dateUtc="2026-05-29T04:21:00Z"/>
   <w16cex:commentExtensible w16cex:durableId="1314543A" w16cex:dateUtc="2026-03-09T10:33:00Z"/>
   <w16cex:commentExtensible w16cex:durableId="3F74BFF3" w16cex:dateUtc="2026-03-16T12:27:00Z"/>
   <w16cex:commentExtensible w16cex:durableId="12DAE60B" w16cex:dateUtc="2026-03-09T10:35:00Z"/>
   <w16cex:commentExtensible w16cex:durableId="59AEA89E" w16cex:dateUtc="2026-03-09T10:35:00Z"/>
   <w16cex:commentExtensible w16cex:durableId="257094AB" w16cex:dateUtc="2026-03-16T12:42:00Z"/>
+  <w16cex:commentExtensible w16cex:durableId="25AC6C74" w16cex:dateUtc="2026-05-29T04:21:00Z"/>
   <w16cex:commentExtensible w16cex:durableId="44B28BAE" w16cex:dateUtc="2026-03-09T10:36:00Z"/>
   <w16cex:commentExtensible w16cex:durableId="628C784E" w16cex:dateUtc="2026-03-16T12:54:00Z"/>
+  <w16cex:commentExtensible w16cex:durableId="393C59B1" w16cex:dateUtc="2026-05-29T04:22:00Z"/>
   <w16cex:commentExtensible w16cex:durableId="294FF73C" w16cex:dateUtc="2026-03-09T10:38:00Z"/>
   <w16cex:commentExtensible w16cex:durableId="03CC00D4" w16cex:dateUtc="2026-03-16T13:04:00Z"/>
+  <w16cex:commentExtensible w16cex:durableId="09B4E151" w16cex:dateUtc="2026-05-29T04:22:00Z"/>
   <w16cex:commentExtensible w16cex:durableId="65785171" w16cex:dateUtc="2026-03-09T10:39:00Z"/>
   <w16cex:commentExtensible w16cex:durableId="4BB588FC" w16cex:dateUtc="2026-03-16T13:17:00Z"/>
+  <w16cex:commentExtensible w16cex:durableId="6ED512F2" w16cex:dateUtc="2026-05-29T04:29:00Z"/>
   <w16cex:commentExtensible w16cex:durableId="4A0F59D9" w16cex:dateUtc="2026-03-09T10:40:00Z"/>
   <w16cex:commentExtensible w16cex:durableId="48D32283" w16cex:dateUtc="2026-03-16T13:24:00Z"/>
+  <w16cex:commentExtensible w16cex:durableId="366B2BF3" w16cex:dateUtc="2026-05-29T04:29:00Z"/>
   <w16cex:commentExtensible w16cex:durableId="1706392F" w16cex:dateUtc="2026-03-09T10:41:00Z"/>
   <w16cex:commentExtensible w16cex:durableId="5CD94B8A" w16cex:dateUtc="2026-03-09T10:41:00Z"/>
   <w16cex:commentExtensible w16cex:durableId="4414F0C1" w16cex:dateUtc="2026-03-16T13:26:00Z"/>
+  <w16cex:commentExtensible w16cex:durableId="30DB678C" w16cex:dateUtc="2026-05-29T04:31:00Z"/>
   <w16cex:commentExtensible w16cex:durableId="755389AE" w16cex:dateUtc="2026-03-09T10:45:00Z"/>
   <w16cex:commentExtensible w16cex:durableId="4DDC4A0B" w16cex:dateUtc="2026-04-10T09:56:00Z"/>
   <w16cex:commentExtensible w16cex:durableId="5C87B5E1" w16cex:dateUtc="2026-04-10T10:00:00Z"/>
@@ -18220,22 +18498,29 @@
 <w16cid:commentsIds xmlns:wpc="http://schemas.microsoft.com/office/word/2010/wordprocessingCanvas" xmlns:cx="http://schemas.microsoft.com/office/drawing/2014/chartex" xmlns:cx1="http://schemas.microsoft.com/office/drawing/2015/9/8/chartex" xmlns:cx2="http://schemas.microsoft.com/office/drawing/2015/10/21/chartex" xmlns:cx3="http://schemas.microsoft.com/office/drawing/2016/5/9/chartex" xmlns:cx4="http://schemas.microsoft.com/office/drawing/2016/5/10/chartex" xmlns:cx5="http://schemas.microsoft.com/office/drawing/2016/5/11/chartex" xmlns:cx6="http://schemas.microsoft.com/office/drawing/2016/5/12/chartex" xmlns:cx7="http://schemas.microsoft.com/office/drawing/2016/5/13/chartex" xmlns:cx8="http://schemas.microsoft.com/office/drawing/2016/5/14/chartex" xmlns:mc="http://schemas.openxmlformats.org/markup-compatibility/2006" xmlns:aink="http://schemas.microsoft.com/office/drawing/2016/ink" xmlns:am3d="http://schemas.microsoft.com/office/drawing/2017/model3d" xmlns:o="urn:schemas-microsoft-com:office:office" xmlns:oel="http://schemas.microsoft.com/office/2019/extlst" xmlns:r="http://schemas.openxmlformats.org/officeDocument/2006/relationships" xmlns:m="http://schemas.openxmlformats.org/officeDocument/2006/math" xmlns:v="urn:schemas-microsoft-com:vml" xmlns:wp14="http://schemas.microsoft.com/office/word/2010/wordprocessingDrawing" xmlns:wp="http://schemas.openxmlformats.org/drawingml/2006/wordprocessingDrawing" xmlns:w10="urn:schemas-microsoft-com:office:word" xmlns:w="http://schemas.openxmlformats.org/wordprocessingml/2006/main" xmlns:w14="http://schemas.microsoft.com/office/word/2010/wordml" xmlns:w15="http://schemas.microsoft.com/office/word/2012/wordml" xmlns:w16cex="http://schemas.microsoft.com/office/word/2018/wordml/cex" xmlns:w16cid="http://schemas.microsoft.com/office/word/2016/wordml/cid" xmlns:w16="http://schemas.microsoft.com/office/word/2018/wordml" xmlns:w16du="http://schemas.microsoft.com/office/word/2023/wordml/word16du" xmlns:w16sdtdh="http://schemas.microsoft.com/office/word/2020/wordml/sdtdatahash" xmlns:w16sdtfl="http://schemas.microsoft.com/office/word/2024/wordml/sdtformatlock" xmlns:w16se="http://schemas.microsoft.com/office/word/2015/wordml/symex" xmlns:wpg="http://schemas.microsoft.com/office/word/2010/wordprocessingGroup" xmlns:wpi="http://schemas.microsoft.com/office/word/2010/wordprocessingInk" xmlns:wne="http://schemas.microsoft.com/office/word/2006/wordml" xmlns:wps="http://schemas.microsoft.com/office/word/2010/wordprocessingShape" mc:Ignorable="w14 w15 w16se w16cid w16 w16cex w16sdtdh w16sdtfl w16du wp14">
   <w16cid:commentId w16cid:paraId="2F31477C" w16cid:durableId="7E574870"/>
   <w16cid:commentId w16cid:paraId="0ABC95AB" w16cid:durableId="43F108E3"/>
+  <w16cid:commentId w16cid:paraId="5B45C3DD" w16cid:durableId="2D44848F"/>
   <w16cid:commentId w16cid:paraId="4BC9DDDC" w16cid:durableId="1314543A"/>
   <w16cid:commentId w16cid:paraId="5C75237B" w16cid:durableId="3F74BFF3"/>
   <w16cid:commentId w16cid:paraId="3695D47E" w16cid:durableId="12DAE60B"/>
   <w16cid:commentId w16cid:paraId="3B07C8D4" w16cid:durableId="59AEA89E"/>
   <w16cid:commentId w16cid:paraId="24BD2AB2" w16cid:durableId="257094AB"/>
+  <w16cid:commentId w16cid:paraId="7658F385" w16cid:durableId="25AC6C74"/>
   <w16cid:commentId w16cid:paraId="2981DCAA" w16cid:durableId="44B28BAE"/>
   <w16cid:commentId w16cid:paraId="61E91D3B" w16cid:durableId="628C784E"/>
+  <w16cid:commentId w16cid:paraId="5EF33260" w16cid:durableId="393C59B1"/>
   <w16cid:commentId w16cid:paraId="00F43067" w16cid:durableId="294FF73C"/>
   <w16cid:commentId w16cid:paraId="3A45480A" w16cid:durableId="03CC00D4"/>
+  <w16cid:commentId w16cid:paraId="2D759E68" w16cid:durableId="09B4E151"/>
   <w16cid:commentId w16cid:paraId="7FF076B2" w16cid:durableId="65785171"/>
   <w16cid:commentId w16cid:paraId="4A66F1A1" w16cid:durableId="4BB588FC"/>
+  <w16cid:commentId w16cid:paraId="5773DD85" w16cid:durableId="6ED512F2"/>
   <w16cid:commentId w16cid:paraId="53A0C1DE" w16cid:durableId="4A0F59D9"/>
   <w16cid:commentId w16cid:paraId="1F30148E" w16cid:durableId="48D32283"/>
+  <w16cid:commentId w16cid:paraId="071BD49C" w16cid:durableId="366B2BF3"/>
   <w16cid:commentId w16cid:paraId="30CBB0FC" w16cid:durableId="1706392F"/>
   <w16cid:commentId w16cid:paraId="4D792751" w16cid:durableId="5CD94B8A"/>
   <w16cid:commentId w16cid:paraId="270E6239" w16cid:durableId="4414F0C1"/>
+  <w16cid:commentId w16cid:paraId="23AC4E6E" w16cid:durableId="30DB678C"/>
   <w16cid:commentId w16cid:paraId="4E56364F" w16cid:durableId="755389AE"/>
   <w16cid:commentId w16cid:paraId="4D034C14" w16cid:durableId="4DDC4A0B"/>
   <w16cid:commentId w16cid:paraId="667A5D73" w16cid:durableId="5C87B5E1"/>
@@ -19055,6 +19340,9 @@
   </w15:person>
   <w15:person w15:author="Karla Hemming (Applied Health Sciences)">
     <w15:presenceInfo w15:providerId="AD" w15:userId="S::k.hemming@bham.ac.uk::dcc201eb-6b8d-4331-bd59-ca1a1b97a333"/>
+  </w15:person>
+  <w15:person w15:author="Martin Gerdin Wärnberg">
+    <w15:presenceInfo w15:providerId="AD" w15:userId="S::martin.gerdin@ki.se::77153f61-4c5f-462a-acd4-483a5c64ba16"/>
   </w15:person>
 </w15:people>
 </file>

</xml_diff>